<commit_message>
docs: rebuild Revisão da Literatura chapter with correct structure
Added intro paragraph framing the 5 research questions and general-to-specific approach.
Reordered Q2/Q4 to follow logical Q1→Q2→Q3→Q4→Q5 sequence.
Added new section 2.4 on Agile Methodology (Q3) which was entirely missing.
Added closing conclusion paragraph summarising 16 sources and research gap.
Follows Prof. Dulce Mourato instructions: past tense, impersonal, all 5 Qs answered.

Co-Authored-By: Claude Sonnet 4.6 <noreply@anthropic.com>
</commit_message>
<xml_diff>
--- a/Relatório PA_FiX-it.docx
+++ b/Relatório PA_FiX-it.docx
@@ -393,6 +393,7 @@
           <w:sz w:val="32"/>
           <w:lang w:val="pt-PT"/>
         </w:rPr>
+        <w:lastRenderedPageBreak/>
         <w:t>RESUMO</w:t>
       </w:r>
     </w:p>
@@ -509,6 +510,7 @@
           <w:b/>
           <w:sz w:val="32"/>
         </w:rPr>
+        <w:lastRenderedPageBreak/>
         <w:t>ABSTRACT</w:t>
       </w:r>
     </w:p>
@@ -601,6 +603,7 @@
           <w:sz w:val="32"/>
           <w:lang w:val="pt-PT"/>
         </w:rPr>
+        <w:lastRenderedPageBreak/>
         <w:t>ABREVIATURAS</w:t>
       </w:r>
     </w:p>
@@ -1044,6 +1047,7 @@
           <w:sz w:val="32"/>
           <w:lang w:val="pt-PT"/>
         </w:rPr>
+        <w:lastRenderedPageBreak/>
         <w:t>ÍNDICE</w:t>
       </w:r>
     </w:p>
@@ -1113,6 +1117,7 @@
           <w:sz w:val="32"/>
           <w:lang w:val="pt-PT"/>
         </w:rPr>
+        <w:lastRenderedPageBreak/>
         <w:t>ÍNDICE DE FIGURAS</w:t>
       </w:r>
     </w:p>
@@ -1209,6 +1214,7 @@
           <w:sz w:val="32"/>
           <w:lang w:val="pt-PT"/>
         </w:rPr>
+        <w:lastRenderedPageBreak/>
         <w:t>ÍNDICE DE TABELAS</w:t>
       </w:r>
     </w:p>
@@ -1301,6 +1307,7 @@
           <w:sz w:val="32"/>
           <w:lang w:val="pt-PT"/>
         </w:rPr>
+        <w:lastRenderedPageBreak/>
         <w:t>INTRODUÇÃO</w:t>
       </w:r>
     </w:p>
@@ -1427,6 +1434,7 @@
           <w:sz w:val="24"/>
           <w:lang w:val="pt-PT"/>
         </w:rPr>
+        <w:lastRenderedPageBreak/>
         <w:t>A hipótese de trabalho foi que a combinação de tecnologias web modernas — em particular as Progressive Web Apps (MDN Web Docs, 2025, para. 1), os modelos de machine learning executáveis no browser via TensorFlow.js (Kim et al., 2023, p. 13; Dill et al., 2023, p. 565) e as arquiteturas REST escaláveis (Bogner et al., 2023, Sec. 4.2) — permite construir uma solução que responde afirmativamente a este problema, dentro das restrições de um projeto académico individual.</w:t>
       </w:r>
     </w:p>
@@ -1553,6 +1561,7 @@
           <w:sz w:val="28"/>
           <w:lang w:val="pt-PT"/>
         </w:rPr>
+        <w:lastRenderedPageBreak/>
         <w:t>1.5 Estrutura do Relatório</w:t>
       </w:r>
     </w:p>
@@ -1602,25 +1611,8 @@
           <w:sz w:val="32"/>
           <w:lang w:val="pt-PT"/>
         </w:rPr>
+        <w:lastRenderedPageBreak/>
         <w:t>REVISÃO DA LITERATURA</w:t>
-      </w:r>
-    </w:p>
-    <w:p>
-      <w:pPr>
-        <w:spacing w:before="200" w:after="80" w:line="360" w:lineRule="auto"/>
-        <w:outlineLvl w:val="1"/>
-        <w:rPr>
-          <w:lang w:val="pt-PT"/>
-        </w:rPr>
-      </w:pPr>
-      <w:r>
-        <w:rPr>
-          <w:rFonts w:ascii="Times New Roman" w:hAnsi="Times New Roman"/>
-          <w:b/>
-          <w:sz w:val="28"/>
-          <w:lang w:val="pt-PT"/>
-        </w:rPr>
-        <w:t>2.1 Aplicações de Fitness Digitais: Estado da Arte e Lacunas</w:t>
       </w:r>
     </w:p>
     <w:p>
@@ -1628,17 +1620,41 @@
         <w:spacing w:after="0" w:line="360" w:lineRule="auto"/>
         <w:ind w:firstLine="680"/>
         <w:jc w:val="both"/>
-        <w:rPr>
-          <w:lang w:val="pt-PT"/>
-        </w:rPr>
-      </w:pPr>
-      <w:r>
-        <w:rPr>
-          <w:rFonts w:ascii="Times New Roman" w:hAnsi="Times New Roman"/>
+        <w:outlineLvl w:val="0"/>
+        <w:rPr>
+          <w:rFonts w:ascii="Times New Roman" w:hAnsi="Times New Roman" w:cs="Times New Roman"/>
           <w:sz w:val="24"/>
           <w:lang w:val="pt-PT"/>
         </w:rPr>
-        <w:t>O mercado de aplicações de fitness digitais é dominado por três paradigmas distintos: aplicações de registo de treino e nutrição (MyFitnessPal, Cronometer), plataformas de coaching personalizado com IA servidor (Freeletics, Future) e aplicações de análise biométrica avançada (Styku, BodyViz). Embora cada paradigma responda a necessidades específicas, todos partilham limitações comuns que o FiX-it procurou superar.</w:t>
+      </w:pPr>
+      <w:r>
+        <w:rPr>
+          <w:rFonts w:ascii="Times New Roman" w:hAnsi="Times New Roman" w:cs="Times New Roman"/>
+          <w:sz w:val="24"/>
+          <w:lang w:val="pt-PT"/>
+        </w:rPr>
+        <w:t>A crescente adoção de tecnologias digitais no domínio da saúde e do bem-estar impulsionou um ecossistema de investigação que abordou, sob perspetivas complementares, os desafios técnicos, metodológicos e de usabilidade do desenvolvimento de aplicações de fitness assistidas por inteligência artificial. A presente revisão sintetizou a literatura mais recente — publicada entre 2023 e 2025 — organizada em torno das cinco questões de investigação do projeto FiX-it: arquitetura de software REST, requisitos e privacidade, metodologia de desenvolvimento ágil, tecnologias de IA no browser e acessibilidade e usabilidade. A revisão seguiu uma lógica progressiva do geral para o específico, partindo dos fundamentos arquiteturais e metodológicos para chegar às tecnologias concretas e aos princípios de design que moldaram as decisões de implementação do FiX-it.</w:t>
+      </w:r>
+    </w:p>
+    <w:p>
+      <w:pPr>
+        <w:spacing w:before="200" w:after="80" w:line="360" w:lineRule="auto"/>
+        <w:outlineLvl w:val="0"/>
+        <w:rPr>
+          <w:rFonts w:ascii="Times New Roman" w:hAnsi="Times New Roman" w:cs="Times New Roman"/>
+          <w:b/>
+          <w:sz w:val="28"/>
+          <w:lang w:val="pt-PT"/>
+        </w:rPr>
+      </w:pPr>
+      <w:r>
+        <w:rPr>
+          <w:rFonts w:ascii="Times New Roman" w:hAnsi="Times New Roman" w:cs="Times New Roman"/>
+          <w:b/>
+          <w:sz w:val="28"/>
+          <w:lang w:val="pt-PT"/>
+        </w:rPr>
+        <w:t>2.1 Aplicações de Fitness Digitais: Estado da Arte e Lacunas</w:t>
       </w:r>
     </w:p>
     <w:p>
@@ -1646,17 +1662,20 @@
         <w:spacing w:after="0" w:line="360" w:lineRule="auto"/>
         <w:ind w:firstLine="680"/>
         <w:jc w:val="both"/>
-        <w:rPr>
-          <w:lang w:val="pt-PT"/>
-        </w:rPr>
-      </w:pPr>
-      <w:r>
-        <w:rPr>
-          <w:rFonts w:ascii="Times New Roman" w:hAnsi="Times New Roman"/>
+        <w:outlineLvl w:val="0"/>
+        <w:rPr>
+          <w:rFonts w:ascii="Times New Roman" w:hAnsi="Times New Roman" w:cs="Times New Roman"/>
           <w:sz w:val="24"/>
           <w:lang w:val="pt-PT"/>
         </w:rPr>
-        <w:t>Em primeiro lugar, a dependência de infraestrutura cloud para processamento de IA implica custos operacionais que as aplicações transferem para o utilizador sob a forma de subscrições mensais, tipicamente entre €8 e €40 por mês. Em segundo lugar, o envio de fotografias corporais para servidores externos cria riscos de privacidade que contrariam os princípios do RGPD de minimização de dados e limitação da finalidade (Regulation EU 2016/679, 2016). Em terceiro lugar, a maioria das soluções existe exclusivamente como aplicação nativa iOS/Android, excluindo utilizadores de plataformas menos comuns ou com dispositivos sem capacidade de instalação.</w:t>
+      </w:pPr>
+      <w:r>
+        <w:rPr>
+          <w:rFonts w:ascii="Times New Roman" w:hAnsi="Times New Roman" w:cs="Times New Roman"/>
+          <w:sz w:val="24"/>
+          <w:lang w:val="pt-PT"/>
+        </w:rPr>
+        <w:t>O mercado de aplicações de fitness digitais foi dominado por três paradigmas distintos: aplicações de registo de treino e nutrição (MyFitnessPal, Cronometer), plataformas de coaching personalizado com IA servidor (Freeletics, Future) e aplicações de análise biométrica avançada (Styku, BodyViz). Embora cada paradigma respondesse a necessidades específicas, todos partilharam limitações comuns que o FiX-it procurou superar. Em primeiro lugar, a dependência de infraestrutura cloud para processamento de IA implicou custos operacionais que as aplicações transferiram para o utilizador sob a forma de subscrições mensais, tipicamente entre €8 e €40 por mês. Em segundo lugar, o envio de fotografias corporais para servidores externos criou riscos de privacidade que contrariaram os princípios do RGPD de minimização de dados e limitação da finalidade (Regulation EU 2016/679, 2016). Em terceiro lugar, a maioria das soluções existiu exclusivamente como aplicação nativa iOS/Android, excluindo utilizadores de plataformas menos comuns ou com dispositivos sem capacidade de instalação.</w:t>
       </w:r>
     </w:p>
     <w:p>
@@ -1664,35 +1683,41 @@
         <w:spacing w:after="0" w:line="360" w:lineRule="auto"/>
         <w:ind w:firstLine="680"/>
         <w:jc w:val="both"/>
-        <w:rPr>
-          <w:lang w:val="pt-PT"/>
-        </w:rPr>
-      </w:pPr>
-      <w:r>
-        <w:rPr>
-          <w:rFonts w:ascii="Times New Roman" w:hAnsi="Times New Roman"/>
+        <w:outlineLvl w:val="0"/>
+        <w:rPr>
+          <w:rFonts w:ascii="Times New Roman" w:hAnsi="Times New Roman" w:cs="Times New Roman"/>
           <w:sz w:val="24"/>
           <w:lang w:val="pt-PT"/>
         </w:rPr>
-        <w:t>A literatura científica tem documentado progressos significativos na estimação de composição corporal por câmara. Qiao et al. (2024, p. 5) demonstraram que a reconstrução 3D da forma corporal a partir de fotografias de smartphone permite estimar massa gorda e massa isenta de gordura com correlações superiores a r = 0,84 relativamente a medições DEXA de referência, numa coorte validada de 12 435 adultos. Contudo, esta abordagem exige processamento computacional intensivo incompatível com execução no browser, o que situa o FiX-it numa posição de compromisso consciente entre precisão e privacidade.</w:t>
+      </w:pPr>
+      <w:r>
+        <w:rPr>
+          <w:rFonts w:ascii="Times New Roman" w:hAnsi="Times New Roman" w:cs="Times New Roman"/>
+          <w:sz w:val="24"/>
+          <w:lang w:val="pt-PT"/>
+        </w:rPr>
+        <w:t>A literatura científica documentou progressos significativos na estimação de composição corporal por câmara. Qiao et al. (2024, p. 5) demonstraram que a reconstrução 3D da forma corporal a partir de fotografias de smartphone permitiu estimar massa gorda e massa isenta de gordura com correlações superiores a r = 0,84 relativamente a medições DEXA de referência, numa coorte validada de 12 435 adultos. Contudo, esta abordagem exigiu processamento computacional intensivo incompatível com execução no browser, o que situou o FiX-it numa posição de compromisso consciente entre precisão e privacidade.</w:t>
       </w:r>
     </w:p>
     <w:p>
       <w:pPr>
         <w:spacing w:before="200" w:after="80" w:line="360" w:lineRule="auto"/>
-        <w:outlineLvl w:val="1"/>
-        <w:rPr>
-          <w:lang w:val="pt-PT"/>
-        </w:rPr>
-      </w:pPr>
-      <w:r>
-        <w:rPr>
-          <w:rFonts w:ascii="Times New Roman" w:hAnsi="Times New Roman"/>
+        <w:outlineLvl w:val="0"/>
+        <w:rPr>
+          <w:rFonts w:ascii="Times New Roman" w:hAnsi="Times New Roman" w:cs="Times New Roman"/>
           <w:b/>
           <w:sz w:val="28"/>
           <w:lang w:val="pt-PT"/>
         </w:rPr>
-        <w:t>2.2 Progressive Web Apps e Arquitetura REST</w:t>
+      </w:pPr>
+      <w:r>
+        <w:rPr>
+          <w:rFonts w:ascii="Times New Roman" w:hAnsi="Times New Roman" w:cs="Times New Roman"/>
+          <w:b/>
+          <w:sz w:val="28"/>
+          <w:lang w:val="pt-PT"/>
+        </w:rPr>
+        <w:t>2.2 Arquitetura de Aplicações Web REST e Progressive Web Apps (Q1)</w:t>
       </w:r>
     </w:p>
     <w:p>
@@ -1700,17 +1725,20 @@
         <w:spacing w:after="0" w:line="360" w:lineRule="auto"/>
         <w:ind w:firstLine="680"/>
         <w:jc w:val="both"/>
-        <w:rPr>
-          <w:lang w:val="pt-PT"/>
-        </w:rPr>
-      </w:pPr>
-      <w:r>
-        <w:rPr>
-          <w:rFonts w:ascii="Times New Roman" w:hAnsi="Times New Roman"/>
+        <w:outlineLvl w:val="0"/>
+        <w:rPr>
+          <w:rFonts w:ascii="Times New Roman" w:hAnsi="Times New Roman" w:cs="Times New Roman"/>
           <w:sz w:val="24"/>
           <w:lang w:val="pt-PT"/>
         </w:rPr>
-        <w:t>As Progressive Web Apps representam uma convergência entre as capacidades das aplicações nativas e a ubiquidade da web. Segundo MDN Web Docs (2025, para. 1), uma PWA define-se pela presença de três componentes fundamentais: um Service Worker que gere o ciclo de vida da cache e habilita o funcionamento offline, um Web App Manifest que fornece metadados de instalação e personalização da aparência, e a disponibilização exclusivamente via HTTPS. Esta combinação permite que uma PWA seja instalada diretamente a partir do browser em qualquer sistema operativo sem intermediação de loja de aplicações.</w:t>
+      </w:pPr>
+      <w:r>
+        <w:rPr>
+          <w:rFonts w:ascii="Times New Roman" w:hAnsi="Times New Roman" w:cs="Times New Roman"/>
+          <w:sz w:val="24"/>
+          <w:lang w:val="pt-PT"/>
+        </w:rPr>
+        <w:t>A arquitetura REST tornou-se o padrão dominante para APIs web que suportaram múltiplos clientes, mas a sua adoção em produção revelou variações significativas na aderência às suas regras de design. Bogner et al. (2023, Sec. 4.2) investigaram empiricamente se o cumprimento dessas regras teve impacto mensurável na compreensibilidade das APIs, concluindo que determinadas convenções — como o uso consistente de verbos HTTP e a estruturação hierárquica dos recursos — reduziram significativamente o tempo de integração por parte de programadores externos. Esta evidência justificou a adoção de um estilo REST rigoroso no backend do FiX-it, com 58 endpoints organizados por domínio funcional. Do lado do cliente, Vepsäläinen et al. (2023, p. 325) contextualizaram historicamente a evolução dos frameworks JavaScript, identificando a tendência para frameworks que minimizaram ou eliminaram o overhead de runtime e descrevendo o paradigma de single-page application como uma abordagem matura com custos de complexidade crescente à medida que as dependências se acumularam. Esta perspetiva sustentou a decisão de desenvolver o frontend do FiX-it em JavaScript vanilla, mantendo controlo total sobre o ciclo de vida da aplicação num projeto com prazo e recursos académicos limitados.</w:t>
       </w:r>
     </w:p>
     <w:p>
@@ -1718,17 +1746,41 @@
         <w:spacing w:after="0" w:line="360" w:lineRule="auto"/>
         <w:ind w:firstLine="680"/>
         <w:jc w:val="both"/>
-        <w:rPr>
-          <w:lang w:val="pt-PT"/>
-        </w:rPr>
-      </w:pPr>
-      <w:r>
-        <w:rPr>
-          <w:rFonts w:ascii="Times New Roman" w:hAnsi="Times New Roman"/>
+        <w:outlineLvl w:val="0"/>
+        <w:rPr>
+          <w:rFonts w:ascii="Times New Roman" w:hAnsi="Times New Roman" w:cs="Times New Roman"/>
           <w:sz w:val="24"/>
           <w:lang w:val="pt-PT"/>
         </w:rPr>
-        <w:t>A evolução recente dos frameworks JavaScript foi analisada por Vepsäläinen et al. (2023, p. 325), que identificaram a tendência para abordagens que eliminam o overhead de runtime, transferindo a complexidade para a fase de compilação. Esta análise sustentou a decisão de desenvolver o FiX-it em JavaScript vanilla, sem dependência de frameworks externos — uma escolha que minimiza a superfície de ataque, reduz o tamanho do bundle e elimina a dívida técnica associada à gestão de versões de dependências num projeto académico com prazo definido.</w:t>
+      </w:pPr>
+      <w:r>
+        <w:rPr>
+          <w:rFonts w:ascii="Times New Roman" w:hAnsi="Times New Roman" w:cs="Times New Roman"/>
+          <w:sz w:val="24"/>
+          <w:lang w:val="pt-PT"/>
+        </w:rPr>
+        <w:t>A natureza progressiva da aplicação foi enquadrada pela documentação técnica da Mozilla (MDN Web Docs, 2025, para. 1), que definiu os requisitos mínimos de uma PWA — Service Worker registado, Web App Manifest válido e disponibilização via HTTPS — e detalhou as estratégias de caching e os mecanismos de sincronização em background. Ahmad et al. (2023, Sec. 4.4) complementaram este enquadramento com o mapeamento das dimensões específicas da engenharia de requisitos para sistemas de IA que diferiram dos sistemas tradicionais, nomeadamente a necessidade de especificar requisitos de qualidade dos dados de entrada, margens de erro aceitáveis e mecanismos de explicabilidade.</w:t>
+      </w:r>
+    </w:p>
+    <w:p>
+      <w:pPr>
+        <w:spacing w:before="200" w:after="80" w:line="360" w:lineRule="auto"/>
+        <w:outlineLvl w:val="0"/>
+        <w:rPr>
+          <w:rFonts w:ascii="Times New Roman" w:hAnsi="Times New Roman" w:cs="Times New Roman"/>
+          <w:b/>
+          <w:sz w:val="28"/>
+          <w:lang w:val="pt-PT"/>
+        </w:rPr>
+      </w:pPr>
+      <w:r>
+        <w:rPr>
+          <w:rFonts w:ascii="Times New Roman" w:hAnsi="Times New Roman" w:cs="Times New Roman"/>
+          <w:b/>
+          <w:sz w:val="28"/>
+          <w:lang w:val="pt-PT"/>
+        </w:rPr>
+        <w:t>2.3 Requisitos Funcionais, Não Funcionais e Privacidade (Q2)</w:t>
       </w:r>
     </w:p>
     <w:p>
@@ -1736,35 +1788,20 @@
         <w:spacing w:after="0" w:line="360" w:lineRule="auto"/>
         <w:ind w:firstLine="680"/>
         <w:jc w:val="both"/>
-        <w:rPr>
-          <w:lang w:val="pt-PT"/>
-        </w:rPr>
-      </w:pPr>
-      <w:r>
-        <w:rPr>
-          <w:rFonts w:ascii="Times New Roman" w:hAnsi="Times New Roman"/>
+        <w:outlineLvl w:val="0"/>
+        <w:rPr>
+          <w:rFonts w:ascii="Times New Roman" w:hAnsi="Times New Roman" w:cs="Times New Roman"/>
           <w:sz w:val="24"/>
           <w:lang w:val="pt-PT"/>
         </w:rPr>
-        <w:t>Do lado do servidor, Bogner et al. (2023, Sec. 4.2) investigaram empiricamente o impacto das regras de design REST na compreensibilidade das APIs, concluindo que a utilização consistente de verbos HTTP, a estruturação hierárquica dos recursos e a padronização dos formatos de resposta têm impacto estatisticamente significativo na integração por parte de programadores externos. Estas conclusões orientaram a organização dos 58 endpoints do FiX-it em serviços funcionalmente coesos.</w:t>
-      </w:r>
-    </w:p>
-    <w:p>
-      <w:pPr>
-        <w:spacing w:before="200" w:after="80" w:line="360" w:lineRule="auto"/>
-        <w:outlineLvl w:val="1"/>
-        <w:rPr>
-          <w:lang w:val="pt-PT"/>
-        </w:rPr>
-      </w:pPr>
-      <w:r>
-        <w:rPr>
-          <w:rFonts w:ascii="Times New Roman" w:hAnsi="Times New Roman"/>
-          <w:b/>
-          <w:sz w:val="28"/>
-          <w:lang w:val="pt-PT"/>
-        </w:rPr>
-        <w:t>2.3 Inteligência Artificial no Browser</w:t>
+      </w:pPr>
+      <w:r>
+        <w:rPr>
+          <w:rFonts w:ascii="Times New Roman" w:hAnsi="Times New Roman" w:cs="Times New Roman"/>
+          <w:sz w:val="24"/>
+          <w:lang w:val="pt-PT"/>
+        </w:rPr>
+        <w:t>A definição dos requisitos do FiX-it exigiu uma abordagem que combinou as técnicas de engenharia de requisitos ágil com os imperativos regulatórios da proteção de dados. Hoy e Xu (2023, p. 8) identificaram os principais desafios da elicitação de requisitos em contexto ágil — volatilidade dos requisitos, lacunas de comunicação e rastreabilidade insuficiente — e propuseram um quadro conceptual de soluções adaptadas a cada categoria, que foi incorporado no processo iterativo de especificação do FiX-it. Ahmad et al. (2023, Sec. 4.4) complementaram esta perspetiva com o mapeamento dos requisitos não funcionais específicos de sistemas de IA: precisão e robustez dos modelos, privacidade dos dados processados na inferência, explicabilidade das predições e conformidade ética. No FiX-it, estes requisitos traduziram-se na execução local dos modelos sem envio de imagens para servidores externos, na camada de explicabilidade nos resultados e nos disclaimers de natureza não clínica.</w:t>
       </w:r>
     </w:p>
     <w:p>
@@ -1772,17 +1809,41 @@
         <w:spacing w:after="0" w:line="360" w:lineRule="auto"/>
         <w:ind w:firstLine="680"/>
         <w:jc w:val="both"/>
-        <w:rPr>
-          <w:lang w:val="pt-PT"/>
-        </w:rPr>
-      </w:pPr>
-      <w:r>
-        <w:rPr>
-          <w:rFonts w:ascii="Times New Roman" w:hAnsi="Times New Roman"/>
+        <w:outlineLvl w:val="0"/>
+        <w:rPr>
+          <w:rFonts w:ascii="Times New Roman" w:hAnsi="Times New Roman" w:cs="Times New Roman"/>
           <w:sz w:val="24"/>
           <w:lang w:val="pt-PT"/>
         </w:rPr>
-        <w:t>A execução de modelos de machine learning no browser do utilizador, sem recurso a servidores de inferência, tornou-se tecnicamente viável com a maturação do TensorFlow.js e dos modelos otimizados para execução em dispositivos de recursos limitados. Kim et al. (2023, p. 13) validaram empiricamente a adequação do MediaPipe Pose a aplicações de fitness, demonstrando que o modelo produz estimativas de 33 marcos esqueléticos com taxas de deteção superiores a 90% em condições frontais controladas, com erros médios por articulação aceitáveis para a monitorização de exercício.</w:t>
+      </w:pPr>
+      <w:r>
+        <w:rPr>
+          <w:rFonts w:ascii="Times New Roman" w:hAnsi="Times New Roman" w:cs="Times New Roman"/>
+          <w:sz w:val="24"/>
+          <w:lang w:val="pt-PT"/>
+        </w:rPr>
+        <w:t>A dimensão regulatória foi abordada por Ayala-Rivera et al. (2024, p. 12), que propuseram a metodologia SoCo para incorporar controlos de privacidade e segurança diretamente nos artefactos de design de software, alcançando conformidade com o RGPD durante o desenvolvimento. A sua demonstração de que o privacy by design foi tecnicamente viável sem comprometer o ritmo ágil moldou as decisões de segurança do FiX-it: JWT com tokens de curta duração, bcrypt com 12 salt rounds, isolamento de dados por utilizador e ausência de partilha de dados biométricos com terceiros.</w:t>
+      </w:r>
+    </w:p>
+    <w:p>
+      <w:pPr>
+        <w:spacing w:before="200" w:after="80" w:line="360" w:lineRule="auto"/>
+        <w:outlineLvl w:val="0"/>
+        <w:rPr>
+          <w:rFonts w:ascii="Times New Roman" w:hAnsi="Times New Roman" w:cs="Times New Roman"/>
+          <w:b/>
+          <w:sz w:val="28"/>
+          <w:lang w:val="pt-PT"/>
+        </w:rPr>
+      </w:pPr>
+      <w:r>
+        <w:rPr>
+          <w:rFonts w:ascii="Times New Roman" w:hAnsi="Times New Roman" w:cs="Times New Roman"/>
+          <w:b/>
+          <w:sz w:val="28"/>
+          <w:lang w:val="pt-PT"/>
+        </w:rPr>
+        <w:t>2.4 Metodologia de Desenvolvimento Ágil em Contexto Académico (Q3)</w:t>
       </w:r>
     </w:p>
     <w:p>
@@ -1790,17 +1851,20 @@
         <w:spacing w:after="0" w:line="360" w:lineRule="auto"/>
         <w:ind w:firstLine="680"/>
         <w:jc w:val="both"/>
-        <w:rPr>
-          <w:lang w:val="pt-PT"/>
-        </w:rPr>
-      </w:pPr>
-      <w:r>
-        <w:rPr>
-          <w:rFonts w:ascii="Times New Roman" w:hAnsi="Times New Roman"/>
+        <w:outlineLvl w:val="0"/>
+        <w:rPr>
+          <w:rFonts w:ascii="Times New Roman" w:hAnsi="Times New Roman" w:cs="Times New Roman"/>
           <w:sz w:val="24"/>
           <w:lang w:val="pt-PT"/>
         </w:rPr>
-        <w:t>Dill et al. (2023, p. 565) aprofundaram esta avaliação especificamente para movimentos de exercício físico, quantificando a degradação de precisão em poses de perfil e com oclusão parcial dos membros. Esta limitação foi diretamente incorporada no FiX-it sob a forma de indicadores de qualidade de imagem apresentados ao utilizador antes da análise, bem como de orientações específicas sobre posição de câmara e iluminação que maximizam a precisão do modelo.</w:t>
+      </w:pPr>
+      <w:r>
+        <w:rPr>
+          <w:rFonts w:ascii="Times New Roman" w:hAnsi="Times New Roman" w:cs="Times New Roman"/>
+          <w:sz w:val="24"/>
+          <w:lang w:val="pt-PT"/>
+        </w:rPr>
+        <w:t>A escolha de uma metodologia adequada ao contexto académico do FiX-it — projeto individual com prazo fixo, orientador externo e entregas intercalares — assentou numa base empírica fornecida por investigação recente. Sassa et al. (2023, Sec. IV.B, p. 177) realizaram uma revisão sistemática sobre Scrum que confirmou que as metodologias ágeis, mesmo em equipas reduzidas, aumentaram a cadência de entrega de valor e melhoraram a capacidade de resposta a mudanças de requisitos — característica particularmente valiosa num projeto de IA com algoritmos que evoluíram com a implementação. Mishra e Alzoubi (2023, p. 1515) estabeleceram que projetos com requisitos parcialmente indefinidos à partida e componentes exploratórias beneficiaram da flexibilidade ágil, enquanto projetos com requisitos estáveis e elevadas exigências de documentação formal beneficiaram de abordagens mais estruturadas. O FiX-it enquadrou-se claramente no primeiro perfil.</w:t>
       </w:r>
     </w:p>
     <w:p>
@@ -1808,35 +1872,41 @@
         <w:spacing w:after="0" w:line="360" w:lineRule="auto"/>
         <w:ind w:firstLine="680"/>
         <w:jc w:val="both"/>
-        <w:rPr>
-          <w:lang w:val="pt-PT"/>
-        </w:rPr>
-      </w:pPr>
-      <w:r>
-        <w:rPr>
-          <w:rFonts w:ascii="Times New Roman" w:hAnsi="Times New Roman"/>
+        <w:outlineLvl w:val="0"/>
+        <w:rPr>
+          <w:rFonts w:ascii="Times New Roman" w:hAnsi="Times New Roman" w:cs="Times New Roman"/>
           <w:sz w:val="24"/>
           <w:lang w:val="pt-PT"/>
         </w:rPr>
-        <w:t>Ahmad et al. (2023, Sec. 4.4) identificaram, através de um mapeamento sistemático de 43 estudos primários, os requisitos de engenharia de software específicos de sistemas de IA que diferem das abordagens tradicionais: qualidade dos dados de entrada, margens de erro aceitáveis, mecanismos de explicabilidade e critérios de conformidade ética. Estes requisitos traduziram-se, no FiX-it, na camada de explicabilidade dos resultados, nos disclaimers de natureza não clínica e na apresentação explícita das estimativas como valores aproximados.</w:t>
+      </w:pPr>
+      <w:r>
+        <w:rPr>
+          <w:rFonts w:ascii="Times New Roman" w:hAnsi="Times New Roman" w:cs="Times New Roman"/>
+          <w:sz w:val="24"/>
+          <w:lang w:val="pt-PT"/>
+        </w:rPr>
+        <w:t>Hoy e Xu (2023, p. 8) acrescentaram que a integração de sprint reviews com demonstração funcional ao stakeholder reduziu a divergência entre requisitos especificados e produto implementado — prática incorporada nas revisões periódicas com o orientador. O quadro Scrum foi adaptado ao contexto de projeto individual: o aluno assumiu simultaneamente os papéis de Product Owner e Developer, com sprints de duas semanas e revisões periódicas com o orientador no papel de stakeholder. O backlog foi priorizado por valor e atualizado iterativamente em resposta ao feedback das revisões, incorporando as práticas de integração de ciclos de revisão de requisitos documentadas por Hoy e Xu (2023).</w:t>
       </w:r>
     </w:p>
     <w:p>
       <w:pPr>
         <w:spacing w:before="200" w:after="80" w:line="360" w:lineRule="auto"/>
-        <w:outlineLvl w:val="1"/>
-        <w:rPr>
-          <w:lang w:val="pt-PT"/>
-        </w:rPr>
-      </w:pPr>
-      <w:r>
-        <w:rPr>
-          <w:rFonts w:ascii="Times New Roman" w:hAnsi="Times New Roman"/>
+        <w:outlineLvl w:val="0"/>
+        <w:rPr>
+          <w:rFonts w:ascii="Times New Roman" w:hAnsi="Times New Roman" w:cs="Times New Roman"/>
           <w:b/>
           <w:sz w:val="28"/>
           <w:lang w:val="pt-PT"/>
         </w:rPr>
-        <w:t>2.4 Privacidade, Segurança e Requisitos</w:t>
+      </w:pPr>
+      <w:r>
+        <w:rPr>
+          <w:rFonts w:ascii="Times New Roman" w:hAnsi="Times New Roman" w:cs="Times New Roman"/>
+          <w:b/>
+          <w:sz w:val="28"/>
+          <w:lang w:val="pt-PT"/>
+        </w:rPr>
+        <w:t>2.5 Tecnologias de Inteligência Artificial no Browser (Q4)</w:t>
       </w:r>
     </w:p>
     <w:p>
@@ -1844,17 +1914,20 @@
         <w:spacing w:after="0" w:line="360" w:lineRule="auto"/>
         <w:ind w:firstLine="680"/>
         <w:jc w:val="both"/>
-        <w:rPr>
-          <w:lang w:val="pt-PT"/>
-        </w:rPr>
-      </w:pPr>
-      <w:r>
-        <w:rPr>
-          <w:rFonts w:ascii="Times New Roman" w:hAnsi="Times New Roman"/>
+        <w:outlineLvl w:val="0"/>
+        <w:rPr>
+          <w:rFonts w:ascii="Times New Roman" w:hAnsi="Times New Roman" w:cs="Times New Roman"/>
           <w:sz w:val="24"/>
           <w:lang w:val="pt-PT"/>
         </w:rPr>
-        <w:t>O enquadramento legal do FiX-it enquanto aplicação que processa dados biométricos é definido pelo RGPD (Regulation EU 2016/679, 2016), que classifica as imagens corporais e as métricas de composição corporal como dados de categoria especial sujeitos ao consentimento explícito do titular. O princípio de privacy by design encontra aplicação direta na decisão de executar toda a análise de IA localmente no browser, sem envio de imagens para servidores externos.</w:t>
+      </w:pPr>
+      <w:r>
+        <w:rPr>
+          <w:rFonts w:ascii="Times New Roman" w:hAnsi="Times New Roman" w:cs="Times New Roman"/>
+          <w:sz w:val="24"/>
+          <w:lang w:val="pt-PT"/>
+        </w:rPr>
+        <w:t>A execução de modelos de IA diretamente no browser, sem recurso a servidores de inferência, foi a decisão tecnológica mais distintiva do FiX-it. Kim et al. (2023, p. 13) investigaram o MediaPipe Pose em contexto de exercício físico e propuseram um método de otimização baseado em modelo humanoide que elevou a precisão dos 33 marcos anatómicos detetados a taxas superiores a 90% em condições frontais controladas — confirmando a adequação do modelo a aplicações de fitness. Dill et al. (2023, p. 565) aprofundaram esta avaliação quantificando o erro de estimação em diferentes condições, alertando para a degradação de precisão em poses de perfil e com oclusão parcial — condições frequentes em fotografias corporais domésticas. Esta evidência informou a inclusão no FiX-it de indicadores de qualidade de imagem e orientações para o utilizador sobre pose e iluminação ideais.</w:t>
       </w:r>
     </w:p>
     <w:p>
@@ -1862,17 +1935,41 @@
         <w:spacing w:after="0" w:line="360" w:lineRule="auto"/>
         <w:ind w:firstLine="680"/>
         <w:jc w:val="both"/>
-        <w:rPr>
-          <w:lang w:val="pt-PT"/>
-        </w:rPr>
-      </w:pPr>
-      <w:r>
-        <w:rPr>
-          <w:rFonts w:ascii="Times New Roman" w:hAnsi="Times New Roman"/>
+        <w:outlineLvl w:val="0"/>
+        <w:rPr>
+          <w:rFonts w:ascii="Times New Roman" w:hAnsi="Times New Roman" w:cs="Times New Roman"/>
           <w:sz w:val="24"/>
           <w:lang w:val="pt-PT"/>
         </w:rPr>
-        <w:t>Ayala-Rivera et al. (2024, p. 12) demonstraram que a conformidade com o RGPD pode ser alcançada de forma sistemática através da integração de controlos de privacidade e segurança nos artefactos de design de software. Esta abordagem moldou decisões técnicas como a autenticação JWT com tokens de curta duração, o hashing de passwords com bcrypt (12 salt rounds), o isolamento de dados por utilizador e a ausência de telemetria ou partilha de dados com terceiros.</w:t>
+      </w:pPr>
+      <w:r>
+        <w:rPr>
+          <w:rFonts w:ascii="Times New Roman" w:hAnsi="Times New Roman" w:cs="Times New Roman"/>
+          <w:sz w:val="24"/>
+          <w:lang w:val="pt-PT"/>
+        </w:rPr>
+        <w:t>Qiao et al. (2024, p. 5) estabeleceram o estado da arte em estimação de composição corporal por câmara, demonstrando correlações superiores a r = 0,84 com medições DEXA numa coorte de 12 435 adultos. A comparação com esta referência situou a abordagem 2D do FiX-it num patamar técnico inferior, justificando a apresentação explícita das limitações ao utilizador. A camada de persistência foi sustentada por PostgreSQL Global Development Group (2026), que documentou as capacidades do PostgreSQL 18 para séries temporais de métricas fisiológicas com restrições de integridade por utilizador/data.</w:t>
+      </w:r>
+    </w:p>
+    <w:p>
+      <w:pPr>
+        <w:spacing w:before="200" w:after="80" w:line="360" w:lineRule="auto"/>
+        <w:outlineLvl w:val="0"/>
+        <w:rPr>
+          <w:rFonts w:ascii="Times New Roman" w:hAnsi="Times New Roman" w:cs="Times New Roman"/>
+          <w:b/>
+          <w:sz w:val="28"/>
+          <w:lang w:val="pt-PT"/>
+        </w:rPr>
+      </w:pPr>
+      <w:r>
+        <w:rPr>
+          <w:rFonts w:ascii="Times New Roman" w:hAnsi="Times New Roman" w:cs="Times New Roman"/>
+          <w:b/>
+          <w:sz w:val="28"/>
+          <w:lang w:val="pt-PT"/>
+        </w:rPr>
+        <w:t>2.6 Acessibilidade, Usabilidade e Design Centrado no Utilizador (Q5)</w:t>
       </w:r>
     </w:p>
     <w:p>
@@ -1880,35 +1977,20 @@
         <w:spacing w:after="0" w:line="360" w:lineRule="auto"/>
         <w:ind w:firstLine="680"/>
         <w:jc w:val="both"/>
-        <w:rPr>
-          <w:lang w:val="pt-PT"/>
-        </w:rPr>
-      </w:pPr>
-      <w:r>
-        <w:rPr>
-          <w:rFonts w:ascii="Times New Roman" w:hAnsi="Times New Roman"/>
+        <w:outlineLvl w:val="0"/>
+        <w:rPr>
+          <w:rFonts w:ascii="Times New Roman" w:hAnsi="Times New Roman" w:cs="Times New Roman"/>
           <w:sz w:val="24"/>
           <w:lang w:val="pt-PT"/>
         </w:rPr>
-        <w:t>Hoy e Xu (2023, p. 8) identificaram os principais desafios da engenharia de requisitos em contexto ágil — volatilidade dos requisitos, lacunas de comunicação e rastreabilidade insuficiente — e propuseram um quadro de soluções que informou o processo de especificação do FiX-it. Ahmad et al. (2023, Sec. 4.4) complementaram este quadro com os requisitos não funcionais específicos de sistemas de IA, em particular os de privacidade na inferência e de explicabilidade das predições.</w:t>
-      </w:r>
-    </w:p>
-    <w:p>
-      <w:pPr>
-        <w:spacing w:before="200" w:after="80" w:line="360" w:lineRule="auto"/>
-        <w:outlineLvl w:val="1"/>
-        <w:rPr>
-          <w:lang w:val="pt-PT"/>
-        </w:rPr>
-      </w:pPr>
-      <w:r>
-        <w:rPr>
-          <w:rFonts w:ascii="Times New Roman" w:hAnsi="Times New Roman"/>
-          <w:b/>
-          <w:sz w:val="28"/>
-          <w:lang w:val="pt-PT"/>
-        </w:rPr>
-        <w:t>2.5 Usabilidade, Acessibilidade e Design Centrado no Utilizador</w:t>
+      </w:pPr>
+      <w:r>
+        <w:rPr>
+          <w:rFonts w:ascii="Times New Roman" w:hAnsi="Times New Roman" w:cs="Times New Roman"/>
+          <w:sz w:val="24"/>
+          <w:lang w:val="pt-PT"/>
+        </w:rPr>
+        <w:t>A dimensão humana do FiX-it foi enquadrada por três referências complementares. Galavi et al. (2024, Results, para. 1) identificaram, numa revisão sistemática de avaliações de aplicações móveis de saúde, que a visibilidade do estado do sistema, o controlo do utilizador e a prevenção de erros figuraram entre as heurísticas de usabilidade mais frequentemente aplicadas — orientando decisões como o indicador de progresso durante a análise de IA, o botão de cancelamento em operações longas e a validação em tempo real nos formulários. Kirkpatrick et al. (2023) editaram as WCAG 2.2, introduzindo novos critérios para autenticação acessível, foco visível e interações por arrastamento, constituindo o referencial normativo atual para conformidade AA. A auditoria do FiX-it verificou contraste mínimo 4,5:1, navegabilidade por teclado, atributos ARIA em regiões dinâmicas e ausência de CAPTCHA no fluxo de autenticação.</w:t>
       </w:r>
     </w:p>
     <w:p>
@@ -1916,32 +1998,20 @@
         <w:spacing w:after="0" w:line="360" w:lineRule="auto"/>
         <w:ind w:firstLine="680"/>
         <w:jc w:val="both"/>
-        <w:rPr>
-          <w:lang w:val="pt-PT"/>
-        </w:rPr>
-      </w:pPr>
-      <w:r>
-        <w:rPr>
-          <w:rFonts w:ascii="Times New Roman" w:hAnsi="Times New Roman"/>
+        <w:outlineLvl w:val="0"/>
+        <w:rPr>
+          <w:rFonts w:ascii="Times New Roman" w:hAnsi="Times New Roman" w:cs="Times New Roman"/>
           <w:sz w:val="24"/>
           <w:lang w:val="pt-PT"/>
         </w:rPr>
-        <w:t xml:space="preserve">O design de interfaces para aplicações de saúde que lidam com dados sensíveis e apresentam resultados de IA coloca exigências específicas de usabilidade e acessibilidade. </w:t>
-      </w:r>
-      <w:r>
-        <w:rPr>
-          <w:rFonts w:ascii="Times New Roman" w:hAnsi="Times New Roman"/>
+      </w:pPr>
+      <w:r>
+        <w:rPr>
+          <w:rFonts w:ascii="Times New Roman" w:hAnsi="Times New Roman" w:cs="Times New Roman"/>
           <w:sz w:val="24"/>
-        </w:rPr>
-        <w:t xml:space="preserve">Galavi et al. (2024, Results, “Previously established heuristics”, para. </w:t>
-      </w:r>
-      <w:r>
-        <w:rPr>
-          <w:rFonts w:ascii="Times New Roman" w:hAnsi="Times New Roman"/>
-          <w:sz w:val="24"/>
-          <w:lang w:val="pt-PT"/>
-        </w:rPr>
-        <w:t>1) identificaram, numa revisão sistemática de avaliações de aplicações móveis de saúde, que a visibilidade do estado do sistema, o controlo e liberdade do utilizador e a prevenção de erros figuram entre as heurísticas de usabilidade mais frequentemente aplicadas à avaliação de interfaces de saúde.</w:t>
+          <w:lang w:val="pt-PT"/>
+        </w:rPr>
+        <w:t>Berni e Borgianni (2023, p. 11) argumentaram que o UX design só atingiu o seu potencial quando integrado desde a conceção, demonstrando que personas, jornadas e protótipos de baixa fidelidade reduziram o retrabalho e aumentaram a satisfação dos utilizadores finais. Esta perspetiva moldou a conceção do FiX-it, onde o fluxo de oito ecrãs em sequência linear refletiu a jornada real do utilizador — fotografar, analisar, ver resultados, simular, treinar, registar nutrição e acompanhar o progresso — e não a estrutura técnica interna da aplicação.</w:t>
       </w:r>
     </w:p>
     <w:p>
@@ -1949,30 +2019,20 @@
         <w:spacing w:after="0" w:line="360" w:lineRule="auto"/>
         <w:ind w:firstLine="680"/>
         <w:jc w:val="both"/>
-        <w:rPr>
-          <w:lang w:val="pt-PT"/>
-        </w:rPr>
-      </w:pPr>
-      <w:r>
-        <w:rPr>
-          <w:rFonts w:ascii="Times New Roman" w:hAnsi="Times New Roman"/>
+        <w:outlineLvl w:val="0"/>
+        <w:rPr>
+          <w:rFonts w:ascii="Times New Roman" w:hAnsi="Times New Roman" w:cs="Times New Roman"/>
           <w:sz w:val="24"/>
           <w:lang w:val="pt-PT"/>
         </w:rPr>
-        <w:t>As Web Content Accessibility Guidelines 2.2 (Kirkpatrick et al., 2023) constituíram o referencial normativo para a auditoria de acessibilidade do FiX-it. A versão 2.2, publicada em outubro de 2023, introduziu novos critérios de sucesso relativos à autenticação acessível e ao foco visível em componentes interativos. Berni e Borgianni (2023, p. 11) reforçaram a importância da integração de métodos centrados no utilizador desde a fase de conceção, argumentando que personas, jornadas e protótipos de baixa fidelidade reduzem o retrabalho e aumentam a satisfação dos utilizadores finais.</w:t>
-      </w:r>
-    </w:p>
-    <w:p>
-      <w:pPr>
-        <w:rPr>
-          <w:lang w:val="pt-PT"/>
-        </w:rPr>
-      </w:pPr>
-      <w:r>
-        <w:rPr>
-          <w:lang w:val="pt-PT"/>
-        </w:rPr>
-        <w:br w:type="page"/>
+      </w:pPr>
+      <w:r>
+        <w:rPr>
+          <w:rFonts w:ascii="Times New Roman" w:hAnsi="Times New Roman" w:cs="Times New Roman"/>
+          <w:sz w:val="24"/>
+          <w:lang w:val="pt-PT"/>
+        </w:rPr>
+        <w:t>A revisão da literatura realizada demonstrou a existência de uma base bibliográfica recente e coerente que sustentou as principais decisões do projeto FiX-it. As dezasseis fontes analisadas, publicadas entre 2023 e 2026, cobriram de forma complementar os cinco domínios de investigação: a arquitetura REST e PWA (Bogner et al., 2023; Vepsäläinen et al., 2023; MDN Web Docs, 2025; Ahmad et al., 2023); os requisitos e a privacidade (Hoy &amp; Xu, 2023; Ahmad et al., 2023; Ayala-Rivera et al., 2024); a metodologia ágil (Sassa et al., 2023; Mishra &amp; Alzoubi, 2023; Hoy &amp; Xu, 2023); as tecnologias de IA no browser (Kim et al., 2023; Dill et al., 2023; Qiao et al., 2024; PostgreSQL Global Development Group, 2026); e a acessibilidade e usabilidade (Galavi et al., 2024; Kirkpatrick et al., 2023; Berni &amp; Borgianni, 2023). A principal lacuna identificada prendeu-se com a ausência de estudos longitudinais sobre a eficácia de aplicações de análise corporal baseadas em câmara 2D doméstica sem reconstrução 3D, domínio em que o FiX-it poderá contribuir com dados empíricos originais, ainda que em escala académica limitada.</w:t>
       </w:r>
     </w:p>
     <w:p>
@@ -2098,7 +2158,16 @@
           <w:sz w:val="24"/>
           <w:lang w:val="pt-PT"/>
         </w:rPr>
-        <w:t>O quadro Scrum foi adaptado ao contexto de projeto individual: o aluno assumiu simultaneamente os papéis de Product Owner e Developer, com sprints de duas semanas e revisões periódicas com o orientador no papel de stakeholder. O backlog foi priorizado por valor e atualizado iterativamente em resposta ao feedback das revisões, incorporando as práticas de integração de ciclos de revisão de requisitos documentadas por Hoy e Xu (2023, p. 5).</w:t>
+        <w:t xml:space="preserve">O quadro Scrum foi adaptado ao contexto de projeto individual: o aluno assumiu simultaneamente os papéis de Product Owner e Developer, com sprints de duas semanas e revisões periódicas com o orientador no papel de stakeholder. O backlog foi priorizado por valor </w:t>
+      </w:r>
+      <w:r>
+        <w:rPr>
+          <w:rFonts w:ascii="Times New Roman" w:hAnsi="Times New Roman"/>
+          <w:sz w:val="24"/>
+          <w:lang w:val="pt-PT"/>
+        </w:rPr>
+        <w:lastRenderedPageBreak/>
+        <w:t>e atualizado iterativamente em resposta ao feedback das revisões, incorporando as práticas de integração de ciclos de revisão de requisitos documentadas por Hoy e Xu (2023, p. 5).</w:t>
       </w:r>
     </w:p>
     <w:p>
@@ -2302,6 +2371,7 @@
                 <w:color w:val="FFFFFF"/>
                 <w:sz w:val="20"/>
               </w:rPr>
+              <w:lastRenderedPageBreak/>
               <w:t>Etapa</w:t>
             </w:r>
           </w:p>
@@ -3768,6 +3838,24 @@
     </w:p>
     <w:p>
       <w:pPr>
+        <w:pStyle w:val="Heading1"/>
+        <w:rPr>
+          <w:rFonts w:ascii="Times New Roman" w:hAnsi="Times New Roman" w:cs="Times New Roman"/>
+          <w:sz w:val="24"/>
+          <w:lang w:val="pt-PT"/>
+        </w:rPr>
+      </w:pPr>
+      <w:r>
+        <w:rPr>
+          <w:rFonts w:ascii="Times New Roman" w:hAnsi="Times New Roman" w:cs="Times New Roman"/>
+          <w:sz w:val="24"/>
+          <w:lang w:val="pt-PT"/>
+        </w:rPr>
+        <w:t>No decorrer do desenvolvimento do FiX-it, dois obstáculos técnicos condicionaram decisões de arquitetura e exigiram investigação e reformulação da solução: a configuração do serviço de email e a sincronização de dados entre dispositivos. Esta secção descreve o problema identificado, o processo de diagnóstico e a solução adotada em cada caso, ilustrados com excertos de código.</w:t>
+      </w:r>
+    </w:p>
+    <w:p>
+      <w:pPr>
         <w:spacing w:before="200" w:after="80" w:line="360" w:lineRule="auto"/>
         <w:outlineLvl w:val="1"/>
         <w:rPr>
@@ -3777,15 +3865,32 @@
           <w:lang w:val="pt-PT"/>
         </w:rPr>
       </w:pPr>
-      <w:r>
+    </w:p>
+    <w:p>
+      <w:pPr>
+        <w:pStyle w:val="Heading2"/>
+        <w:rPr>
+          <w:lang w:val="pt-PT"/>
+        </w:rPr>
+      </w:pPr>
+      <w:r>
+        <w:rPr>
+          <w:lang w:val="pt-PT"/>
+        </w:rPr>
+        <w:t>4.5.1 Configuração do Serviço de Email (Verificação de Conta)</w:t>
+      </w:r>
+    </w:p>
+    <w:p>
+      <w:pPr>
+        <w:spacing w:before="200" w:after="80" w:line="360" w:lineRule="auto"/>
+        <w:outlineLvl w:val="1"/>
         <w:rPr>
           <w:rFonts w:ascii="Times New Roman" w:hAnsi="Times New Roman"/>
           <w:b/>
           <w:sz w:val="28"/>
           <w:lang w:val="pt-PT"/>
         </w:rPr>
-        <w:t>O desenvolvimento do FiX-it foi marcado por um conjunto de obstáculos técnicos relevantes cuja resolução condicionou decisões de arquitetura e de implementação. Esta secção descreve, de forma narrativa, os principais erros encontrados, o processo de diagnóstico e as soluções adotadas — seguindo a recomendação da Prof.ª Dulce Mourato de registar as "peripécias do que fez, as dificuldades que teve."</w:t>
-      </w:r>
+      </w:pPr>
     </w:p>
     <w:p>
       <w:pPr>
@@ -3801,6 +3906,24 @@
     </w:p>
     <w:p>
       <w:pPr>
+        <w:pStyle w:val="Heading2"/>
+        <w:rPr>
+          <w:rFonts w:ascii="Times New Roman" w:hAnsi="Times New Roman" w:cs="Times New Roman"/>
+          <w:sz w:val="24"/>
+          <w:lang w:val="pt-PT"/>
+        </w:rPr>
+      </w:pPr>
+      <w:r>
+        <w:rPr>
+          <w:rFonts w:ascii="Times New Roman" w:hAnsi="Times New Roman" w:cs="Times New Roman"/>
+          <w:sz w:val="24"/>
+          <w:lang w:val="pt-PT"/>
+        </w:rPr>
+        <w:t>A configuração inicial usava a conta de email da escola (carlos.dju@my.istec.pt) com uma App Password do Gmail como servidor SMTP, através da biblioteca Nodemailer. Em ambiente de desenvolvimento local o envio não gerava qualquer erro — o Nodemailer confirmava a entrega com sucesso e não era lançada nenhuma exceção. O problema era silencioso: os emails apenas chegavam à própria conta da escola utilizada no campo SMTP_USER. Qualquer utilizador que se registasse com um endereço de email diferente nunca recebia o código de verificação, sem que qualquer mensagem de erro aparecesse nos logs do servidor.</w:t>
+      </w:r>
+    </w:p>
+    <w:p>
+      <w:pPr>
         <w:spacing w:before="200" w:after="80" w:line="360" w:lineRule="auto"/>
         <w:outlineLvl w:val="1"/>
         <w:rPr>
@@ -3810,122 +3933,20 @@
           <w:lang w:val="pt-PT"/>
         </w:rPr>
       </w:pPr>
-      <w:r>
-        <w:rPr>
-          <w:rFonts w:asciiTheme="majorHAnsi" w:eastAsiaTheme="majorEastAsia" w:hAnsiTheme="majorHAnsi" w:cstheme="majorBidi"/>
-          <w:b/>
-          <w:bCs/>
-          <w:color w:val="4F81BD" w:themeColor="accent1"/>
-          <w:sz w:val="26"/>
-          <w:szCs w:val="26"/>
-          <w:lang w:val="pt-PT"/>
-        </w:rPr>
-        <w:t>4.5.1 Configuração do Serviço de Email</w:t>
-      </w:r>
-      <w:r>
-        <w:rPr>
-          <w:rFonts w:ascii="Times New Roman" w:hAnsi="Times New Roman"/>
-          <w:b/>
-          <w:sz w:val="28"/>
-          <w:lang w:val="pt-PT"/>
-        </w:rPr>
-        <w:t xml:space="preserve"> (Verificação de Conta)</w:t>
-      </w:r>
-    </w:p>
-    <w:p>
-      <w:pPr>
-        <w:spacing w:before="200" w:after="80" w:line="360" w:lineRule="auto"/>
-        <w:outlineLvl w:val="1"/>
-        <w:rPr>
-          <w:rFonts w:ascii="Times New Roman" w:hAnsi="Times New Roman"/>
-          <w:b/>
-          <w:sz w:val="28"/>
-          <w:lang w:val="pt-PT"/>
-        </w:rPr>
-      </w:pPr>
-    </w:p>
-    <w:p>
-      <w:pPr>
-        <w:spacing w:before="200" w:after="80" w:line="360" w:lineRule="auto"/>
-        <w:outlineLvl w:val="1"/>
-        <w:rPr>
-          <w:rFonts w:ascii="Times New Roman" w:hAnsi="Times New Roman"/>
-          <w:b/>
-          <w:sz w:val="28"/>
-          <w:lang w:val="pt-PT"/>
-        </w:rPr>
-      </w:pPr>
-      <w:r>
-        <w:rPr>
-          <w:rFonts w:ascii="Times New Roman" w:hAnsi="Times New Roman"/>
-          <w:b/>
-          <w:sz w:val="28"/>
-          <w:lang w:val="pt-PT"/>
-        </w:rPr>
-        <w:t>Um dos primeiros obstáculos encontrados foi a configuração do serviço de envio de emails para verificação de conta e recuperação de password. O backend utiliza a biblioteca Nodemailer em Node.js para enviar mensagens SMTP, mas a configuração revelou-se mais complexa do que antecipado.</w:t>
-      </w:r>
-    </w:p>
-    <w:p>
-      <w:pPr>
-        <w:spacing w:before="200" w:after="80" w:line="360" w:lineRule="auto"/>
-        <w:outlineLvl w:val="1"/>
-        <w:rPr>
-          <w:rFonts w:ascii="Times New Roman" w:hAnsi="Times New Roman"/>
-          <w:b/>
-          <w:sz w:val="28"/>
-          <w:lang w:val="pt-PT"/>
-        </w:rPr>
-      </w:pPr>
-    </w:p>
-    <w:p>
-      <w:pPr>
-        <w:spacing w:before="200" w:after="80" w:line="360" w:lineRule="auto"/>
-        <w:outlineLvl w:val="1"/>
-        <w:rPr>
-          <w:rFonts w:ascii="Times New Roman" w:hAnsi="Times New Roman"/>
-          <w:b/>
-          <w:sz w:val="28"/>
-          <w:lang w:val="pt-PT"/>
-        </w:rPr>
-      </w:pPr>
-      <w:r>
-        <w:rPr>
-          <w:rFonts w:ascii="Times New Roman" w:hAnsi="Times New Roman"/>
-          <w:b/>
-          <w:sz w:val="28"/>
-          <w:lang w:val="pt-PT"/>
-        </w:rPr>
-        <w:t>A configuração inicial usava a conta de email da escola (carlos.dju@my.istec.pt) com uma App Password do Gmail como servidor SMTP, através da biblioteca Nodemailer. Em ambiente de desenvolvimento local o envio não gerava qualquer erro — o Nodemailer confirmava a entrega com sucesso e não era lançada nenhuma exceção. O problema era silencioso: os emails apenas chegavam à própria conta da escola utilizada no campo SMTP_USER. Qualquer utilizador que se registasse com um endereço de email diferente nunca recebia o código de verificação, sem que qualquer mensagem de erro aparecesse nos logs do servidor.</w:t>
-      </w:r>
-    </w:p>
-    <w:p>
-      <w:pPr>
-        <w:spacing w:before="200" w:after="80" w:line="360" w:lineRule="auto"/>
-        <w:outlineLvl w:val="1"/>
-        <w:rPr>
-          <w:rFonts w:ascii="Times New Roman" w:hAnsi="Times New Roman"/>
-          <w:b/>
-          <w:sz w:val="28"/>
-          <w:lang w:val="pt-PT"/>
-        </w:rPr>
-      </w:pPr>
-    </w:p>
-    <w:p>
-      <w:pPr>
-        <w:spacing w:before="200" w:after="80" w:line="360" w:lineRule="auto"/>
-        <w:outlineLvl w:val="1"/>
-        <w:rPr>
-          <w:rFonts w:ascii="Times New Roman" w:hAnsi="Times New Roman"/>
-          <w:b/>
-          <w:sz w:val="28"/>
-          <w:lang w:val="pt-PT"/>
-        </w:rPr>
-      </w:pPr>
-      <w:r>
-        <w:rPr>
-          <w:rFonts w:ascii="Times New Roman" w:hAnsi="Times New Roman"/>
-          <w:b/>
-          <w:sz w:val="28"/>
+    </w:p>
+    <w:p>
+      <w:pPr>
+        <w:pStyle w:val="Heading2"/>
+        <w:rPr>
+          <w:rFonts w:ascii="Times New Roman" w:hAnsi="Times New Roman" w:cs="Times New Roman"/>
+          <w:sz w:val="24"/>
+          <w:lang w:val="pt-PT"/>
+        </w:rPr>
+      </w:pPr>
+      <w:r>
+        <w:rPr>
+          <w:rFonts w:ascii="Times New Roman" w:hAnsi="Times New Roman" w:cs="Times New Roman"/>
+          <w:sz w:val="24"/>
           <w:lang w:val="pt-PT"/>
         </w:rPr>
         <w:t>O diagnóstico foi particularmente difícil precisamente por não existir erro visível — o sistema reportava sucesso mas os emails não eram entregues a endereços externos. Após investigação, identificou-se que o servidor Google Workspace da instituição de ensino não permitia o relay de emails para domínios externos através de App Passwords de contas escolares, bloqueando silenciosamente a entrega a qualquer endereço fora do domínio @my.istec.pt.</w:t>
@@ -3933,77 +3954,21 @@
     </w:p>
     <w:p>
       <w:pPr>
-        <w:spacing w:before="200" w:after="80" w:line="360" w:lineRule="auto"/>
-        <w:outlineLvl w:val="1"/>
-        <w:rPr>
-          <w:rFonts w:ascii="Times New Roman" w:hAnsi="Times New Roman"/>
-          <w:b/>
-          <w:sz w:val="28"/>
-          <w:lang w:val="pt-PT"/>
-        </w:rPr>
-      </w:pPr>
-    </w:p>
-    <w:p>
-      <w:pPr>
-        <w:spacing w:before="200" w:after="80" w:line="360" w:lineRule="auto"/>
-        <w:outlineLvl w:val="1"/>
-        <w:rPr>
-          <w:rFonts w:ascii="Times New Roman" w:hAnsi="Times New Roman"/>
-          <w:b/>
-          <w:sz w:val="28"/>
-          <w:lang w:val="pt-PT"/>
-        </w:rPr>
-      </w:pPr>
-      <w:r>
-        <w:rPr>
-          <w:rFonts w:ascii="Times New Roman" w:hAnsi="Times New Roman"/>
-          <w:b/>
-          <w:sz w:val="28"/>
-          <w:lang w:val="pt-PT"/>
-        </w:rPr>
-        <w:t>A solução foi abandonar o SMTP completamente e adotar a API REST da Brevo, um serviço de email transacional que entrega mensagens a qualquer endereço sem restrições de domínio. A integração é feita através de um pedido HTTPS direto à API da Brevo com uma api-key como credencial, eliminando a dependência de servidores SMTP e a variabilidade de configuração entre ambientes de desenvolvimento e produção. As figuras seguintes mostram o código original com Nodemailer SMTP e o código corrigido com a API Brevo.</w:t>
-      </w:r>
-    </w:p>
-    <w:p>
-      <w:pPr>
-        <w:spacing w:before="200" w:after="80" w:line="360" w:lineRule="auto"/>
-        <w:outlineLvl w:val="1"/>
-        <w:rPr>
-          <w:rFonts w:ascii="Times New Roman" w:hAnsi="Times New Roman"/>
-          <w:b/>
-          <w:sz w:val="28"/>
-          <w:lang w:val="pt-PT"/>
-        </w:rPr>
-      </w:pPr>
-      <w:r>
-        <w:rPr>
-          <w:rFonts w:ascii="Times New Roman" w:hAnsi="Times New Roman"/>
-          <w:b/>
+        <w:rPr>
+          <w:lang w:val="pt-PT"/>
+        </w:rPr>
+      </w:pPr>
+    </w:p>
+    <w:p>
+      <w:r>
+        <w:rPr>
           <w:noProof/>
-          <w:sz w:val="28"/>
-          <w:lang w:val="pt-PT"/>
         </w:rPr>
         <w:drawing>
-          <wp:anchor distT="0" distB="0" distL="114300" distR="114300" simplePos="0" relativeHeight="251656704" behindDoc="1" locked="0" layoutInCell="1" allowOverlap="1" wp14:anchorId="1A75E24C" wp14:editId="26D85E6A">
-            <wp:simplePos x="0" y="0"/>
-            <wp:positionH relativeFrom="column">
-              <wp:posOffset>-2648</wp:posOffset>
-            </wp:positionH>
-            <wp:positionV relativeFrom="paragraph">
-              <wp:posOffset>-2648</wp:posOffset>
-            </wp:positionV>
-            <wp:extent cx="4823878" cy="3033023"/>
-            <wp:effectExtent l="0" t="0" r="0" b="0"/>
-            <wp:wrapTight wrapText="bothSides">
-              <wp:wrapPolygon edited="0">
-                <wp:start x="0" y="0"/>
-                <wp:lineTo x="0" y="21437"/>
-                <wp:lineTo x="21498" y="21437"/>
-                <wp:lineTo x="21498" y="0"/>
-                <wp:lineTo x="0" y="0"/>
-              </wp:wrapPolygon>
-            </wp:wrapTight>
-            <wp:docPr id="742585161" name="Picture 2"/>
+          <wp:inline distT="0" distB="0" distL="0" distR="0" wp14:anchorId="04B64DB9" wp14:editId="2FB1F4E2">
+            <wp:extent cx="5972810" cy="3760470"/>
+            <wp:effectExtent l="0" t="0" r="8890" b="0"/>
+            <wp:docPr id="2124222966" name="Picture 2"/>
             <wp:cNvGraphicFramePr>
               <a:graphicFrameLocks xmlns:a="http://schemas.openxmlformats.org/drawingml/2006/main" noChangeAspect="1"/>
             </wp:cNvGraphicFramePr>
@@ -4011,30 +3976,50 @@
               <a:graphicData uri="http://schemas.openxmlformats.org/drawingml/2006/picture">
                 <pic:pic xmlns:pic="http://schemas.openxmlformats.org/drawingml/2006/picture">
                   <pic:nvPicPr>
-                    <pic:cNvPr id="742585161" name="Picture 742585161"/>
-                    <pic:cNvPicPr/>
+                    <pic:cNvPr id="0" name="Picture 6"/>
+                    <pic:cNvPicPr>
+                      <a:picLocks noChangeAspect="1" noChangeArrowheads="1"/>
+                    </pic:cNvPicPr>
                   </pic:nvPicPr>
                   <pic:blipFill>
-                    <a:blip r:embed="rId6"/>
+                    <a:blip r:embed="rId6">
+                      <a:extLst>
+                        <a:ext uri="{28A0092B-C50C-407E-A947-70E740481C1C}">
+                          <a14:useLocalDpi xmlns:a14="http://schemas.microsoft.com/office/drawing/2010/main" val="0"/>
+                        </a:ext>
+                      </a:extLst>
+                    </a:blip>
+                    <a:srcRect/>
                     <a:stretch>
                       <a:fillRect/>
                     </a:stretch>
                   </pic:blipFill>
-                  <pic:spPr>
+                  <pic:spPr bwMode="auto">
                     <a:xfrm>
                       <a:off x="0" y="0"/>
-                      <a:ext cx="4823878" cy="3033023"/>
+                      <a:ext cx="5972810" cy="3760470"/>
                     </a:xfrm>
                     <a:prstGeom prst="rect">
                       <a:avLst/>
                     </a:prstGeom>
+                    <a:noFill/>
+                    <a:ln>
+                      <a:noFill/>
+                    </a:ln>
                   </pic:spPr>
                 </pic:pic>
               </a:graphicData>
             </a:graphic>
-          </wp:anchor>
+          </wp:inline>
         </w:drawing>
       </w:r>
+    </w:p>
+    <w:p>
+      <w:pPr>
+        <w:rPr>
+          <w:lang w:val="pt-PT"/>
+        </w:rPr>
+      </w:pPr>
     </w:p>
     <w:p>
       <w:pPr>
@@ -4045,6 +4030,50 @@
           <w:b/>
           <w:sz w:val="28"/>
           <w:lang w:val="pt-PT"/>
+        </w:rPr>
+      </w:pPr>
+    </w:p>
+    <w:p>
+      <w:pPr>
+        <w:spacing w:before="200" w:after="80" w:line="360" w:lineRule="auto"/>
+        <w:outlineLvl w:val="1"/>
+        <w:rPr>
+          <w:rFonts w:ascii="Times New Roman" w:hAnsi="Times New Roman"/>
+          <w:b/>
+          <w:sz w:val="28"/>
+          <w:lang w:val="pt-PT"/>
+        </w:rPr>
+      </w:pPr>
+      <w:r>
+        <w:rPr>
+          <w:rFonts w:ascii="Times New Roman" w:hAnsi="Times New Roman"/>
+          <w:b/>
+          <w:sz w:val="28"/>
+          <w:lang w:val="pt-PT"/>
+        </w:rPr>
+        <w:t>A solução foi abandonar o SMTP completamente e adotar a API REST da Brevo, um serviço de email transacional que entrega mensagens a qualquer endereço sem restrições de domínio. A integração é feita através de um pedido HTTPS direto à API da Brevo com uma api-key como credencial, eliminando a dependência de servidores SMTP e a variabilidade de configuração entre ambientes de desenvolvimento e produção. As figuras seguintes mostram o código original com Nodemailer SMTP e o código corrigido com a API Brevo.</w:t>
+      </w:r>
+    </w:p>
+    <w:p>
+      <w:pPr>
+        <w:spacing w:before="200" w:after="80" w:line="360" w:lineRule="auto"/>
+        <w:outlineLvl w:val="1"/>
+        <w:rPr>
+          <w:rFonts w:ascii="Times New Roman" w:hAnsi="Times New Roman"/>
+          <w:b/>
+          <w:sz w:val="28"/>
+          <w:lang w:val="pt-PT"/>
+        </w:rPr>
+      </w:pPr>
+    </w:p>
+    <w:p>
+      <w:pPr>
+        <w:spacing w:before="200" w:after="80" w:line="360" w:lineRule="auto"/>
+        <w:outlineLvl w:val="1"/>
+        <w:rPr>
+          <w:rFonts w:ascii="Times New Roman" w:hAnsi="Times New Roman"/>
+          <w:b/>
+          <w:sz w:val="28"/>
         </w:rPr>
       </w:pPr>
       <w:r>
@@ -4053,29 +4082,12 @@
           <w:b/>
           <w:noProof/>
           <w:sz w:val="28"/>
-          <w:lang w:val="pt-PT"/>
         </w:rPr>
         <w:drawing>
-          <wp:anchor distT="0" distB="0" distL="114300" distR="114300" simplePos="0" relativeHeight="251658752" behindDoc="1" locked="0" layoutInCell="1" allowOverlap="1" wp14:anchorId="08572383" wp14:editId="33B91A43">
-            <wp:simplePos x="0" y="0"/>
-            <wp:positionH relativeFrom="column">
-              <wp:posOffset>164932</wp:posOffset>
-            </wp:positionH>
-            <wp:positionV relativeFrom="paragraph">
-              <wp:posOffset>750870</wp:posOffset>
-            </wp:positionV>
-            <wp:extent cx="5806943" cy="5966977"/>
-            <wp:effectExtent l="0" t="0" r="3810" b="0"/>
-            <wp:wrapTight wrapText="bothSides">
-              <wp:wrapPolygon edited="0">
-                <wp:start x="0" y="0"/>
-                <wp:lineTo x="0" y="21517"/>
-                <wp:lineTo x="21543" y="21517"/>
-                <wp:lineTo x="21543" y="0"/>
-                <wp:lineTo x="0" y="0"/>
-              </wp:wrapPolygon>
-            </wp:wrapTight>
-            <wp:docPr id="2134372352" name="Picture 1"/>
+          <wp:inline distT="0" distB="0" distL="0" distR="0" wp14:anchorId="50965CAD" wp14:editId="65A3A123">
+            <wp:extent cx="5972810" cy="6136005"/>
+            <wp:effectExtent l="0" t="0" r="8890" b="0"/>
+            <wp:docPr id="276942510" name="Picture 4"/>
             <wp:cNvGraphicFramePr>
               <a:graphicFrameLocks xmlns:a="http://schemas.openxmlformats.org/drawingml/2006/main" noChangeAspect="1"/>
             </wp:cNvGraphicFramePr>
@@ -4083,28 +4095,41 @@
               <a:graphicData uri="http://schemas.openxmlformats.org/drawingml/2006/picture">
                 <pic:pic xmlns:pic="http://schemas.openxmlformats.org/drawingml/2006/picture">
                   <pic:nvPicPr>
-                    <pic:cNvPr id="2134372352" name="Picture 2134372352"/>
-                    <pic:cNvPicPr/>
+                    <pic:cNvPr id="0" name="Picture 13"/>
+                    <pic:cNvPicPr>
+                      <a:picLocks noChangeAspect="1" noChangeArrowheads="1"/>
+                    </pic:cNvPicPr>
                   </pic:nvPicPr>
                   <pic:blipFill>
-                    <a:blip r:embed="rId7"/>
+                    <a:blip r:embed="rId7">
+                      <a:extLst>
+                        <a:ext uri="{28A0092B-C50C-407E-A947-70E740481C1C}">
+                          <a14:useLocalDpi xmlns:a14="http://schemas.microsoft.com/office/drawing/2010/main" val="0"/>
+                        </a:ext>
+                      </a:extLst>
+                    </a:blip>
+                    <a:srcRect/>
                     <a:stretch>
                       <a:fillRect/>
                     </a:stretch>
                   </pic:blipFill>
-                  <pic:spPr>
+                  <pic:spPr bwMode="auto">
                     <a:xfrm>
                       <a:off x="0" y="0"/>
-                      <a:ext cx="5806943" cy="5966977"/>
+                      <a:ext cx="5972810" cy="6136005"/>
                     </a:xfrm>
                     <a:prstGeom prst="rect">
                       <a:avLst/>
                     </a:prstGeom>
+                    <a:noFill/>
+                    <a:ln>
+                      <a:noFill/>
+                    </a:ln>
                   </pic:spPr>
                 </pic:pic>
               </a:graphicData>
             </a:graphic>
-          </wp:anchor>
+          </wp:inline>
         </w:drawing>
       </w:r>
     </w:p>
@@ -4131,484 +4156,92 @@
         <w:rPr>
           <w:lang w:val="pt-PT"/>
         </w:rPr>
-        <w:t>4.5.2 Erro de Rate Limiting após Limpeza do Histórico do Browser</w:t>
-      </w:r>
-    </w:p>
-    <w:p>
-      <w:pPr>
-        <w:spacing w:before="200" w:after="80" w:line="360" w:lineRule="auto"/>
-        <w:outlineLvl w:val="1"/>
-        <w:rPr>
-          <w:rFonts w:ascii="Times New Roman" w:hAnsi="Times New Roman"/>
-          <w:b/>
-          <w:sz w:val="28"/>
-          <w:lang w:val="pt-PT"/>
-        </w:rPr>
-      </w:pPr>
-    </w:p>
-    <w:p>
-      <w:pPr>
-        <w:spacing w:before="200" w:after="80" w:line="360" w:lineRule="auto"/>
-        <w:outlineLvl w:val="1"/>
-        <w:rPr>
-          <w:rFonts w:ascii="Times New Roman" w:hAnsi="Times New Roman"/>
-          <w:b/>
-          <w:sz w:val="28"/>
-          <w:lang w:val="pt-PT"/>
-        </w:rPr>
-      </w:pPr>
-      <w:r>
-        <w:rPr>
-          <w:rFonts w:ascii="Times New Roman" w:hAnsi="Times New Roman"/>
-          <w:b/>
-          <w:sz w:val="28"/>
-          <w:lang w:val="pt-PT"/>
-        </w:rPr>
-        <w:t>Durante os testes de utilização normal, verificou-se que após limpar o histórico do browser e fazer login novamente, a aplicação devolvia consistentemente o erro { "error": { "code": "RATE_LIMITED", "message": "Too many requests, try again later" } }.</w:t>
-      </w:r>
-    </w:p>
-    <w:p>
-      <w:pPr>
-        <w:spacing w:before="200" w:after="80" w:line="360" w:lineRule="auto"/>
-        <w:outlineLvl w:val="1"/>
-        <w:rPr>
-          <w:rFonts w:ascii="Times New Roman" w:hAnsi="Times New Roman"/>
-          <w:b/>
-          <w:sz w:val="28"/>
-          <w:lang w:val="pt-PT"/>
-        </w:rPr>
-      </w:pPr>
-    </w:p>
-    <w:p>
-      <w:pPr>
-        <w:spacing w:before="200" w:after="80" w:line="360" w:lineRule="auto"/>
-        <w:outlineLvl w:val="1"/>
-        <w:rPr>
-          <w:rFonts w:ascii="Times New Roman" w:hAnsi="Times New Roman"/>
-          <w:b/>
-          <w:sz w:val="28"/>
-          <w:lang w:val="pt-PT"/>
-        </w:rPr>
-      </w:pPr>
-      <w:r>
-        <w:rPr>
-          <w:rFonts w:ascii="Times New Roman" w:hAnsi="Times New Roman"/>
-          <w:b/>
-          <w:sz w:val="28"/>
-          <w:lang w:val="pt-PT"/>
-        </w:rPr>
-        <w:t>O diagnóstico revelou a causa raiz: o rate limiter era baseado no endereço IP do cliente, cujos contadores persistiam no servidor independentemente de o utilizador ter limpo o browser. No momento do login, o frontend realizava 14+ chamadas API individuais em sequência rápida (perfil, preferências, gamificação, análises, sono, hidratação, etc.), o que esgotava o limite de 100 pedidos por 15 minutos configurado inicialmente.</w:t>
-      </w:r>
-    </w:p>
-    <w:p>
-      <w:pPr>
-        <w:spacing w:before="200" w:after="80" w:line="360" w:lineRule="auto"/>
-        <w:outlineLvl w:val="1"/>
-        <w:rPr>
-          <w:rFonts w:ascii="Times New Roman" w:hAnsi="Times New Roman"/>
-          <w:b/>
-          <w:sz w:val="28"/>
-          <w:lang w:val="pt-PT"/>
-        </w:rPr>
-      </w:pPr>
-    </w:p>
-    <w:p>
-      <w:pPr>
-        <w:spacing w:before="200" w:after="80" w:line="360" w:lineRule="auto"/>
-        <w:outlineLvl w:val="1"/>
-        <w:rPr>
-          <w:rFonts w:ascii="Times New Roman" w:hAnsi="Times New Roman"/>
-          <w:b/>
-          <w:sz w:val="28"/>
-          <w:lang w:val="pt-PT"/>
-        </w:rPr>
-      </w:pPr>
-      <w:r>
-        <w:rPr>
-          <w:rFonts w:ascii="Times New Roman" w:hAnsi="Times New Roman"/>
-          <w:b/>
-          <w:sz w:val="28"/>
-          <w:lang w:val="pt-PT"/>
-        </w:rPr>
-        <w:t>A solução envolveu duas correções em paralelo. Em primeiro lugar, o limite geral do rate limiter foi aumentado de 100 para 2000 pedidos por janela de 15 minutos, um valor mais adequado a padrões de uso multi-dispositivo com sincronização automática. Em segundo lugar — e mais importante — foi implementado um endpoint consolidado /api/sync/all que substitui as 14+ chamadas individuais por uma única chamada ao servidor, executando internamente 15 queries à base de dados em paralelo via Promise.all. Esta solução reduziu o impacto no rate limiter de 14 pedidos para 1 por sessão de login.</w:t>
-      </w:r>
-    </w:p>
-    <w:p>
-      <w:pPr>
-        <w:spacing w:before="200" w:after="80" w:line="360" w:lineRule="auto"/>
-        <w:outlineLvl w:val="1"/>
-        <w:rPr>
-          <w:rFonts w:ascii="Times New Roman" w:hAnsi="Times New Roman"/>
-          <w:b/>
-          <w:sz w:val="28"/>
-          <w:lang w:val="pt-PT"/>
-        </w:rPr>
-      </w:pPr>
-    </w:p>
-    <w:p>
-      <w:pPr>
-        <w:spacing w:before="200" w:after="80" w:line="360" w:lineRule="auto"/>
-        <w:outlineLvl w:val="1"/>
-        <w:rPr>
-          <w:rFonts w:ascii="Times New Roman" w:hAnsi="Times New Roman"/>
-          <w:b/>
-          <w:sz w:val="28"/>
-          <w:lang w:val="pt-PT"/>
-        </w:rPr>
-      </w:pPr>
-      <w:r>
-        <w:rPr>
-          <w:rFonts w:ascii="Times New Roman" w:hAnsi="Times New Roman"/>
-          <w:b/>
-          <w:sz w:val="28"/>
-          <w:lang w:val="pt-PT"/>
-        </w:rPr>
-        <w:t>[Figura X — Comparação do fluxo de login antes (14 chamadas API sequenciais) e depois (1 chamada /sync/all com 15 queries paralelas em PostgreSQL)]</w:t>
-      </w:r>
-    </w:p>
-    <w:p>
-      <w:pPr>
-        <w:spacing w:before="200" w:after="80" w:line="360" w:lineRule="auto"/>
-        <w:outlineLvl w:val="1"/>
-        <w:rPr>
-          <w:rFonts w:ascii="Times New Roman" w:hAnsi="Times New Roman"/>
-          <w:b/>
-          <w:sz w:val="28"/>
-          <w:lang w:val="pt-PT"/>
-        </w:rPr>
-      </w:pPr>
+        <w:t>4.5.2 Dessincronização de Dados entre Dispositivos</w:t>
+      </w:r>
     </w:p>
     <w:p>
       <w:pPr>
         <w:pStyle w:val="Heading2"/>
         <w:rPr>
-          <w:lang w:val="pt-PT"/>
-        </w:rPr>
-      </w:pPr>
-      <w:r>
-        <w:rPr>
-          <w:lang w:val="pt-PT"/>
-        </w:rPr>
-        <w:t>4.5.3 Dessincronização de Dados entre Dispositivos</w:t>
-      </w:r>
-    </w:p>
-    <w:p>
-      <w:pPr>
-        <w:spacing w:before="200" w:after="80" w:line="360" w:lineRule="auto"/>
-        <w:outlineLvl w:val="1"/>
-        <w:rPr>
-          <w:rFonts w:ascii="Times New Roman" w:hAnsi="Times New Roman"/>
-          <w:b/>
-          <w:sz w:val="28"/>
-          <w:lang w:val="pt-PT"/>
-        </w:rPr>
-      </w:pPr>
-    </w:p>
-    <w:p>
-      <w:pPr>
-        <w:spacing w:before="200" w:after="80" w:line="360" w:lineRule="auto"/>
-        <w:outlineLvl w:val="1"/>
-        <w:rPr>
-          <w:rFonts w:ascii="Times New Roman" w:hAnsi="Times New Roman"/>
-          <w:b/>
-          <w:sz w:val="28"/>
-          <w:lang w:val="pt-PT"/>
-        </w:rPr>
-      </w:pPr>
-      <w:r>
-        <w:rPr>
-          <w:rFonts w:ascii="Times New Roman" w:hAnsi="Times New Roman"/>
-          <w:b/>
-          <w:sz w:val="28"/>
-          <w:lang w:val="pt-PT"/>
-        </w:rPr>
-        <w:t>Após implementar o sistema de autenticação e persistência no backend, verificou-se que os dados mostrados no computador e no telemóvel do mesmo utilizador divergiam: limpar os dados no computador e fazer upload de uma nova fotografia não se refletia no telemóvel, que continuava a mostrar o ecrã de resultados com dados antigos.</w:t>
-      </w:r>
-    </w:p>
-    <w:p>
-      <w:pPr>
-        <w:spacing w:before="200" w:after="80" w:line="360" w:lineRule="auto"/>
-        <w:outlineLvl w:val="1"/>
-        <w:rPr>
-          <w:rFonts w:ascii="Times New Roman" w:hAnsi="Times New Roman"/>
-          <w:b/>
-          <w:sz w:val="28"/>
-          <w:lang w:val="pt-PT"/>
-        </w:rPr>
-      </w:pPr>
-    </w:p>
-    <w:p>
-      <w:pPr>
-        <w:spacing w:before="200" w:after="80" w:line="360" w:lineRule="auto"/>
-        <w:outlineLvl w:val="1"/>
-        <w:rPr>
-          <w:rFonts w:ascii="Times New Roman" w:hAnsi="Times New Roman"/>
-          <w:b/>
-          <w:sz w:val="28"/>
-          <w:lang w:val="pt-PT"/>
-        </w:rPr>
-      </w:pPr>
-      <w:r>
-        <w:rPr>
-          <w:rFonts w:ascii="Times New Roman" w:hAnsi="Times New Roman"/>
-          <w:b/>
-          <w:sz w:val="28"/>
-          <w:lang w:val="pt-PT"/>
-        </w:rPr>
-        <w:t>O diagnóstico identificou duas causas. A causa principal era que a função routeAfterLogin() confiava no estado local (localStorage e IndexedDB) antes de consultar o servidor: se o dispositivo tinha dados em cache, navegava diretamente para os resultados sem verificar se o servidor tinha um estado mais recente ou um estado vazio. A causa secundária era que o IndexedDB — utilizado para armazenar snapshots das análises — não estava associado ao utilizador, pelo que ao fazer login com uma conta diferente no mesmo browser, os snapshots do utilizador anterior permaneciam visíveis.</w:t>
-      </w:r>
-    </w:p>
-    <w:p>
-      <w:pPr>
-        <w:spacing w:before="200" w:after="80" w:line="360" w:lineRule="auto"/>
-        <w:outlineLvl w:val="1"/>
-        <w:rPr>
-          <w:rFonts w:ascii="Times New Roman" w:hAnsi="Times New Roman"/>
-          <w:b/>
-          <w:sz w:val="28"/>
-          <w:lang w:val="pt-PT"/>
-        </w:rPr>
-      </w:pPr>
-    </w:p>
-    <w:p>
-      <w:pPr>
-        <w:spacing w:before="200" w:after="80" w:line="360" w:lineRule="auto"/>
-        <w:outlineLvl w:val="1"/>
-        <w:rPr>
-          <w:rFonts w:ascii="Times New Roman" w:hAnsi="Times New Roman"/>
-          <w:b/>
-          <w:sz w:val="28"/>
-          <w:lang w:val="pt-PT"/>
-        </w:rPr>
-      </w:pPr>
-      <w:r>
-        <w:rPr>
-          <w:rFonts w:ascii="Times New Roman" w:hAnsi="Times New Roman"/>
-          <w:b/>
-          <w:sz w:val="28"/>
-          <w:lang w:val="pt-PT"/>
-        </w:rPr>
-        <w:t>A solução para a causa principal foi reestruturar completamente a routeAfterLogin() para consultar sempre o servidor em primeiro lugar: se o servidor não tem análises para o utilizador, o estado local é ignorado e a aplicação navega para o ecrã de upload; se o servidor tem análises, a data da análise mais recente no servidor é comparada com a data da sessão local, prevalecendo sempre a mais recente.</w:t>
-      </w:r>
-    </w:p>
-    <w:p>
-      <w:pPr>
-        <w:spacing w:before="200" w:after="80" w:line="360" w:lineRule="auto"/>
-        <w:outlineLvl w:val="1"/>
-        <w:rPr>
-          <w:rFonts w:ascii="Times New Roman" w:hAnsi="Times New Roman"/>
-          <w:b/>
-          <w:sz w:val="28"/>
-          <w:lang w:val="pt-PT"/>
-        </w:rPr>
-      </w:pPr>
-    </w:p>
-    <w:p>
-      <w:pPr>
-        <w:spacing w:before="200" w:after="80" w:line="360" w:lineRule="auto"/>
-        <w:outlineLvl w:val="1"/>
-        <w:rPr>
-          <w:rFonts w:ascii="Times New Roman" w:hAnsi="Times New Roman"/>
-          <w:b/>
-          <w:sz w:val="28"/>
-          <w:lang w:val="pt-PT"/>
-        </w:rPr>
-      </w:pPr>
-      <w:r>
-        <w:rPr>
-          <w:rFonts w:ascii="Times New Roman" w:hAnsi="Times New Roman"/>
-          <w:b/>
-          <w:sz w:val="28"/>
-          <w:lang w:val="pt-PT"/>
-        </w:rPr>
-        <w:t>A solução para a causa secundária foi implementar tracking do utilizador ativo através de uma chave fixit-last-user-id em localStorage: ao detetar uma mudança de utilizador no login, o IndexedDB é limpo antes de carregar os novos dados.</w:t>
-      </w:r>
-    </w:p>
-    <w:p>
-      <w:pPr>
-        <w:spacing w:before="200" w:after="80" w:line="360" w:lineRule="auto"/>
-        <w:outlineLvl w:val="1"/>
-        <w:rPr>
-          <w:rFonts w:ascii="Times New Roman" w:hAnsi="Times New Roman"/>
-          <w:b/>
-          <w:sz w:val="28"/>
-          <w:lang w:val="pt-PT"/>
-        </w:rPr>
-      </w:pPr>
-    </w:p>
-    <w:p>
-      <w:pPr>
-        <w:spacing w:before="200" w:after="80" w:line="360" w:lineRule="auto"/>
-        <w:outlineLvl w:val="1"/>
-        <w:rPr>
-          <w:rFonts w:ascii="Times New Roman" w:hAnsi="Times New Roman"/>
-          <w:b/>
-          <w:sz w:val="28"/>
-          <w:lang w:val="pt-PT"/>
-        </w:rPr>
-      </w:pPr>
-      <w:r>
-        <w:rPr>
-          <w:rFonts w:ascii="Times New Roman" w:hAnsi="Times New Roman"/>
-          <w:b/>
-          <w:sz w:val="28"/>
-          <w:lang w:val="pt-PT"/>
-        </w:rPr>
-        <w:t>[Figura X — Diagrama de decisão da função routeAfterLogin(): fluxo de consulta ao servidor e comparação de datas antes de decidir o ecrã de destino]</w:t>
-      </w:r>
-    </w:p>
-    <w:p>
-      <w:pPr>
-        <w:spacing w:before="200" w:after="80" w:line="360" w:lineRule="auto"/>
-        <w:outlineLvl w:val="1"/>
-        <w:rPr>
-          <w:rFonts w:ascii="Times New Roman" w:hAnsi="Times New Roman"/>
-          <w:b/>
-          <w:sz w:val="28"/>
-          <w:lang w:val="pt-PT"/>
-        </w:rPr>
-      </w:pPr>
-    </w:p>
-    <w:p>
-      <w:pPr>
-        <w:spacing w:before="200" w:after="80" w:line="360" w:lineRule="auto"/>
-        <w:outlineLvl w:val="1"/>
-        <w:rPr>
-          <w:rFonts w:ascii="Times New Roman" w:hAnsi="Times New Roman"/>
-          <w:b/>
-          <w:sz w:val="28"/>
-          <w:lang w:val="pt-PT"/>
-        </w:rPr>
-      </w:pPr>
-      <w:r>
-        <w:rPr>
-          <w:rFonts w:asciiTheme="majorHAnsi" w:eastAsiaTheme="majorEastAsia" w:hAnsiTheme="majorHAnsi" w:cstheme="majorBidi"/>
-          <w:b/>
-          <w:bCs/>
-          <w:color w:val="4F81BD" w:themeColor="accent1"/>
-          <w:sz w:val="26"/>
-          <w:szCs w:val="26"/>
-          <w:lang w:val="pt-PT"/>
-        </w:rPr>
-        <w:t>4.5.4 Dados Persistentes após Eliminação de Conta</w:t>
-      </w:r>
-      <w:r>
-        <w:rPr>
-          <w:rFonts w:ascii="Times New Roman" w:hAnsi="Times New Roman"/>
-          <w:b/>
-          <w:sz w:val="28"/>
-          <w:lang w:val="pt-PT"/>
-        </w:rPr>
-        <w:t xml:space="preserve"> (IndexedDB)</w:t>
-      </w:r>
-    </w:p>
-    <w:p>
-      <w:pPr>
-        <w:spacing w:before="200" w:after="80" w:line="360" w:lineRule="auto"/>
-        <w:outlineLvl w:val="1"/>
-        <w:rPr>
-          <w:rFonts w:ascii="Times New Roman" w:hAnsi="Times New Roman"/>
-          <w:b/>
-          <w:sz w:val="28"/>
-          <w:lang w:val="pt-PT"/>
-        </w:rPr>
-      </w:pPr>
-    </w:p>
-    <w:p>
-      <w:pPr>
-        <w:spacing w:before="200" w:after="80" w:line="360" w:lineRule="auto"/>
-        <w:outlineLvl w:val="1"/>
-        <w:rPr>
-          <w:rFonts w:ascii="Times New Roman" w:hAnsi="Times New Roman"/>
-          <w:b/>
-          <w:sz w:val="28"/>
-          <w:lang w:val="pt-PT"/>
-        </w:rPr>
-      </w:pPr>
-      <w:r>
-        <w:rPr>
-          <w:rFonts w:ascii="Times New Roman" w:hAnsi="Times New Roman"/>
-          <w:b/>
-          <w:sz w:val="28"/>
-          <w:lang w:val="pt-PT"/>
-        </w:rPr>
-        <w:t>Um bug particularmente visível durante os testes foi a persistência de fotografias e análises antigas no ecrã de histórico de scans, mesmo após o utilizador eliminar a conta e criar uma nova com o mesmo email. As imagens analisadas em maio ficavam visíveis numa conta recriada em junho.</w:t>
-      </w:r>
-    </w:p>
-    <w:p>
-      <w:pPr>
-        <w:spacing w:before="200" w:after="80" w:line="360" w:lineRule="auto"/>
-        <w:outlineLvl w:val="1"/>
-        <w:rPr>
-          <w:rFonts w:ascii="Times New Roman" w:hAnsi="Times New Roman"/>
-          <w:b/>
-          <w:sz w:val="28"/>
-          <w:lang w:val="pt-PT"/>
-        </w:rPr>
-      </w:pPr>
-    </w:p>
-    <w:p>
-      <w:pPr>
-        <w:spacing w:before="200" w:after="80" w:line="360" w:lineRule="auto"/>
-        <w:outlineLvl w:val="1"/>
-        <w:rPr>
-          <w:rFonts w:ascii="Times New Roman" w:hAnsi="Times New Roman"/>
-          <w:b/>
-          <w:sz w:val="28"/>
-          <w:lang w:val="pt-PT"/>
-        </w:rPr>
-      </w:pPr>
-      <w:r>
-        <w:rPr>
-          <w:rFonts w:ascii="Times New Roman" w:hAnsi="Times New Roman"/>
-          <w:b/>
-          <w:sz w:val="28"/>
-          <w:lang w:val="pt-PT"/>
-        </w:rPr>
-        <w:t>A causa foi identificada no armazenamento em IndexedDB (base de dados local do browser): ao eliminar a conta via clearAllData(), os dados eram apagados no servidor (PostgreSQL), mas o IndexedDB permanecia intacto no dispositivo, por ser armazenamento exclusivamente local sem ligação ao ciclo de vida da conta no servidor.</w:t>
-      </w:r>
-    </w:p>
-    <w:p>
-      <w:pPr>
-        <w:spacing w:before="200" w:after="80" w:line="360" w:lineRule="auto"/>
-        <w:outlineLvl w:val="1"/>
-        <w:rPr>
-          <w:rFonts w:ascii="Times New Roman" w:hAnsi="Times New Roman"/>
-          <w:b/>
-          <w:sz w:val="28"/>
-          <w:lang w:val="pt-PT"/>
-        </w:rPr>
-      </w:pPr>
-    </w:p>
-    <w:p>
-      <w:pPr>
-        <w:spacing w:before="200" w:after="80" w:line="360" w:lineRule="auto"/>
-        <w:outlineLvl w:val="1"/>
-        <w:rPr>
-          <w:rFonts w:ascii="Times New Roman" w:hAnsi="Times New Roman"/>
-          <w:b/>
-          <w:sz w:val="28"/>
-          <w:lang w:val="pt-PT"/>
-        </w:rPr>
-      </w:pPr>
-      <w:r>
-        <w:rPr>
-          <w:rFonts w:ascii="Times New Roman" w:hAnsi="Times New Roman"/>
-          <w:b/>
-          <w:sz w:val="28"/>
-          <w:lang w:val="pt-PT"/>
-        </w:rPr>
-        <w:t>A solução foi dupla: ao detetar uma troca de utilizador (fixit-last-user-id diferente do utilizador atual), o FiX-it limpa proativamente todo o conteúdo da store snapshots do IndexedDB antes de carregar os dados do novo utilizador. Adicionalmente, a clearAllData() passou a incluir explicitamente a limpeza do IndexedDB local.</w:t>
-      </w:r>
-    </w:p>
-    <w:p>
-      <w:pPr>
-        <w:spacing w:before="200" w:after="80" w:line="360" w:lineRule="auto"/>
-        <w:outlineLvl w:val="1"/>
-        <w:rPr>
-          <w:rFonts w:ascii="Times New Roman" w:hAnsi="Times New Roman"/>
-          <w:b/>
-          <w:sz w:val="28"/>
+          <w:rFonts w:ascii="Times New Roman" w:hAnsi="Times New Roman" w:cs="Times New Roman"/>
+          <w:sz w:val="24"/>
+          <w:lang w:val="pt-PT"/>
+        </w:rPr>
+      </w:pPr>
+      <w:r>
+        <w:rPr>
+          <w:rFonts w:ascii="Times New Roman" w:hAnsi="Times New Roman" w:cs="Times New Roman"/>
+          <w:sz w:val="24"/>
+          <w:lang w:val="pt-PT"/>
+        </w:rPr>
+        <w:t>Verificou-se que os dados mostrados no computador e no telemóvel do mesmo utilizador divergiam: limpar os dados no computador e fazer upload de uma nova fotografia não se refletia no telemóvel, que continuava a mostrar o ecrã de Resultados com dados antigos. A causa principal era que a função routeAfterLogin() confiava no estado local (localStorage) antes de consultar o servidor: se o dispositivo tinha dados em cache, navegava diretamente para Resultados sem verificar se o servidor tinha entretanto apagado os scans.</w:t>
+      </w:r>
+    </w:p>
+    <w:p>
+      <w:pPr>
+        <w:rPr>
+          <w:lang w:val="pt-PT"/>
+        </w:rPr>
+      </w:pPr>
+    </w:p>
+    <w:p>
+      <w:r>
+        <w:rPr>
+          <w:noProof/>
+        </w:rPr>
+        <w:drawing>
+          <wp:inline distT="0" distB="0" distL="0" distR="0" wp14:anchorId="0174BB40" wp14:editId="04E0DD56">
+            <wp:extent cx="5972810" cy="1093470"/>
+            <wp:effectExtent l="0" t="0" r="8890" b="0"/>
+            <wp:docPr id="1614731891" name="Picture 6"/>
+            <wp:cNvGraphicFramePr>
+              <a:graphicFrameLocks xmlns:a="http://schemas.openxmlformats.org/drawingml/2006/main" noChangeAspect="1"/>
+            </wp:cNvGraphicFramePr>
+            <a:graphic xmlns:a="http://schemas.openxmlformats.org/drawingml/2006/main">
+              <a:graphicData uri="http://schemas.openxmlformats.org/drawingml/2006/picture">
+                <pic:pic xmlns:pic="http://schemas.openxmlformats.org/drawingml/2006/picture">
+                  <pic:nvPicPr>
+                    <pic:cNvPr id="0" name="Picture 20"/>
+                    <pic:cNvPicPr>
+                      <a:picLocks noChangeAspect="1" noChangeArrowheads="1"/>
+                    </pic:cNvPicPr>
+                  </pic:nvPicPr>
+                  <pic:blipFill>
+                    <a:blip r:embed="rId8">
+                      <a:extLst>
+                        <a:ext uri="{28A0092B-C50C-407E-A947-70E740481C1C}">
+                          <a14:useLocalDpi xmlns:a14="http://schemas.microsoft.com/office/drawing/2010/main" val="0"/>
+                        </a:ext>
+                      </a:extLst>
+                    </a:blip>
+                    <a:srcRect/>
+                    <a:stretch>
+                      <a:fillRect/>
+                    </a:stretch>
+                  </pic:blipFill>
+                  <pic:spPr bwMode="auto">
+                    <a:xfrm>
+                      <a:off x="0" y="0"/>
+                      <a:ext cx="5972810" cy="1093470"/>
+                    </a:xfrm>
+                    <a:prstGeom prst="rect">
+                      <a:avLst/>
+                    </a:prstGeom>
+                    <a:noFill/>
+                    <a:ln>
+                      <a:noFill/>
+                    </a:ln>
+                  </pic:spPr>
+                </pic:pic>
+              </a:graphicData>
+            </a:graphic>
+          </wp:inline>
+        </w:drawing>
+      </w:r>
+    </w:p>
+    <w:p>
+      <w:pPr>
+        <w:rPr>
           <w:lang w:val="pt-PT"/>
         </w:rPr>
       </w:pPr>
@@ -4617,140 +4250,98 @@
       <w:pPr>
         <w:pStyle w:val="Heading2"/>
         <w:rPr>
-          <w:lang w:val="pt-PT"/>
-        </w:rPr>
-      </w:pPr>
-      <w:r>
-        <w:rPr>
-          <w:lang w:val="pt-PT"/>
-        </w:rPr>
-        <w:t>4.5.5 Invalidação de Token após clearAllData()</w:t>
-      </w:r>
-    </w:p>
-    <w:p>
-      <w:pPr>
-        <w:spacing w:before="200" w:after="80" w:line="360" w:lineRule="auto"/>
-        <w:outlineLvl w:val="1"/>
-        <w:rPr>
-          <w:rFonts w:ascii="Times New Roman" w:hAnsi="Times New Roman"/>
-          <w:b/>
-          <w:sz w:val="28"/>
-          <w:lang w:val="pt-PT"/>
-        </w:rPr>
-      </w:pPr>
-    </w:p>
-    <w:p>
-      <w:pPr>
-        <w:spacing w:before="200" w:after="80" w:line="360" w:lineRule="auto"/>
-        <w:outlineLvl w:val="1"/>
-        <w:rPr>
-          <w:rFonts w:ascii="Times New Roman" w:hAnsi="Times New Roman"/>
-          <w:b/>
-          <w:sz w:val="28"/>
-          <w:lang w:val="pt-PT"/>
-        </w:rPr>
-      </w:pPr>
-      <w:r>
-        <w:rPr>
-          <w:rFonts w:ascii="Times New Roman" w:hAnsi="Times New Roman"/>
-          <w:b/>
-          <w:sz w:val="28"/>
-          <w:lang w:val="pt-PT"/>
-        </w:rPr>
-        <w:t>Um bug subtil mas crítico foi descoberto durante os testes de sincronização: ao executar "Limpar Todos os Dados" na conta, o utilizador era mantido autenticado no frontend (o token JWT continuava válido no browser), mas as chamadas seguintes à API falhavam silenciosamente sem mensagem de erro visível.</w:t>
-      </w:r>
-    </w:p>
-    <w:p>
-      <w:pPr>
-        <w:spacing w:before="200" w:after="80" w:line="360" w:lineRule="auto"/>
-        <w:outlineLvl w:val="1"/>
-        <w:rPr>
-          <w:rFonts w:ascii="Times New Roman" w:hAnsi="Times New Roman"/>
-          <w:b/>
-          <w:sz w:val="28"/>
-          <w:lang w:val="pt-PT"/>
-        </w:rPr>
-      </w:pPr>
-    </w:p>
-    <w:p>
-      <w:pPr>
-        <w:spacing w:before="200" w:after="80" w:line="360" w:lineRule="auto"/>
-        <w:outlineLvl w:val="1"/>
-        <w:rPr>
-          <w:rFonts w:ascii="Times New Roman" w:hAnsi="Times New Roman"/>
-          <w:b/>
-          <w:sz w:val="28"/>
-          <w:lang w:val="pt-PT"/>
-        </w:rPr>
-      </w:pPr>
-      <w:r>
-        <w:rPr>
-          <w:rFonts w:ascii="Times New Roman" w:hAnsi="Times New Roman"/>
-          <w:b/>
-          <w:sz w:val="28"/>
-          <w:lang w:val="pt-PT"/>
-        </w:rPr>
-        <w:t>O diagnóstico revelou que a função clearAllData() no backend eliminava também a tabela user_sessions, que contém os tokens de sessão válidos. Ao apagar a sessão ativa, o token JWT que o frontend tinha guardado em localStorage tornava-se inválido (o servidor rejeitava-o por não encontrar a sessão correspondente), mas o frontend não recebia um erro 401 explícito porque a sincronização pós-clear era ignorada na fila de pedidos assíncrona.</w:t>
-      </w:r>
-    </w:p>
-    <w:p>
-      <w:pPr>
-        <w:spacing w:before="200" w:after="80" w:line="360" w:lineRule="auto"/>
-        <w:outlineLvl w:val="1"/>
-        <w:rPr>
-          <w:rFonts w:ascii="Times New Roman" w:hAnsi="Times New Roman"/>
-          <w:b/>
-          <w:sz w:val="28"/>
-          <w:lang w:val="pt-PT"/>
-        </w:rPr>
-      </w:pPr>
-    </w:p>
-    <w:p>
-      <w:pPr>
-        <w:spacing w:before="200" w:after="80" w:line="360" w:lineRule="auto"/>
-        <w:outlineLvl w:val="1"/>
-        <w:rPr>
-          <w:rFonts w:ascii="Times New Roman" w:hAnsi="Times New Roman"/>
-          <w:b/>
-          <w:sz w:val="28"/>
-          <w:lang w:val="pt-PT"/>
-        </w:rPr>
-      </w:pPr>
-      <w:r>
-        <w:rPr>
-          <w:rFonts w:ascii="Times New Roman" w:hAnsi="Times New Roman"/>
-          <w:b/>
-          <w:sz w:val="28"/>
-          <w:lang w:val="pt-PT"/>
-        </w:rPr>
-        <w:t>A solução foi remover user_sessions da lista de tabelas eliminadas pela clearAllData(): a sessão ativa do dispositivo que solicitou a limpeza deve ser preservada para que o utilizador continue autenticado e possa fazer upload de novos dados imediatamente após o clear.</w:t>
-      </w:r>
-    </w:p>
-    <w:p>
-      <w:pPr>
-        <w:spacing w:before="200" w:after="80" w:line="360" w:lineRule="auto"/>
-        <w:outlineLvl w:val="1"/>
-        <w:rPr>
-          <w:rFonts w:ascii="Times New Roman" w:hAnsi="Times New Roman"/>
-          <w:b/>
-          <w:sz w:val="28"/>
-          <w:lang w:val="pt-PT"/>
-        </w:rPr>
-      </w:pPr>
-    </w:p>
-    <w:p>
-      <w:pPr>
-        <w:spacing w:before="200" w:after="80" w:line="360" w:lineRule="auto"/>
-        <w:outlineLvl w:val="1"/>
-        <w:rPr>
-          <w:lang w:val="pt-PT"/>
-        </w:rPr>
-      </w:pPr>
-      <w:r>
-        <w:rPr>
-          <w:rFonts w:ascii="Times New Roman" w:hAnsi="Times New Roman"/>
-          <w:b/>
-          <w:sz w:val="28"/>
+          <w:rFonts w:ascii="Times New Roman" w:hAnsi="Times New Roman" w:cs="Times New Roman"/>
+          <w:sz w:val="24"/>
+          <w:lang w:val="pt-PT"/>
+        </w:rPr>
+      </w:pPr>
+      <w:r>
+        <w:rPr>
+          <w:rFonts w:ascii="Times New Roman" w:hAnsi="Times New Roman" w:cs="Times New Roman"/>
+          <w:sz w:val="24"/>
+          <w:lang w:val="pt-PT"/>
+        </w:rPr>
+        <w:t>A solução foi reestruturar a routeAfterLogin() para consultar sempre o servidor em primeiro lugar: se o servidor não tem análises para o utilizador, o estado local é ignorado e a aplicação navega para o ecrã de Upload; se o servidor tem análises, a data da análise mais recente é comparada com a data da sessão local, prevalecendo sempre a mais recente.</w:t>
+      </w:r>
+    </w:p>
+    <w:p>
+      <w:pPr>
+        <w:rPr>
+          <w:lang w:val="pt-PT"/>
+        </w:rPr>
+      </w:pPr>
+    </w:p>
+    <w:p>
+      <w:r>
+        <w:rPr>
+          <w:noProof/>
+        </w:rPr>
+        <w:drawing>
+          <wp:inline distT="0" distB="0" distL="0" distR="0" wp14:anchorId="2B6A14F7" wp14:editId="15BA558A">
+            <wp:extent cx="5972810" cy="5920740"/>
+            <wp:effectExtent l="0" t="0" r="8890" b="3810"/>
+            <wp:docPr id="811892389" name="Picture 8"/>
+            <wp:cNvGraphicFramePr>
+              <a:graphicFrameLocks xmlns:a="http://schemas.openxmlformats.org/drawingml/2006/main" noChangeAspect="1"/>
+            </wp:cNvGraphicFramePr>
+            <a:graphic xmlns:a="http://schemas.openxmlformats.org/drawingml/2006/main">
+              <a:graphicData uri="http://schemas.openxmlformats.org/drawingml/2006/picture">
+                <pic:pic xmlns:pic="http://schemas.openxmlformats.org/drawingml/2006/picture">
+                  <pic:nvPicPr>
+                    <pic:cNvPr id="0" name="Picture 27"/>
+                    <pic:cNvPicPr>
+                      <a:picLocks noChangeAspect="1" noChangeArrowheads="1"/>
+                    </pic:cNvPicPr>
+                  </pic:nvPicPr>
+                  <pic:blipFill>
+                    <a:blip r:embed="rId9">
+                      <a:extLst>
+                        <a:ext uri="{28A0092B-C50C-407E-A947-70E740481C1C}">
+                          <a14:useLocalDpi xmlns:a14="http://schemas.microsoft.com/office/drawing/2010/main" val="0"/>
+                        </a:ext>
+                      </a:extLst>
+                    </a:blip>
+                    <a:srcRect/>
+                    <a:stretch>
+                      <a:fillRect/>
+                    </a:stretch>
+                  </pic:blipFill>
+                  <pic:spPr bwMode="auto">
+                    <a:xfrm>
+                      <a:off x="0" y="0"/>
+                      <a:ext cx="5972810" cy="5920740"/>
+                    </a:xfrm>
+                    <a:prstGeom prst="rect">
+                      <a:avLst/>
+                    </a:prstGeom>
+                    <a:noFill/>
+                    <a:ln>
+                      <a:noFill/>
+                    </a:ln>
+                  </pic:spPr>
+                </pic:pic>
+              </a:graphicData>
+            </a:graphic>
+          </wp:inline>
+        </w:drawing>
+      </w:r>
+    </w:p>
+    <w:p>
+      <w:pPr>
+        <w:rPr>
+          <w:lang w:val="pt-PT"/>
+        </w:rPr>
+      </w:pPr>
+    </w:p>
+    <w:p>
+      <w:pPr>
+        <w:pStyle w:val="Heading2"/>
+        <w:rPr>
+          <w:lang w:val="pt-PT"/>
+        </w:rPr>
+      </w:pPr>
+      <w:r>
+        <w:rPr>
           <w:lang w:val="pt-PT"/>
         </w:rPr>
         <w:t>4.6 Limitações</w:t>
@@ -5055,16 +4646,18 @@
         <w:outlineLvl w:val="0"/>
         <w:rPr>
           <w:rFonts w:ascii="Times New Roman" w:hAnsi="Times New Roman"/>
-          <w:b/>
-          <w:sz w:val="32"/>
-          <w:lang w:val="pt-PT"/>
-        </w:rPr>
-      </w:pPr>
-      <w:r>
-        <w:rPr>
-          <w:rFonts w:ascii="Times New Roman" w:hAnsi="Times New Roman"/>
-          <w:b/>
-          <w:sz w:val="32"/>
+          <w:bCs/>
+          <w:sz w:val="24"/>
+          <w:szCs w:val="24"/>
+          <w:lang w:val="pt-PT"/>
+        </w:rPr>
+      </w:pPr>
+      <w:r>
+        <w:rPr>
+          <w:rFonts w:ascii="Times New Roman" w:hAnsi="Times New Roman"/>
+          <w:bCs/>
+          <w:sz w:val="24"/>
+          <w:szCs w:val="24"/>
           <w:lang w:val="pt-PT"/>
         </w:rPr>
         <w:t xml:space="preserve">O FiX-it demonstrou que é possível desenvolver uma aplicação web progressiva de análise de composição corporal assistida por inteligência artificial que seja simultaneamente gratuita, privada, multiplataforma e funcionalmente comparável às soluções comerciais existentes. A execução client-side dos modelos de machine learning — MediaPipe Pose, BodyPix e MobileNet via TensorFlow.js — eliminou a necessidade de envio de dados biométricos para servidores externos, materializando o princípio de privacy by design preconizado por Ayala-Rivera et al. </w:t>
@@ -5072,16 +4665,18 @@
       <w:r>
         <w:rPr>
           <w:rFonts w:ascii="Times New Roman" w:hAnsi="Times New Roman"/>
-          <w:b/>
-          <w:sz w:val="32"/>
+          <w:bCs/>
+          <w:sz w:val="24"/>
+          <w:szCs w:val="24"/>
         </w:rPr>
         <w:t xml:space="preserve">(2024) sem sacrificar a riqueza funcional da aplicação. </w:t>
       </w:r>
       <w:r>
         <w:rPr>
           <w:rFonts w:ascii="Times New Roman" w:hAnsi="Times New Roman"/>
-          <w:b/>
-          <w:sz w:val="32"/>
+          <w:bCs/>
+          <w:sz w:val="24"/>
+          <w:szCs w:val="24"/>
           <w:lang w:val="pt-PT"/>
         </w:rPr>
         <w:t>O backend em Node.js/Express com PostgreSQL expõe 58 endpoints REST organizados em sete domínios funcionais, com autenticação JWT de dois tokens, sincronização multi-dispositivo em tempo real e conformidade RGPD por design.</w:t>
@@ -5093,8 +4688,9 @@
         <w:outlineLvl w:val="0"/>
         <w:rPr>
           <w:rFonts w:ascii="Times New Roman" w:hAnsi="Times New Roman"/>
-          <w:b/>
-          <w:sz w:val="32"/>
+          <w:bCs/>
+          <w:sz w:val="24"/>
+          <w:szCs w:val="24"/>
           <w:lang w:val="pt-PT"/>
         </w:rPr>
       </w:pPr>
@@ -5105,16 +4701,18 @@
         <w:outlineLvl w:val="0"/>
         <w:rPr>
           <w:rFonts w:ascii="Times New Roman" w:hAnsi="Times New Roman"/>
-          <w:b/>
-          <w:sz w:val="32"/>
-          <w:lang w:val="pt-PT"/>
-        </w:rPr>
-      </w:pPr>
-      <w:r>
-        <w:rPr>
-          <w:rFonts w:ascii="Times New Roman" w:hAnsi="Times New Roman"/>
-          <w:b/>
-          <w:sz w:val="32"/>
+          <w:bCs/>
+          <w:sz w:val="24"/>
+          <w:szCs w:val="24"/>
+          <w:lang w:val="pt-PT"/>
+        </w:rPr>
+      </w:pPr>
+      <w:r>
+        <w:rPr>
+          <w:rFonts w:ascii="Times New Roman" w:hAnsi="Times New Roman"/>
+          <w:bCs/>
+          <w:sz w:val="24"/>
+          <w:szCs w:val="24"/>
           <w:lang w:val="pt-PT"/>
         </w:rPr>
         <w:t>Do ponto de vista técnico, o projeto acrescentou à literatura académica um caso de estudo concreto sobre a integração de modelos de IA no browser com uma arquitetura REST escalável em contexto de projeto académico individual com prazo fixo. A confirmação empírica das limitações do MediaPipe Pose em poses de perfil e com oclusão parcial — identificadas por Dill et al. (2023) — contribui para um domínio de investigação ainda escasso em validações práticas. A arquitetura privacy-first confirmou a tese de Ayala-Rivera et al. (2024) de que o privacy by design não implica compromisso na funcionalidade: todas as análises corporais são processadas localmente no dispositivo do utilizador, sem envio de imagens para servidores externos.</w:t>
@@ -5126,8 +4724,9 @@
         <w:outlineLvl w:val="0"/>
         <w:rPr>
           <w:rFonts w:ascii="Times New Roman" w:hAnsi="Times New Roman"/>
-          <w:b/>
-          <w:sz w:val="32"/>
+          <w:bCs/>
+          <w:sz w:val="24"/>
+          <w:szCs w:val="24"/>
           <w:lang w:val="pt-PT"/>
         </w:rPr>
       </w:pPr>
@@ -5138,16 +4737,18 @@
         <w:outlineLvl w:val="0"/>
         <w:rPr>
           <w:rFonts w:ascii="Times New Roman" w:hAnsi="Times New Roman"/>
-          <w:b/>
-          <w:sz w:val="32"/>
-          <w:lang w:val="pt-PT"/>
-        </w:rPr>
-      </w:pPr>
-      <w:r>
-        <w:rPr>
-          <w:rFonts w:ascii="Times New Roman" w:hAnsi="Times New Roman"/>
-          <w:b/>
-          <w:sz w:val="32"/>
+          <w:bCs/>
+          <w:sz w:val="24"/>
+          <w:szCs w:val="24"/>
+          <w:lang w:val="pt-PT"/>
+        </w:rPr>
+      </w:pPr>
+      <w:r>
+        <w:rPr>
+          <w:rFonts w:ascii="Times New Roman" w:hAnsi="Times New Roman"/>
+          <w:bCs/>
+          <w:sz w:val="24"/>
+          <w:szCs w:val="24"/>
           <w:lang w:val="pt-PT"/>
         </w:rPr>
         <w:t>As cinco questões de investigação obtiveram respostas sustentadas empiricamente: a arquitetura de três camadas com camada de IA client-side (Q1) demonstrou-se adequada para separar responsabilidades de processamento e persistência; os requisitos de privacidade na inferência e de explicabilidade das estimativas (Q2) revelaram-se determinantes para a aceitação pelos utilizadores-piloto; a metodologia ágil adaptada ao contexto individual (Q3) confirmou as conclusões de Sassa et al. (2023) e Mishra e Alzoubi (2023); as tecnologias selecionadas — MediaPipe Pose, TensorFlow.js e PostgreSQL 18 — (Q4) mostraram-se adequadas dentro das limitações documentadas; e a implementação das heurísticas de Galavi et al. (2024) e dos critérios WCAG 2.2 de Kirkpatrick et al. (2023) (Q5) resultou numa pontuação de acessibilidade de 94/100.</w:t>
@@ -5159,8 +4760,9 @@
         <w:outlineLvl w:val="0"/>
         <w:rPr>
           <w:rFonts w:ascii="Times New Roman" w:hAnsi="Times New Roman"/>
-          <w:b/>
-          <w:sz w:val="32"/>
+          <w:bCs/>
+          <w:sz w:val="24"/>
+          <w:szCs w:val="24"/>
           <w:lang w:val="pt-PT"/>
         </w:rPr>
       </w:pPr>
@@ -5171,16 +4773,18 @@
         <w:outlineLvl w:val="0"/>
         <w:rPr>
           <w:rFonts w:ascii="Times New Roman" w:hAnsi="Times New Roman"/>
-          <w:b/>
-          <w:sz w:val="32"/>
-          <w:lang w:val="pt-PT"/>
-        </w:rPr>
-      </w:pPr>
-      <w:r>
-        <w:rPr>
-          <w:rFonts w:ascii="Times New Roman" w:hAnsi="Times New Roman"/>
-          <w:b/>
-          <w:sz w:val="32"/>
+          <w:bCs/>
+          <w:sz w:val="24"/>
+          <w:szCs w:val="24"/>
+          <w:lang w:val="pt-PT"/>
+        </w:rPr>
+      </w:pPr>
+      <w:r>
+        <w:rPr>
+          <w:rFonts w:ascii="Times New Roman" w:hAnsi="Times New Roman"/>
+          <w:bCs/>
+          <w:sz w:val="24"/>
+          <w:szCs w:val="24"/>
           <w:lang w:val="pt-PT"/>
         </w:rPr>
         <w:t xml:space="preserve">A principal limitação da análise 2D baseada em marcos esqueléticos — a incapacidade de estimar massa corporal com a precisão dos métodos clínicos de referência (DEXA, bioimpedância) — é inerente à abordagem e não superável sem a adição de sensores de profundidade ou modelos de reconstrução 3D, como o demonstrado por Qiao et al. </w:t>
@@ -5188,16 +4792,18 @@
       <w:r>
         <w:rPr>
           <w:rFonts w:ascii="Times New Roman" w:hAnsi="Times New Roman"/>
-          <w:b/>
-          <w:sz w:val="32"/>
+          <w:bCs/>
+          <w:sz w:val="24"/>
+          <w:szCs w:val="24"/>
         </w:rPr>
         <w:t xml:space="preserve">(2024, r &gt; 0,84 com medições DEXA). </w:t>
       </w:r>
       <w:r>
         <w:rPr>
           <w:rFonts w:ascii="Times New Roman" w:hAnsi="Times New Roman"/>
-          <w:b/>
-          <w:sz w:val="32"/>
+          <w:bCs/>
+          <w:sz w:val="24"/>
+          <w:szCs w:val="24"/>
           <w:lang w:val="pt-PT"/>
         </w:rPr>
         <w:t>Esta limitação é explicitamente comunicada ao utilizador através de disclaimers e intervalos de confiança, posicionando o FiX-it como uma ferramenta motivacional de apoio ao bem-estar e não como um dispositivo médico de diagnóstico.</w:t>
@@ -5209,8 +4815,9 @@
         <w:outlineLvl w:val="0"/>
         <w:rPr>
           <w:rFonts w:ascii="Times New Roman" w:hAnsi="Times New Roman"/>
-          <w:b/>
-          <w:sz w:val="32"/>
+          <w:bCs/>
+          <w:sz w:val="24"/>
+          <w:szCs w:val="24"/>
           <w:lang w:val="pt-PT"/>
         </w:rPr>
       </w:pPr>
@@ -5221,16 +4828,18 @@
         <w:outlineLvl w:val="0"/>
         <w:rPr>
           <w:rFonts w:ascii="Times New Roman" w:hAnsi="Times New Roman"/>
-          <w:b/>
-          <w:sz w:val="32"/>
-          <w:lang w:val="pt-PT"/>
-        </w:rPr>
-      </w:pPr>
-      <w:r>
-        <w:rPr>
-          <w:rFonts w:ascii="Times New Roman" w:hAnsi="Times New Roman"/>
-          <w:b/>
-          <w:sz w:val="32"/>
+          <w:bCs/>
+          <w:sz w:val="24"/>
+          <w:szCs w:val="24"/>
+          <w:lang w:val="pt-PT"/>
+        </w:rPr>
+      </w:pPr>
+      <w:r>
+        <w:rPr>
+          <w:rFonts w:ascii="Times New Roman" w:hAnsi="Times New Roman"/>
+          <w:bCs/>
+          <w:sz w:val="24"/>
+          <w:szCs w:val="24"/>
           <w:lang w:val="pt-PT"/>
         </w:rPr>
         <w:t>Em síntese, a combinação de Progressive Web Apps, machine learning no browser e arquitetura REST com privacy by design permitiu construir uma solução de fitness digital com valor real para os utilizadores dentro das restrições de tempo e recursos de um projeto académico individual — respondendo afirmativamente à hipótese central formulada na Introdução. Se este projeto tivesse de ser refeito, a principal alteração metodológica seria a condução de um estudo de usabilidade formal com utilizadores reais desde fases mais precoces do desenvolvimento, de forma a validar as decisões de design com evidência empírica direta e não apenas bibliográfica. O trabalho futuro deverá priorizar a expansão da base nutricional via API Open Food Facts, a exploração de um modelo de linguagem de pequena dimensão executável no browser para o coach virtual, e a condução de um estudo longitudinal que permita avaliar o impacto real do sistema de gamificação na adesão continuada aos hábitos saudáveis.</w:t>

</xml_diff>

<commit_message>
docs: strengthen Resultados chapter per Prof. Mourato instructions
Added opening paragraph before 4.1 with general objective and all 5 specific outcomes.
Replaced 4.7 Discussao (5 sentences to 5 paragraphs): significance claim, literature connections,
comparison with commercial apps, unexpected sync finding with architectural implications.
Replaced 4.11 Consideracoes Finais: 3-dimension significance, if-I-were-to-start-again reflection,
and implications for future projects.

Co-Authored-By: Claude Sonnet 4.6 <noreply@anthropic.com>
</commit_message>
<xml_diff>
--- a/Relatório PA_FiX-it.docx
+++ b/Relatório PA_FiX-it.docx
@@ -1696,7 +1696,16 @@
           <w:sz w:val="24"/>
           <w:lang w:val="pt-PT"/>
         </w:rPr>
-        <w:t>A literatura científica documentou progressos significativos na estimação de composição corporal por câmara. Qiao et al. (2024, p. 5) demonstraram que a reconstrução 3D da forma corporal a partir de fotografias de smartphone permitiu estimar massa gorda e massa isenta de gordura com correlações superiores a r = 0,84 relativamente a medições DEXA de referência, numa coorte validada de 12 435 adultos. Contudo, esta abordagem exigiu processamento computacional intensivo incompatível com execução no browser, o que situou o FiX-it numa posição de compromisso consciente entre precisão e privacidade.</w:t>
+        <w:t xml:space="preserve">A literatura científica documentou progressos significativos na estimação de composição corporal por câmara. Qiao et al. (2024, p. 5) demonstraram que a reconstrução 3D da forma corporal a partir de fotografias de smartphone permitiu estimar massa gorda e massa isenta de gordura com correlações superiores a r = 0,84 relativamente a medições DEXA de referência, numa coorte validada de 12 435 adultos. Contudo, esta abordagem exigiu processamento </w:t>
+      </w:r>
+      <w:r>
+        <w:rPr>
+          <w:rFonts w:ascii="Times New Roman" w:hAnsi="Times New Roman" w:cs="Times New Roman"/>
+          <w:sz w:val="24"/>
+          <w:lang w:val="pt-PT"/>
+        </w:rPr>
+        <w:lastRenderedPageBreak/>
+        <w:t>computacional intensivo incompatível com execução no browser, o que situou o FiX-it numa posição de compromisso consciente entre precisão e privacidade.</w:t>
       </w:r>
     </w:p>
     <w:p>
@@ -1801,7 +1810,16 @@
           <w:sz w:val="24"/>
           <w:lang w:val="pt-PT"/>
         </w:rPr>
-        <w:t>A definição dos requisitos do FiX-it exigiu uma abordagem que combinou as técnicas de engenharia de requisitos ágil com os imperativos regulatórios da proteção de dados. Hoy e Xu (2023, p. 8) identificaram os principais desafios da elicitação de requisitos em contexto ágil — volatilidade dos requisitos, lacunas de comunicação e rastreabilidade insuficiente — e propuseram um quadro conceptual de soluções adaptadas a cada categoria, que foi incorporado no processo iterativo de especificação do FiX-it. Ahmad et al. (2023, Sec. 4.4) complementaram esta perspetiva com o mapeamento dos requisitos não funcionais específicos de sistemas de IA: precisão e robustez dos modelos, privacidade dos dados processados na inferência, explicabilidade das predições e conformidade ética. No FiX-it, estes requisitos traduziram-se na execução local dos modelos sem envio de imagens para servidores externos, na camada de explicabilidade nos resultados e nos disclaimers de natureza não clínica.</w:t>
+        <w:t xml:space="preserve">A definição dos requisitos do FiX-it exigiu uma abordagem que combinou as técnicas de engenharia de requisitos ágil com os imperativos regulatórios da proteção de dados. Hoy e Xu (2023, p. 8) identificaram os principais desafios da elicitação de requisitos em contexto ágil — </w:t>
+      </w:r>
+      <w:r>
+        <w:rPr>
+          <w:rFonts w:ascii="Times New Roman" w:hAnsi="Times New Roman" w:cs="Times New Roman"/>
+          <w:sz w:val="24"/>
+          <w:lang w:val="pt-PT"/>
+        </w:rPr>
+        <w:lastRenderedPageBreak/>
+        <w:t>volatilidade dos requisitos, lacunas de comunicação e rastreabilidade insuficiente — e propuseram um quadro conceptual de soluções adaptadas a cada categoria, que foi incorporado no processo iterativo de especificação do FiX-it. Ahmad et al. (2023, Sec. 4.4) complementaram esta perspetiva com o mapeamento dos requisitos não funcionais específicos de sistemas de IA: precisão e robustez dos modelos, privacidade dos dados processados na inferência, explicabilidade das predições e conformidade ética. No FiX-it, estes requisitos traduziram-se na execução local dos modelos sem envio de imagens para servidores externos, na camada de explicabilidade nos resultados e nos disclaimers de natureza não clínica.</w:t>
       </w:r>
     </w:p>
     <w:p>
@@ -1885,7 +1903,16 @@
           <w:sz w:val="24"/>
           <w:lang w:val="pt-PT"/>
         </w:rPr>
-        <w:t>Hoy e Xu (2023, p. 8) acrescentaram que a integração de sprint reviews com demonstração funcional ao stakeholder reduziu a divergência entre requisitos especificados e produto implementado — prática incorporada nas revisões periódicas com o orientador. O quadro Scrum foi adaptado ao contexto de projeto individual: o aluno assumiu simultaneamente os papéis de Product Owner e Developer, com sprints de duas semanas e revisões periódicas com o orientador no papel de stakeholder. O backlog foi priorizado por valor e atualizado iterativamente em resposta ao feedback das revisões, incorporando as práticas de integração de ciclos de revisão de requisitos documentadas por Hoy e Xu (2023).</w:t>
+        <w:t xml:space="preserve">Hoy e Xu (2023, p. 8) acrescentaram que a integração de sprint reviews com demonstração funcional ao stakeholder reduziu a divergência entre requisitos especificados e produto implementado — prática incorporada nas revisões periódicas com o orientador. O quadro </w:t>
+      </w:r>
+      <w:r>
+        <w:rPr>
+          <w:rFonts w:ascii="Times New Roman" w:hAnsi="Times New Roman" w:cs="Times New Roman"/>
+          <w:sz w:val="24"/>
+          <w:lang w:val="pt-PT"/>
+        </w:rPr>
+        <w:lastRenderedPageBreak/>
+        <w:t>Scrum foi adaptado ao contexto de projeto individual: o aluno assumiu simultaneamente os papéis de Product Owner e Developer, com sprints de duas semanas e revisões periódicas com o orientador no papel de stakeholder. O backlog foi priorizado por valor e atualizado iterativamente em resposta ao feedback das revisões, incorporando as práticas de integração de ciclos de revisão de requisitos documentadas por Hoy e Xu (2023).</w:t>
       </w:r>
     </w:p>
     <w:p>
@@ -1990,7 +2017,16 @@
           <w:sz w:val="24"/>
           <w:lang w:val="pt-PT"/>
         </w:rPr>
-        <w:t>A dimensão humana do FiX-it foi enquadrada por três referências complementares. Galavi et al. (2024, Results, para. 1) identificaram, numa revisão sistemática de avaliações de aplicações móveis de saúde, que a visibilidade do estado do sistema, o controlo do utilizador e a prevenção de erros figuraram entre as heurísticas de usabilidade mais frequentemente aplicadas — orientando decisões como o indicador de progresso durante a análise de IA, o botão de cancelamento em operações longas e a validação em tempo real nos formulários. Kirkpatrick et al. (2023) editaram as WCAG 2.2, introduzindo novos critérios para autenticação acessível, foco visível e interações por arrastamento, constituindo o referencial normativo atual para conformidade AA. A auditoria do FiX-it verificou contraste mínimo 4,5:1, navegabilidade por teclado, atributos ARIA em regiões dinâmicas e ausência de CAPTCHA no fluxo de autenticação.</w:t>
+        <w:t xml:space="preserve">A dimensão humana do FiX-it foi enquadrada por três referências complementares. Galavi et al. (2024, Results, para. 1) identificaram, numa revisão sistemática de avaliações de aplicações móveis de saúde, que a visibilidade do estado do sistema, o controlo do utilizador e a prevenção de erros figuraram entre as heurísticas de usabilidade mais frequentemente aplicadas — orientando decisões como o indicador de progresso durante a análise de IA, o botão de cancelamento em operações longas e a validação em tempo real nos formulários. Kirkpatrick et </w:t>
+      </w:r>
+      <w:r>
+        <w:rPr>
+          <w:rFonts w:ascii="Times New Roman" w:hAnsi="Times New Roman" w:cs="Times New Roman"/>
+          <w:sz w:val="24"/>
+          <w:lang w:val="pt-PT"/>
+        </w:rPr>
+        <w:lastRenderedPageBreak/>
+        <w:t>al. (2023) editaram as WCAG 2.2, introduzindo novos critérios para autenticação acessível, foco visível e interações por arrastamento, constituindo o referencial normativo atual para conformidade AA. A auditoria do FiX-it verificou contraste mínimo 4,5:1, navegabilidade por teclado, atributos ARIA em regiões dinâmicas e ausência de CAPTCHA no fluxo de autenticação.</w:t>
       </w:r>
     </w:p>
     <w:p>
@@ -2086,7 +2122,16 @@
           <w:sz w:val="24"/>
           <w:lang w:val="pt-PT"/>
         </w:rPr>
-        <w:t>O projeto FiX-it enquadra-se no paradigma da investigação orientada ao design (design-based research), no qual o artefacto digital constitui simultaneamente o objeto de estudo e o instrumento de validação das hipóteses de investigação. Este paradigma é particularmente adequado ao contexto de projetos académicos em tecnologias de informação e comunicação, onde o desenvolvimento do protótipo e a investigação teórica se alimentam mutuamente ao longo de ciclos iterativos de conceção, implementação e avaliação.</w:t>
+        <w:t xml:space="preserve">O projeto FiX-it enquadra-se no paradigma da investigação orientada ao design (design-based research), no qual o artefacto digital constitui simultaneamente o objeto de estudo e o instrumento de validação das hipóteses de investigação. Este paradigma é particularmente adequado ao contexto de projetos académicos em tecnologias de informação e comunicação, </w:t>
+      </w:r>
+      <w:r>
+        <w:rPr>
+          <w:rFonts w:ascii="Times New Roman" w:hAnsi="Times New Roman"/>
+          <w:sz w:val="24"/>
+          <w:lang w:val="pt-PT"/>
+        </w:rPr>
+        <w:lastRenderedPageBreak/>
+        <w:t>onde o desenvolvimento do protótipo e a investigação teórica se alimentam mutuamente ao longo de ciclos iterativos de conceção, implementação e avaliação.</w:t>
       </w:r>
     </w:p>
     <w:p>
@@ -2158,16 +2203,7 @@
           <w:sz w:val="24"/>
           <w:lang w:val="pt-PT"/>
         </w:rPr>
-        <w:t xml:space="preserve">O quadro Scrum foi adaptado ao contexto de projeto individual: o aluno assumiu simultaneamente os papéis de Product Owner e Developer, com sprints de duas semanas e revisões periódicas com o orientador no papel de stakeholder. O backlog foi priorizado por valor </w:t>
-      </w:r>
-      <w:r>
-        <w:rPr>
-          <w:rFonts w:ascii="Times New Roman" w:hAnsi="Times New Roman"/>
-          <w:sz w:val="24"/>
-          <w:lang w:val="pt-PT"/>
-        </w:rPr>
-        <w:lastRenderedPageBreak/>
-        <w:t>e atualizado iterativamente em resposta ao feedback das revisões, incorporando as práticas de integração de ciclos de revisão de requisitos documentadas por Hoy e Xu (2023, p. 5).</w:t>
+        <w:t>O quadro Scrum foi adaptado ao contexto de projeto individual: o aluno assumiu simultaneamente os papéis de Product Owner e Developer, com sprints de duas semanas e revisões periódicas com o orientador no papel de stakeholder. O backlog foi priorizado por valor e atualizado iterativamente em resposta ao feedback das revisões, incorporando as práticas de integração de ciclos de revisão de requisitos documentadas por Hoy e Xu (2023, p. 5).</w:t>
       </w:r>
     </w:p>
     <w:p>
@@ -2221,6 +2257,7 @@
           <w:sz w:val="24"/>
           <w:lang w:val="pt-PT"/>
         </w:rPr>
+        <w:lastRenderedPageBreak/>
         <w:t>A camada de inteligência artificial client-side recorreu a quatro bibliotecas: MediaPipe Pose v0.5 para deteção de 33 marcos esqueléticos (Kim et al., 2023, p. 13; Dill et al., 2023, p. 565), BodyPix v2.2 para segmentação corporal, MobileNet v2.1 para reconhecimento de alimentos, e TensorFlow.js v3.21 como runtime de execução no browser. O backend foi construído com Node.js v20 LTS e o framework Express.js. A persistência de dados foi assegurada por PostgreSQL 18 (PostgreSQL Global Development Group, 2026, Cap. 5) com 21 tabelas e 16 índices, complementada por cache Redis e armazenamento cloud Cloudinary.</w:t>
       </w:r>
     </w:p>
@@ -2371,7 +2408,6 @@
                 <w:color w:val="FFFFFF"/>
                 <w:sz w:val="20"/>
               </w:rPr>
-              <w:lastRenderedPageBreak/>
               <w:t>Etapa</w:t>
             </w:r>
           </w:p>
@@ -2867,7 +2903,16 @@
                 <w:sz w:val="20"/>
                 <w:lang w:val="pt-PT"/>
               </w:rPr>
-              <w:t>Integração frontend-backend, painel de admin, restauro de sessão e upload Cloudinary</w:t>
+              <w:t xml:space="preserve">Integração frontend-backend, painel de admin, restauro de </w:t>
+            </w:r>
+            <w:r>
+              <w:rPr>
+                <w:rFonts w:ascii="Times New Roman" w:hAnsi="Times New Roman"/>
+                <w:sz w:val="20"/>
+                <w:lang w:val="pt-PT"/>
+              </w:rPr>
+              <w:lastRenderedPageBreak/>
+              <w:t>sessão e upload Cloudinary</w:t>
             </w:r>
           </w:p>
         </w:tc>
@@ -2885,6 +2930,7 @@
                 <w:rFonts w:ascii="Times New Roman" w:hAnsi="Times New Roman"/>
                 <w:sz w:val="20"/>
               </w:rPr>
+              <w:lastRenderedPageBreak/>
               <w:t>Mar.–Abr. 2026</w:t>
             </w:r>
           </w:p>
@@ -3150,7 +3196,16 @@
           <w:sz w:val="24"/>
           <w:lang w:val="pt-PT"/>
         </w:rPr>
-        <w:t>O sistema de design do FiX-it foi construído em torno de um tema escuro com estética de estúdio fitness premium, definido através de CSS custom properties. A paleta de cores estabelece quatro variáveis semânticas: --bg-primary (#141211) para o fundo, --accent-primary (#c9a962) para o dourado champanhe, --accent-warm (#b87351) para o terracotta e --accent-success (#7d9a78) para o verde salva. A tipografia utiliza a fonte Plus Jakarta Sans em seis pesos distintos para hierarquia visual clara.</w:t>
+        <w:t xml:space="preserve">O sistema de design do FiX-it foi construído em torno de um tema escuro com estética de estúdio fitness premium, definido através de CSS custom properties. A paleta de cores estabelece quatro variáveis semânticas: --bg-primary (#141211) para o fundo, --accent-primary (#c9a962) para o dourado champanhe, --accent-warm (#b87351) para o terracotta e --accent-success </w:t>
+      </w:r>
+      <w:r>
+        <w:rPr>
+          <w:rFonts w:ascii="Times New Roman" w:hAnsi="Times New Roman"/>
+          <w:sz w:val="24"/>
+          <w:lang w:val="pt-PT"/>
+        </w:rPr>
+        <w:lastRenderedPageBreak/>
+        <w:t>(#7d9a78) para o verde salva. A tipografia utiliza a fonte Plus Jakarta Sans em seis pesos distintos para hierarquia visual clara.</w:t>
       </w:r>
     </w:p>
     <w:p>
@@ -3308,7 +3363,16 @@
           <w:sz w:val="24"/>
           <w:lang w:val="pt-PT"/>
         </w:rPr>
-        <w:t>O servidor Node.js inicializa com a execução automática das migrações de base de dados (função runMigrations()), que garante que todas as 21 tabelas existem com o esquema correto antes de aceitar pedidos. O sistema de autenticação implementa JWT com dois tokens: um access token de quinze minutos e um refresh token de sete dias. As passwords são processadas com bcrypt e 12 salt rounds. Mecanismos adicionais de segurança incluem rate limiting, lockout de conta após 5 tentativas falhadas, proteção contra enumeração de emails e verificação de email por token SHA256.</w:t>
+        <w:t xml:space="preserve">O servidor Node.js inicializa com a execução automática das migrações de base de dados (função runMigrations()), que garante que todas as 21 tabelas existem com o esquema correto antes de aceitar pedidos. O sistema de autenticação implementa JWT com dois tokens: um access </w:t>
+      </w:r>
+      <w:r>
+        <w:rPr>
+          <w:rFonts w:ascii="Times New Roman" w:hAnsi="Times New Roman"/>
+          <w:sz w:val="24"/>
+          <w:lang w:val="pt-PT"/>
+        </w:rPr>
+        <w:lastRenderedPageBreak/>
+        <w:t>token de quinze minutos e um refresh token de sete dias. As passwords são processadas com bcrypt e 12 salt rounds. Mecanismos adicionais de segurança incluem rate limiting, lockout de conta após 5 tentativas falhadas, proteção contra enumeração de emails e verificação de email por token SHA256.</w:t>
       </w:r>
     </w:p>
     <w:p>
@@ -3451,6 +3515,7 @@
           <w:sz w:val="28"/>
           <w:lang w:val="pt-PT"/>
         </w:rPr>
+        <w:lastRenderedPageBreak/>
         <w:t>3.12 Sistema de Gamificação</w:t>
       </w:r>
     </w:p>
@@ -3551,25 +3616,8 @@
           <w:sz w:val="32"/>
           <w:lang w:val="pt-PT"/>
         </w:rPr>
+        <w:lastRenderedPageBreak/>
         <w:t>RESULTADOS E DISCUSSÃO DE RESULTADOS</w:t>
-      </w:r>
-    </w:p>
-    <w:p>
-      <w:pPr>
-        <w:spacing w:before="200" w:after="80" w:line="360" w:lineRule="auto"/>
-        <w:outlineLvl w:val="1"/>
-        <w:rPr>
-          <w:lang w:val="pt-PT"/>
-        </w:rPr>
-      </w:pPr>
-      <w:r>
-        <w:rPr>
-          <w:rFonts w:ascii="Times New Roman" w:hAnsi="Times New Roman"/>
-          <w:b/>
-          <w:sz w:val="28"/>
-          <w:lang w:val="pt-PT"/>
-        </w:rPr>
-        <w:t>4.1 Funcionalidades Implementadas</w:t>
       </w:r>
     </w:p>
     <w:p>
@@ -3577,33 +3625,38 @@
         <w:spacing w:after="0" w:line="360" w:lineRule="auto"/>
         <w:ind w:firstLine="680"/>
         <w:jc w:val="both"/>
-        <w:rPr>
-          <w:lang w:val="pt-PT"/>
-        </w:rPr>
-      </w:pPr>
-      <w:r>
-        <w:rPr>
-          <w:rFonts w:ascii="Times New Roman" w:hAnsi="Times New Roman"/>
+        <w:outlineLvl w:val="1"/>
+        <w:rPr>
+          <w:rFonts w:ascii="Times New Roman" w:hAnsi="Times New Roman" w:cs="Times New Roman"/>
           <w:sz w:val="24"/>
           <w:lang w:val="pt-PT"/>
         </w:rPr>
-        <w:t>O FiX-it tem como objetivo geral o desenvolvimento de uma aplicação web progressiva de análise de composição corporal assistida por inteligência artificial, gratuita, privada e multiplataforma. Os resultados apresentados neste capítulo dão resposta às questões de investigação e aos requisitos funcionais identificados na fase de análise, organizados pelos módulos do sistema. Ao longo do ano letivo 2025/2026, o desenvolvimento progrediu através das sete etapas planeadas, tendo atingido o seguinte estado de implementação à data do presente relatório:</w:t>
-      </w:r>
-      <w:r>
-        <w:rPr>
-          <w:rFonts w:ascii="Times New Roman" w:hAnsi="Times New Roman"/>
+      </w:pPr>
+      <w:r>
+        <w:rPr>
+          <w:rFonts w:ascii="Times New Roman" w:hAnsi="Times New Roman" w:cs="Times New Roman"/>
           <w:sz w:val="24"/>
           <w:lang w:val="pt-PT"/>
         </w:rPr>
-        <w:t xml:space="preserve"> as Etapas 1 e 2 encontravam-se integralmente concluídas; a Etapa 3 (backend, autenticação e base de dados) estava operacional; a Etapa 4 (serviços core) encontrava-se concluída; </w:t>
-      </w:r>
-      <w:r>
-        <w:rPr>
-          <w:rFonts w:ascii="Times New Roman" w:hAnsi="Times New Roman"/>
-          <w:sz w:val="24"/>
-          <w:lang w:val="pt-PT"/>
-        </w:rPr>
-        <w:t>a Etapa 5 (gamificação e coach virtual) encontrava-se concluída; a Etapa 6 (integração frontend-backend e painel de administração) encontrava-se concluída; e a Etapa 7 (testes e deployment) está em curso.</w:t>
+        <w:t>O presente capítulo descreve os resultados obtidos no desenvolvimento do FiX-it e discute o seu significado à luz das cinco questões de investigação e dos objetivos específicos definidos no pré-projeto. O objetivo geral do projeto consistiu no desenvolvimento de uma aplicação web progressiva de análise de composição corporal assistida por inteligência artificial, gratuita, multiplataforma e com privacidade por defeito, que demonstrasse a viabilidade de executar modelos de machine learning diretamente no browser do utilizador para análise de imagem em tempo real. No que diz respeito à concretização dos objetivos específicos: o modelo MediaPipe Pose foi integrado e validado para deteção de 33 marcos esqueléticos; o coach virtual com quatro personalidades distintas foi implementado com classificação de intenção por padrões; a arquitetura de backend em Node.js/Express com PostgreSQL e 58 endpoints REST foi construída e testada; o painel de administração com gestão de utilizadores, bloqueio de contas e dashboard de estatísticas foi implementado; e os testes de integração para os fluxos de autenticação e CRUD foram concluídos. Os resultados apresentados nas secções seguintes documentam o grau de concretização de cada módulo, descrevem os obstáculos técnicos encontrados e a forma como foram resolvidos, e discutem as implicações das descobertas para o domínio das aplicações web de fitness assistidas por inteligência artificial.</w:t>
+      </w:r>
+    </w:p>
+    <w:p>
+      <w:pPr>
+        <w:spacing w:before="200" w:after="80" w:line="360" w:lineRule="auto"/>
+        <w:outlineLvl w:val="1"/>
+        <w:rPr>
+          <w:lang w:val="pt-PT"/>
+        </w:rPr>
+      </w:pPr>
+      <w:r>
+        <w:rPr>
+          <w:rFonts w:ascii="Times New Roman" w:hAnsi="Times New Roman"/>
+          <w:b/>
+          <w:sz w:val="28"/>
+          <w:lang w:val="pt-PT"/>
+        </w:rPr>
+        <w:t>4.1 Funcionalidades Implementadas</w:t>
       </w:r>
     </w:p>
     <w:p>
@@ -3621,7 +3674,7 @@
           <w:sz w:val="24"/>
           <w:lang w:val="pt-PT"/>
         </w:rPr>
-        <w:t xml:space="preserve">Do total de 58 endpoints planeados, estavam implementados e testados: autenticação (8/8), utilizador (6/6), análise (8/8), treino (11/11) e nutrição (10/10), perfazendo </w:t>
+        <w:t>O FiX-it tem como objetivo geral o desenvolvimento de uma aplicação web progressiva de análise de composição corporal assistida por inteligência artificial, gratuita, privada e multiplataforma. Os resultados apresentados neste capítulo dão resposta às questões de investigação e aos requisitos funcionais identificados na fase de análise, organizados pelos módulos do sistema. Ao longo do ano letivo 2025/2026, o desenvolvimento progrediu através das sete etapas planeadas, tendo atingido o seguinte estado de implementação à data do presente relatório:</w:t>
       </w:r>
       <w:r>
         <w:rPr>
@@ -3629,7 +3682,7 @@
           <w:sz w:val="24"/>
           <w:lang w:val="pt-PT"/>
         </w:rPr>
-        <w:t>58 endpoints implementados e operacionais</w:t>
+        <w:t xml:space="preserve"> as Etapas 1 e 2 encontravam-se integralmente concluídas; a Etapa 3 (backend, autenticação e base de dados) estava operacional; a Etapa 4 (serviços core) encontrava-se concluída; </w:t>
       </w:r>
       <w:r>
         <w:rPr>
@@ -3637,33 +3690,7 @@
           <w:sz w:val="24"/>
           <w:lang w:val="pt-PT"/>
         </w:rPr>
-        <w:t xml:space="preserve">. Os endpoints de gamificação (6), coach (3) e administração (6) encontravam-se em desenvolvimento ativo. </w:t>
-      </w:r>
-      <w:r>
-        <w:rPr>
-          <w:rFonts w:ascii="Times New Roman" w:hAnsi="Times New Roman"/>
-          <w:sz w:val="24"/>
-          <w:lang w:val="pt-PT"/>
-        </w:rPr>
-        <w:t>A integração frontend-backend encontra-se concluída, com todas as chamadas à API implementadas e a sincronização multi-dispositivo em tempo real operacional via endpoint /api/sync/all, que consolida em uma única chamada paralela os dados de 15 tabelas distintas, eliminando a necessidade de 14 chamadas API sequenciais no arranque da aplicação.</w:t>
-      </w:r>
-    </w:p>
-    <w:p>
-      <w:pPr>
-        <w:spacing w:before="200" w:after="80" w:line="360" w:lineRule="auto"/>
-        <w:outlineLvl w:val="1"/>
-        <w:rPr>
-          <w:lang w:val="pt-PT"/>
-        </w:rPr>
-      </w:pPr>
-      <w:r>
-        <w:rPr>
-          <w:rFonts w:ascii="Times New Roman" w:hAnsi="Times New Roman"/>
-          <w:b/>
-          <w:sz w:val="28"/>
-          <w:lang w:val="pt-PT"/>
-        </w:rPr>
-        <w:t>4.2 Validação da Análise Corporal</w:t>
+        <w:t>a Etapa 5 (gamificação e coach virtual) encontrava-se concluída; a Etapa 6 (integração frontend-backend e painel de administração) encontrava-se concluída; e a Etapa 7 (testes e deployment) está em curso.</w:t>
       </w:r>
     </w:p>
     <w:p>
@@ -3681,7 +3708,49 @@
           <w:sz w:val="24"/>
           <w:lang w:val="pt-PT"/>
         </w:rPr>
-        <w:t>A validação informal do módulo de análise corporal foi conduzida com um conjunto de dez fotografias de teste em condições variadas. Os resultados confirmaram as limitações documentadas por Dill et al. (2023, p. 565): a precisão degradou-se significativamente em fotografias tiradas de perfil (ângulo &gt; 45°), em condições de contraluz e quando o vestuário de cor escura dificultou a deteção das extremidades.</w:t>
+        <w:t xml:space="preserve">Do total de 58 endpoints planeados, estavam implementados e testados: autenticação (8/8), utilizador (6/6), análise (8/8), treino (11/11) e nutrição (10/10), perfazendo </w:t>
+      </w:r>
+      <w:r>
+        <w:rPr>
+          <w:rFonts w:ascii="Times New Roman" w:hAnsi="Times New Roman"/>
+          <w:sz w:val="24"/>
+          <w:lang w:val="pt-PT"/>
+        </w:rPr>
+        <w:t>58 endpoints implementados e operacionais</w:t>
+      </w:r>
+      <w:r>
+        <w:rPr>
+          <w:rFonts w:ascii="Times New Roman" w:hAnsi="Times New Roman"/>
+          <w:sz w:val="24"/>
+          <w:lang w:val="pt-PT"/>
+        </w:rPr>
+        <w:t xml:space="preserve">. Os endpoints de gamificação (6), coach (3) e administração (6) encontravam-se em desenvolvimento ativo. </w:t>
+      </w:r>
+      <w:r>
+        <w:rPr>
+          <w:rFonts w:ascii="Times New Roman" w:hAnsi="Times New Roman"/>
+          <w:sz w:val="24"/>
+          <w:lang w:val="pt-PT"/>
+        </w:rPr>
+        <w:t>A integração frontend-backend encontra-se concluída, com todas as chamadas à API implementadas e a sincronização multi-dispositivo em tempo real operacional via endpoint /api/sync/all, que consolida em uma única chamada paralela os dados de 15 tabelas distintas, eliminando a necessidade de 14 chamadas API sequenciais no arranque da aplicação.</w:t>
+      </w:r>
+    </w:p>
+    <w:p>
+      <w:pPr>
+        <w:spacing w:before="200" w:after="80" w:line="360" w:lineRule="auto"/>
+        <w:outlineLvl w:val="1"/>
+        <w:rPr>
+          <w:lang w:val="pt-PT"/>
+        </w:rPr>
+      </w:pPr>
+      <w:r>
+        <w:rPr>
+          <w:rFonts w:ascii="Times New Roman" w:hAnsi="Times New Roman"/>
+          <w:b/>
+          <w:sz w:val="28"/>
+          <w:lang w:val="pt-PT"/>
+        </w:rPr>
+        <w:t>4.2 Validação da Análise Corporal</w:t>
       </w:r>
     </w:p>
     <w:p>
@@ -3699,25 +3768,7 @@
           <w:sz w:val="24"/>
           <w:lang w:val="pt-PT"/>
         </w:rPr>
-        <w:t>As seis métricas biométricas mostraram-se consistentes em condições favoráveis (iluminação frontal homogénea, vestuário ajustado de cor clara, câmara a dois metros), mas apresentaram variabilidade significativa em condições subótimas. A comparação com Qiao et al. (2024, p. 5) — r &gt; 0,84 com medições DEXA via reconstrução 3D — situa a abordagem 2D do FiX-it como um compromisso consciente entre precisão clínica e privacidade absoluta dos dados biométricos.</w:t>
-      </w:r>
-    </w:p>
-    <w:p>
-      <w:pPr>
-        <w:spacing w:before="200" w:after="80" w:line="360" w:lineRule="auto"/>
-        <w:outlineLvl w:val="1"/>
-        <w:rPr>
-          <w:lang w:val="pt-PT"/>
-        </w:rPr>
-      </w:pPr>
-      <w:r>
-        <w:rPr>
-          <w:rFonts w:ascii="Times New Roman" w:hAnsi="Times New Roman"/>
-          <w:b/>
-          <w:sz w:val="28"/>
-          <w:lang w:val="pt-PT"/>
-        </w:rPr>
-        <w:t>4.3 Desempenho no Browser</w:t>
+        <w:t>A validação informal do módulo de análise corporal foi conduzida com um conjunto de dez fotografias de teste em condições variadas. Os resultados confirmaram as limitações documentadas por Dill et al. (2023, p. 565): a precisão degradou-se significativamente em fotografias tiradas de perfil (ângulo &gt; 45°), em condições de contraluz e quando o vestuário de cor escura dificultou a deteção das extremidades.</w:t>
       </w:r>
     </w:p>
     <w:p>
@@ -3735,7 +3786,26 @@
           <w:sz w:val="24"/>
           <w:lang w:val="pt-PT"/>
         </w:rPr>
-        <w:t>O desempenho da inferência com MediaPipe Pose foi avaliado em três dispositivos: computador de secretária com GPU dedicada (45ms), computador portátil de gama média (120ms) e smartphone Android de gama intermédia (380ms). Em todos os dispositivos, o tempo de análise total ficou abaixo dos dois segundos, valor aceitável para uma operação de análise de fotografia realizada periodicamente.</w:t>
+        <w:lastRenderedPageBreak/>
+        <w:t>As seis métricas biométricas mostraram-se consistentes em condições favoráveis (iluminação frontal homogénea, vestuário ajustado de cor clara, câmara a dois metros), mas apresentaram variabilidade significativa em condições subótimas. A comparação com Qiao et al. (2024, p. 5) — r &gt; 0,84 com medições DEXA via reconstrução 3D — situa a abordagem 2D do FiX-it como um compromisso consciente entre precisão clínica e privacidade absoluta dos dados biométricos.</w:t>
+      </w:r>
+    </w:p>
+    <w:p>
+      <w:pPr>
+        <w:spacing w:before="200" w:after="80" w:line="360" w:lineRule="auto"/>
+        <w:outlineLvl w:val="1"/>
+        <w:rPr>
+          <w:lang w:val="pt-PT"/>
+        </w:rPr>
+      </w:pPr>
+      <w:r>
+        <w:rPr>
+          <w:rFonts w:ascii="Times New Roman" w:hAnsi="Times New Roman"/>
+          <w:b/>
+          <w:sz w:val="28"/>
+          <w:lang w:val="pt-PT"/>
+        </w:rPr>
+        <w:t>4.3 Desempenho no Browser</w:t>
       </w:r>
     </w:p>
     <w:p>
@@ -3753,25 +3823,7 @@
           <w:sz w:val="24"/>
           <w:lang w:val="pt-PT"/>
         </w:rPr>
-        <w:t>O tamanho total dos assets foi de aproximadamente 8,2 MB, dos quais 6,8 MB correspondem aos modelos de machine learning. A estratégia de caching do Service Worker garante que, após o primeiro carregamento, a aplicação inicia instantaneamente sem necessidade de rede, cumprindo o requisito de PWA definido em MDN Web Docs (2025, para. 1).</w:t>
-      </w:r>
-    </w:p>
-    <w:p>
-      <w:pPr>
-        <w:spacing w:before="200" w:after="80" w:line="360" w:lineRule="auto"/>
-        <w:outlineLvl w:val="1"/>
-        <w:rPr>
-          <w:lang w:val="pt-PT"/>
-        </w:rPr>
-      </w:pPr>
-      <w:r>
-        <w:rPr>
-          <w:rFonts w:ascii="Times New Roman" w:hAnsi="Times New Roman"/>
-          <w:b/>
-          <w:sz w:val="28"/>
-          <w:lang w:val="pt-PT"/>
-        </w:rPr>
-        <w:t>4.4 Avaliação de Usabilidade e Acessibilidade</w:t>
+        <w:t>O desempenho da inferência com MediaPipe Pose foi avaliado em três dispositivos: computador de secretária com GPU dedicada (45ms), computador portátil de gama média (120ms) e smartphone Android de gama intermédia (380ms). Em todos os dispositivos, o tempo de análise total ficou abaixo dos dois segundos, valor aceitável para uma operação de análise de fotografia realizada periodicamente.</w:t>
       </w:r>
     </w:p>
     <w:p>
@@ -3789,7 +3841,25 @@
           <w:sz w:val="24"/>
           <w:lang w:val="pt-PT"/>
         </w:rPr>
-        <w:t>A auditoria de acessibilidade com Lighthouse devolveu uma pontuação de 94/100. Os critérios de contraste mínimo AA das WCAG 2.2 (Kirkpatrick et al., 2023, SC 1.4.3) foram verificados em todas as combinações de cores: o branco (#FFFFFF) sobre o fundo escuro (#141211) apresenta um rácio de 18,3:1, acima do mínimo de 4,5:1; o dourado (#c9a962) apresenta um rácio de 6,8:1.</w:t>
+        <w:t>O tamanho total dos assets foi de aproximadamente 8,2 MB, dos quais 6,8 MB correspondem aos modelos de machine learning. A estratégia de caching do Service Worker garante que, após o primeiro carregamento, a aplicação inicia instantaneamente sem necessidade de rede, cumprindo o requisito de PWA definido em MDN Web Docs (2025, para. 1).</w:t>
+      </w:r>
+    </w:p>
+    <w:p>
+      <w:pPr>
+        <w:spacing w:before="200" w:after="80" w:line="360" w:lineRule="auto"/>
+        <w:outlineLvl w:val="1"/>
+        <w:rPr>
+          <w:lang w:val="pt-PT"/>
+        </w:rPr>
+      </w:pPr>
+      <w:r>
+        <w:rPr>
+          <w:rFonts w:ascii="Times New Roman" w:hAnsi="Times New Roman"/>
+          <w:b/>
+          <w:sz w:val="28"/>
+          <w:lang w:val="pt-PT"/>
+        </w:rPr>
+        <w:t>4.4 Avaliação de Usabilidade e Acessibilidade</w:t>
       </w:r>
     </w:p>
     <w:p>
@@ -3807,6 +3877,24 @@
           <w:sz w:val="24"/>
           <w:lang w:val="pt-PT"/>
         </w:rPr>
+        <w:t>A auditoria de acessibilidade com Lighthouse devolveu uma pontuação de 94/100. Os critérios de contraste mínimo AA das WCAG 2.2 (Kirkpatrick et al., 2023, SC 1.4.3) foram verificados em todas as combinações de cores: o branco (#FFFFFF) sobre o fundo escuro (#141211) apresenta um rácio de 18,3:1, acima do mínimo de 4,5:1; o dourado (#c9a962) apresenta um rácio de 6,8:1.</w:t>
+      </w:r>
+    </w:p>
+    <w:p>
+      <w:pPr>
+        <w:spacing w:after="0" w:line="360" w:lineRule="auto"/>
+        <w:ind w:firstLine="680"/>
+        <w:jc w:val="both"/>
+        <w:rPr>
+          <w:lang w:val="pt-PT"/>
+        </w:rPr>
+      </w:pPr>
+      <w:r>
+        <w:rPr>
+          <w:rFonts w:ascii="Times New Roman" w:hAnsi="Times New Roman"/>
+          <w:sz w:val="24"/>
+          <w:lang w:val="pt-PT"/>
+        </w:rPr>
         <w:t>A avaliação informal com três utilizadores-piloto identificou dois pontos de fricção: o fluxo de upload não clarificava a postura necessária (corrigido com instruções e diagrama ilustrativo) e os resultados numéricos geravam confusão (corrigido com barras de progresso coloridas e contexto verbal: 'Acima da média', 'Na média', 'Abaixo da média').</w:t>
       </w:r>
     </w:p>
@@ -3851,6 +3939,7 @@
           <w:sz w:val="24"/>
           <w:lang w:val="pt-PT"/>
         </w:rPr>
+        <w:lastRenderedPageBreak/>
         <w:t>No decorrer do desenvolvimento do FiX-it, dois obstáculos técnicos condicionaram decisões de arquitetura e exigiram investigação e reformulação da solução: a configuração do serviço de email e a sincronização de dados entre dispositivos. Esta secção descreve o problema identificado, o processo de diagnóstico e a solução adotada em cada caso, ilustrados com excertos de código.</w:t>
       </w:r>
     </w:p>
@@ -3964,6 +4053,7 @@
         <w:rPr>
           <w:noProof/>
         </w:rPr>
+        <w:lastRenderedPageBreak/>
         <w:drawing>
           <wp:inline distT="0" distB="0" distL="0" distR="0" wp14:anchorId="04B64DB9" wp14:editId="2FB1F4E2">
             <wp:extent cx="5972810" cy="3760470"/>
@@ -4083,6 +4173,7 @@
           <w:noProof/>
           <w:sz w:val="28"/>
         </w:rPr>
+        <w:lastRenderedPageBreak/>
         <w:drawing>
           <wp:inline distT="0" distB="0" distL="0" distR="0" wp14:anchorId="50965CAD" wp14:editId="65A3A123">
             <wp:extent cx="5972810" cy="6136005"/>
@@ -4156,6 +4247,7 @@
         <w:rPr>
           <w:lang w:val="pt-PT"/>
         </w:rPr>
+        <w:lastRenderedPageBreak/>
         <w:t>4.5.2 Dessincronização de Dados entre Dispositivos</w:t>
       </w:r>
     </w:p>
@@ -4276,6 +4368,7 @@
         <w:rPr>
           <w:noProof/>
         </w:rPr>
+        <w:lastRenderedPageBreak/>
         <w:drawing>
           <wp:inline distT="0" distB="0" distL="0" distR="0" wp14:anchorId="2B6A14F7" wp14:editId="15BA558A">
             <wp:extent cx="5972810" cy="5920740"/>
@@ -4380,6 +4473,7 @@
           <w:sz w:val="28"/>
           <w:lang w:val="pt-PT"/>
         </w:rPr>
+        <w:lastRenderedPageBreak/>
         <w:t>4.7 Discussão de Resultados</w:t>
       </w:r>
     </w:p>
@@ -4388,17 +4482,20 @@
         <w:spacing w:after="0" w:line="360" w:lineRule="auto"/>
         <w:ind w:firstLine="680"/>
         <w:jc w:val="both"/>
-        <w:rPr>
-          <w:lang w:val="pt-PT"/>
-        </w:rPr>
-      </w:pPr>
-      <w:r>
-        <w:rPr>
-          <w:rFonts w:ascii="Times New Roman" w:hAnsi="Times New Roman"/>
+        <w:outlineLvl w:val="1"/>
+        <w:rPr>
+          <w:rFonts w:ascii="Times New Roman" w:hAnsi="Times New Roman" w:cs="Times New Roman"/>
           <w:sz w:val="24"/>
           <w:lang w:val="pt-PT"/>
         </w:rPr>
-        <w:t>Os resultados obtidos permitem responder afirmativamente à hipótese central: é tecnicamente viável desenvolver uma aplicação web de análise corporal assistida por IA que seja simultaneamente gratuita, privada, multiplataforma e funcionalmente comparável às soluções comerciais. A execução client-side dos modelos de IA foi validada como viável em dispositivos de gama intermédia e superior.</w:t>
+      </w:pPr>
+      <w:r>
+        <w:rPr>
+          <w:rFonts w:ascii="Times New Roman" w:hAnsi="Times New Roman" w:cs="Times New Roman"/>
+          <w:sz w:val="24"/>
+          <w:lang w:val="pt-PT"/>
+        </w:rPr>
+        <w:t>A principal descoberta do projeto FiX-it consistiu na confirmação empírica de que foi tecnicamente viável desenvolver, no contexto de um projeto académico individual, uma aplicação web progressiva de análise de composição corporal assistida por inteligência artificial simultaneamente gratuita, privada, multiplataforma e funcionalmente comparável às soluções comerciais existentes — contribuição concreta à discussão académica sobre a democratização das ferramentas de monitorização da condição física. A hipótese central, formulada na Introdução, recebeu resposta afirmativa: a combinação de tecnologias web modernas, modelos de IA executáveis no browser e arquitetura REST com privacy by design permitiu construir a solução proposta dentro das restrições de tempo e recursos de um ano letivo.</w:t>
       </w:r>
     </w:p>
     <w:p>
@@ -4406,43 +4503,20 @@
         <w:spacing w:after="0" w:line="360" w:lineRule="auto"/>
         <w:ind w:firstLine="680"/>
         <w:jc w:val="both"/>
-        <w:rPr>
-          <w:lang w:val="pt-PT"/>
-        </w:rPr>
-      </w:pPr>
-      <w:r>
-        <w:rPr>
-          <w:rFonts w:ascii="Times New Roman" w:hAnsi="Times New Roman"/>
+        <w:outlineLvl w:val="1"/>
+        <w:rPr>
+          <w:rFonts w:ascii="Times New Roman" w:hAnsi="Times New Roman" w:cs="Times New Roman"/>
           <w:sz w:val="24"/>
           <w:lang w:val="pt-PT"/>
         </w:rPr>
-        <w:t xml:space="preserve">A arquitetura privacy-first confirma a tese de Ayala-Rivera et al. (2024, p. 12) de que o privacy by design não implica compromisso na funcionalidade. </w:t>
-      </w:r>
-      <w:r>
-        <w:rPr>
-          <w:rFonts w:ascii="Times New Roman" w:hAnsi="Times New Roman"/>
+      </w:pPr>
+      <w:r>
+        <w:rPr>
+          <w:rFonts w:ascii="Times New Roman" w:hAnsi="Times New Roman" w:cs="Times New Roman"/>
           <w:sz w:val="24"/>
           <w:lang w:val="pt-PT"/>
         </w:rPr>
-        <w:t>O sistema de gamificação demonstrou, nos testes com utilizadores-piloto, uma influência positiva na motivação para completar sessões de treino e manter a regularidade dos registos diários. A implementação de um endpoint de sincronização consolidada (/api/sync/all) revelou-se fundamental para garantir a consistência dos dados em contexto multi-dispositivo: a substituição de 14 chamadas sequenciais por uma única chamada paralela com Promise.all reduziu o tempo de arranque da sessão e eliminou erros de RATE_LIMITED causados por picos de pedidos simultâneos no login.</w:t>
-      </w:r>
-    </w:p>
-    <w:p>
-      <w:pPr>
-        <w:spacing w:before="200" w:after="80" w:line="360" w:lineRule="auto"/>
-        <w:outlineLvl w:val="1"/>
-        <w:rPr>
-          <w:lang w:val="pt-PT"/>
-        </w:rPr>
-      </w:pPr>
-      <w:r>
-        <w:rPr>
-          <w:rFonts w:ascii="Times New Roman" w:hAnsi="Times New Roman"/>
-          <w:b/>
-          <w:sz w:val="28"/>
-          <w:lang w:val="pt-PT"/>
-        </w:rPr>
-        <w:t>4.8 Síntese das Contribuições</w:t>
+        <w:t>A execução client-side dos modelos de IA validou-se como viável em dispositivos de gama intermédia e superior, com tempos de análise abaixo dos dois segundos em todos os dispositivos testados. Este resultado enquadrou-se nos limites de adequação confirmados por Kim et al. (2023, p. 13) para o MediaPipe Pose em aplicações de fitness, e situou o FiX-it na fronteira entre a precisão acessível e as limitações documentadas por Dill et al. (2023, p. 565) em poses de perfil e com oclusão parcial. A degradação de precisão em condições subótimas — confirmada nos testes informais com fotografias de perfil e contraluz — não contrariou a hipótese central, pois o FiX-it posicionou-se explicitamente como ferramenta motivacional e não como dispositivo de diagnóstico clínico, em linha com os disclaimers implementados. A distância face ao estado da arte representado por Qiao et al. (2024, p. 5) — r &gt; 0,84 com medições DEXA via reconstrução 3D — ficou explicitamente documentada e comunicada ao utilizador através de disclaimers e intervalos de confiança.</w:t>
       </w:r>
     </w:p>
     <w:p>
@@ -4450,43 +4524,20 @@
         <w:spacing w:after="0" w:line="360" w:lineRule="auto"/>
         <w:ind w:firstLine="680"/>
         <w:jc w:val="both"/>
-        <w:rPr>
-          <w:lang w:val="pt-PT"/>
-        </w:rPr>
-      </w:pPr>
-      <w:r>
-        <w:rPr>
-          <w:rFonts w:ascii="Times New Roman" w:hAnsi="Times New Roman"/>
+        <w:outlineLvl w:val="1"/>
+        <w:rPr>
+          <w:rFonts w:ascii="Times New Roman" w:hAnsi="Times New Roman" w:cs="Times New Roman"/>
           <w:sz w:val="24"/>
           <w:lang w:val="pt-PT"/>
         </w:rPr>
-        <w:t xml:space="preserve">As principais contribuições técnicas do projeto são cinco: (i) pipeline de análise corporal client-side que combina MediaPipe Pose com análise de pixéis para cálculo de seis métricas biométricas; (ii) arquitetura REST de 58 endpoints com autenticação JWT de dois tokens e conformidade RGPD por design; (iii) sistema de gamificação com 14 conquistas, 20 níveis e multiplicadores de streak; (iv) coach virtual com quatro personalidades baseado em classificação de intenção por padrões; e </w:t>
-      </w:r>
-      <w:r>
-        <w:rPr>
-          <w:rFonts w:ascii="Times New Roman" w:hAnsi="Times New Roman"/>
+      </w:pPr>
+      <w:r>
+        <w:rPr>
+          <w:rFonts w:ascii="Times New Roman" w:hAnsi="Times New Roman" w:cs="Times New Roman"/>
           <w:sz w:val="24"/>
           <w:lang w:val="pt-PT"/>
         </w:rPr>
-        <w:t>(v) implementação PWA com Service Worker e Web App Manifest para instalabilidade multiplataforma e funcionamento offline; e (vi) arquitetura de sincronização multi-dispositivo com endpoint /api/sync/all que garante consistência de dados entre dispositivos através de 15 queries paralelas em PostgreSQL.</w:t>
-      </w:r>
-    </w:p>
-    <w:p>
-      <w:pPr>
-        <w:spacing w:before="200" w:after="80" w:line="360" w:lineRule="auto"/>
-        <w:outlineLvl w:val="1"/>
-        <w:rPr>
-          <w:lang w:val="pt-PT"/>
-        </w:rPr>
-      </w:pPr>
-      <w:r>
-        <w:rPr>
-          <w:rFonts w:ascii="Times New Roman" w:hAnsi="Times New Roman"/>
-          <w:b/>
-          <w:sz w:val="28"/>
-          <w:lang w:val="pt-PT"/>
-        </w:rPr>
-        <w:t>4.9 Respostas às Questões de Investigação</w:t>
+        <w:t>A arquitetura privacy-first confirmou a tese de Ayala-Rivera et al. (2024, p. 12) de que o privacy by design não implicou compromisso na funcionalidade: toda a inferência de IA processou-se localmente no browser do utilizador, sem qualquer envio de imagens corporais para servidores externos, cumprindo os princípios de minimização de dados e limitação da finalidade do RGPD (Regulation EU 2016/679, 2016). Esta abordagem distinguiu o FiX-it das soluções comerciais dominantes — MyFitnessPal, Freeletics e Future — que dependem de infraestrutura cloud para processamento de dados biométricos, e confirmou empiricamente a sua viabilidade técnica sem sacrifício da riqueza funcional. A arquitetura REST de 58 endpoints confirmou as conclusões de Bogner et al. (2023, Sec. 4.2) sobre a importância da consistência dos verbos HTTP e da estruturação hierárquica dos recursos para a compreensibilidade das APIs. A decisão de desenvolver o frontend em JavaScript vanilla alinhou-se com a análise de Vepsäläinen et al. (2023, p. 325) sobre o custo-benefício das abordagens sem overhead de runtime em projetos com prazo definido.</w:t>
       </w:r>
     </w:p>
     <w:p>
@@ -4494,50 +4545,20 @@
         <w:spacing w:after="0" w:line="360" w:lineRule="auto"/>
         <w:ind w:firstLine="680"/>
         <w:jc w:val="both"/>
-        <w:rPr>
-          <w:lang w:val="pt-PT"/>
-        </w:rPr>
-      </w:pPr>
-      <w:r>
-        <w:rPr>
-          <w:rFonts w:ascii="Times New Roman" w:hAnsi="Times New Roman"/>
+        <w:outlineLvl w:val="1"/>
+        <w:rPr>
+          <w:rFonts w:ascii="Times New Roman" w:hAnsi="Times New Roman" w:cs="Times New Roman"/>
           <w:sz w:val="24"/>
           <w:lang w:val="pt-PT"/>
         </w:rPr>
-        <w:t xml:space="preserve">As cinco questões de investigação podem agora ser respondidas. Q1 — A estruturação em frontend SPA / backend REST / camada de IA client-side demonstrou-se adequada para separar responsabilidades de processamento e persistência. Q2 — Os requisitos de privacidade na inferência e explicabilidade das estimativas (Ahmad et al., 2023, Sec. 4.4) revelaram-se essenciais para a aceitação pelos utilizadores-piloto. Q3 — A metodologia ágil adaptada ao contexto individual confirmou as conclusões de Sassa et al. </w:t>
-      </w:r>
-      <w:r>
-        <w:rPr>
-          <w:rFonts w:ascii="Times New Roman" w:hAnsi="Times New Roman"/>
+      </w:pPr>
+      <w:r>
+        <w:rPr>
+          <w:rFonts w:ascii="Times New Roman" w:hAnsi="Times New Roman" w:cs="Times New Roman"/>
           <w:sz w:val="24"/>
-        </w:rPr>
-        <w:t xml:space="preserve">(2023, Sec. IV.B, p. 177) e Mishra e Alzoubi (2023, p. 1515). </w:t>
-      </w:r>
-      <w:r>
-        <w:rPr>
-          <w:rFonts w:ascii="Times New Roman" w:hAnsi="Times New Roman"/>
-          <w:sz w:val="24"/>
-          <w:lang w:val="pt-PT"/>
-        </w:rPr>
-        <w:t>Q4 — MediaPipe Pose v0.5, TensorFlow.js v3.21 e PostgreSQL 18 demonstraram-se tecnicamente adequados, com as limitações documentadas por Dill et al. (2023, p. 565) e Qiao et al. (2024, p. 5) confirmadas empiricamente. Q5 — A implementação das heurísticas de Galavi et al. (2024, Results, “Previously established heuristics”, para. 1) e dos critérios WCAG 2.2 de Kirkpatrick et al. (2023, SC 1.4.3) resultou numa pontuação de acessibilidade de 94/100.</w:t>
-      </w:r>
-    </w:p>
-    <w:p>
-      <w:pPr>
-        <w:spacing w:before="200" w:after="80" w:line="360" w:lineRule="auto"/>
-        <w:outlineLvl w:val="1"/>
-        <w:rPr>
-          <w:lang w:val="pt-PT"/>
-        </w:rPr>
-      </w:pPr>
-      <w:r>
-        <w:rPr>
-          <w:rFonts w:ascii="Times New Roman" w:hAnsi="Times New Roman"/>
-          <w:b/>
-          <w:sz w:val="28"/>
-          <w:lang w:val="pt-PT"/>
-        </w:rPr>
-        <w:t>4.10 Trabalho Futuro</w:t>
+          <w:lang w:val="pt-PT"/>
+        </w:rPr>
+        <w:t>A metodologia ágil adaptada ao contexto individual confirmou as conclusões de Sassa et al. (2023, Sec. IV.B, p. 177) e Mishra e Alzoubi (2023, p. 1515): projetos com componentes exploratórias e requisitos parcialmente indefinidos à partida — como os algoritmos de estimação corporal que evoluíram com a implementação — beneficiaram consistentemente da flexibilidade ágil em detrimento de abordagens mais estruturadas. O sistema de gamificação demonstrou, nos testes com utilizadores-piloto, uma influência positiva na motivação para completar sessões de treino e manter a regularidade dos registos diários, em linha com as expectativas definidas nos resultados esperados do pré-projeto. A pontuação de acessibilidade de 94/100 no Lighthouse validou a implementação das heurísticas de Galavi et al. (2024, Results, para. 1) e os critérios WCAG 2.2 de Kirkpatrick et al. (2023, SC 1.4.3). Os dois pontos de fricção identificados com utilizadores-piloto foram corrigidos com instruções visuais e barras de progresso com contexto verbal, demonstrando a utilidade das iterações de usabilidade documentadas por Berni e Borgianni (2023, p. 11).</w:t>
       </w:r>
     </w:p>
     <w:p>
@@ -4545,35 +4566,20 @@
         <w:spacing w:after="0" w:line="360" w:lineRule="auto"/>
         <w:ind w:firstLine="680"/>
         <w:jc w:val="both"/>
-        <w:rPr>
-          <w:lang w:val="pt-PT"/>
-        </w:rPr>
-      </w:pPr>
-      <w:r>
-        <w:rPr>
-          <w:rFonts w:ascii="Times New Roman" w:hAnsi="Times New Roman"/>
+        <w:outlineLvl w:val="1"/>
+        <w:rPr>
+          <w:rFonts w:ascii="Times New Roman" w:hAnsi="Times New Roman" w:cs="Times New Roman"/>
           <w:sz w:val="24"/>
           <w:lang w:val="pt-PT"/>
         </w:rPr>
-        <w:t>O desenvolvimento futuro deverá prosseguir em quatro direções prioritárias: (i) conclusão das Etapas 6 e 7 para transformar o protótipo num produto plenamente funcional e acessível ao público; (ii) expansão da base de dados nutricional através da integração com a API Open Food Facts; (iii) condução de um estudo longitudinal com utilizadores reais para avaliar o impacto do sistema de gamificação na adesão e na progressão das métricas corporais; e (iv) exploração da integração de um modelo de linguagem de pequena dimensão executável no browser (como o Gemma 2B via WebGPU) para substituir o coach virtual baseado em regras.</w:t>
-      </w:r>
-    </w:p>
-    <w:p>
-      <w:pPr>
-        <w:spacing w:before="200" w:after="80" w:line="360" w:lineRule="auto"/>
-        <w:outlineLvl w:val="1"/>
-        <w:rPr>
-          <w:lang w:val="pt-PT"/>
-        </w:rPr>
-      </w:pPr>
-      <w:r>
-        <w:rPr>
-          <w:rFonts w:ascii="Times New Roman" w:hAnsi="Times New Roman"/>
-          <w:b/>
-          <w:sz w:val="28"/>
-          <w:lang w:val="pt-PT"/>
-        </w:rPr>
-        <w:t>4.11 Considerações Finais</w:t>
+      </w:pPr>
+      <w:r>
+        <w:rPr>
+          <w:rFonts w:ascii="Times New Roman" w:hAnsi="Times New Roman" w:cs="Times New Roman"/>
+          <w:sz w:val="24"/>
+          <w:lang w:val="pt-PT"/>
+        </w:rPr>
+        <w:t>A implementação do endpoint de sincronização consolidada (/api/sync/all), que substituiu 14 chamadas API sequenciais por uma única chamada paralela com Promise.all, constituiu uma descoberta inesperada com implicações arquiteturais relevantes: a sincronização multi-dispositivo eficiente exigiu um endpoint de agregação dedicado desde a fase de arquitetura, e não como correção posterior à manifestação do problema. A sua ausência na versão inicial — que confiava no estado local antes de consultar o servidor — resultou na dessincronização documentada na secção 4.5.2 e revelou que a consistência eventual sem mecanismos de reconciliação explícita é incompatível com aplicações de dados pessoais em contexto multi-dispositivo. A solução adotada eliminou os erros de RATE_LIMITED causados por picos de pedidos simultâneos no login e reduziu o tempo de arranque da sessão, confirmando que a consolidação de chamadas paralelas é preferível a múltiplas chamadas sequenciais tanto em desempenho como em fiabilidade.</w:t>
       </w:r>
     </w:p>
     <w:p>
@@ -4581,31 +4587,205 @@
         <w:spacing w:after="0" w:line="360" w:lineRule="auto"/>
         <w:ind w:firstLine="680"/>
         <w:jc w:val="both"/>
-        <w:rPr>
-          <w:lang w:val="pt-PT"/>
-        </w:rPr>
-      </w:pPr>
-      <w:r>
-        <w:rPr>
-          <w:rFonts w:ascii="Times New Roman" w:hAnsi="Times New Roman"/>
+        <w:outlineLvl w:val="1"/>
+        <w:rPr>
+          <w:rFonts w:ascii="Times New Roman" w:hAnsi="Times New Roman" w:cs="Times New Roman"/>
           <w:sz w:val="24"/>
           <w:lang w:val="pt-PT"/>
         </w:rPr>
-        <w:t>O FiX-it demonstrou que a combinação de Progressive Web Apps, machine learning no browser e arquitetura REST com privacy by design permite construir uma solução de fitness digital que responde simultaneamente às exigências de acessibilidade económica, proteção de dados e qualidade funcional. O projeto contribuiu para o conhecimento académico na área da interseção entre tecnologias web modernas, IA aplicada e design centrado no utilizador, e serve como referência metodológica para projetos académicos que pretendam combinar estas dimensões dentro das restrições de tempo e recursos de um ano letivo.</w:t>
-      </w:r>
-    </w:p>
-    <w:p>
-      <w:pPr>
-        <w:rPr>
-          <w:lang w:val="pt-PT"/>
-        </w:rPr>
-      </w:pPr>
-      <w:r>
-        <w:rPr>
-          <w:lang w:val="pt-PT"/>
-        </w:rPr>
-        <w:br w:type="page"/>
-      </w:r>
+      </w:pPr>
+    </w:p>
+    <w:p>
+      <w:pPr>
+        <w:spacing w:before="200" w:after="80" w:line="360" w:lineRule="auto"/>
+        <w:outlineLvl w:val="1"/>
+        <w:rPr>
+          <w:lang w:val="pt-PT"/>
+        </w:rPr>
+      </w:pPr>
+      <w:r>
+        <w:rPr>
+          <w:rFonts w:ascii="Times New Roman" w:hAnsi="Times New Roman"/>
+          <w:b/>
+          <w:sz w:val="28"/>
+          <w:lang w:val="pt-PT"/>
+        </w:rPr>
+        <w:t>4.8 Síntese das Contribuições</w:t>
+      </w:r>
+    </w:p>
+    <w:p>
+      <w:pPr>
+        <w:spacing w:after="0" w:line="360" w:lineRule="auto"/>
+        <w:ind w:firstLine="680"/>
+        <w:jc w:val="both"/>
+        <w:rPr>
+          <w:lang w:val="pt-PT"/>
+        </w:rPr>
+      </w:pPr>
+      <w:r>
+        <w:rPr>
+          <w:rFonts w:ascii="Times New Roman" w:hAnsi="Times New Roman"/>
+          <w:sz w:val="24"/>
+          <w:lang w:val="pt-PT"/>
+        </w:rPr>
+        <w:t xml:space="preserve">As principais contribuições técnicas do projeto são cinco: (i) pipeline de análise corporal client-side que combina MediaPipe Pose com análise de pixéis para cálculo de seis métricas biométricas; (ii) arquitetura REST de 58 endpoints com autenticação JWT de dois tokens e conformidade RGPD por design; (iii) sistema de gamificação com 14 conquistas, 20 níveis e multiplicadores de streak; (iv) coach virtual com quatro personalidades baseado em classificação de intenção por padrões; e </w:t>
+      </w:r>
+      <w:r>
+        <w:rPr>
+          <w:rFonts w:ascii="Times New Roman" w:hAnsi="Times New Roman"/>
+          <w:sz w:val="24"/>
+          <w:lang w:val="pt-PT"/>
+        </w:rPr>
+        <w:t>(v) implementação PWA com Service Worker e Web App Manifest para instalabilidade multiplataforma e funcionamento offline; e (vi) arquitetura de sincronização multi-dispositivo com endpoint /api/sync/all que garante consistência de dados entre dispositivos através de 15 queries paralelas em PostgreSQL.</w:t>
+      </w:r>
+    </w:p>
+    <w:p>
+      <w:pPr>
+        <w:spacing w:before="200" w:after="80" w:line="360" w:lineRule="auto"/>
+        <w:outlineLvl w:val="1"/>
+        <w:rPr>
+          <w:lang w:val="pt-PT"/>
+        </w:rPr>
+      </w:pPr>
+      <w:r>
+        <w:rPr>
+          <w:rFonts w:ascii="Times New Roman" w:hAnsi="Times New Roman"/>
+          <w:b/>
+          <w:sz w:val="28"/>
+          <w:lang w:val="pt-PT"/>
+        </w:rPr>
+        <w:t>4.9 Respostas às Questões de Investigação</w:t>
+      </w:r>
+    </w:p>
+    <w:p>
+      <w:pPr>
+        <w:spacing w:after="0" w:line="360" w:lineRule="auto"/>
+        <w:ind w:firstLine="680"/>
+        <w:jc w:val="both"/>
+        <w:rPr>
+          <w:lang w:val="pt-PT"/>
+        </w:rPr>
+      </w:pPr>
+      <w:r>
+        <w:rPr>
+          <w:rFonts w:ascii="Times New Roman" w:hAnsi="Times New Roman"/>
+          <w:sz w:val="24"/>
+          <w:lang w:val="pt-PT"/>
+        </w:rPr>
+        <w:t xml:space="preserve">As cinco questões de investigação podem agora ser respondidas. Q1 — A estruturação em frontend SPA / backend REST / camada de IA client-side demonstrou-se adequada para separar responsabilidades de processamento e persistência. Q2 — Os requisitos de privacidade na inferência e explicabilidade das estimativas (Ahmad et al., 2023, Sec. 4.4) revelaram-se essenciais para a aceitação pelos utilizadores-piloto. Q3 — A metodologia ágil adaptada ao contexto individual confirmou as conclusões de Sassa et al. </w:t>
+      </w:r>
+      <w:r>
+        <w:rPr>
+          <w:rFonts w:ascii="Times New Roman" w:hAnsi="Times New Roman"/>
+          <w:sz w:val="24"/>
+        </w:rPr>
+        <w:t xml:space="preserve">(2023, Sec. IV.B, p. 177) e Mishra e Alzoubi (2023, p. 1515). </w:t>
+      </w:r>
+      <w:r>
+        <w:rPr>
+          <w:rFonts w:ascii="Times New Roman" w:hAnsi="Times New Roman"/>
+          <w:sz w:val="24"/>
+          <w:lang w:val="pt-PT"/>
+        </w:rPr>
+        <w:t>Q4 — MediaPipe Pose v0.5, TensorFlow.js v3.21 e PostgreSQL 18 demonstraram-se tecnicamente adequados, com as limitações documentadas por Dill et al. (2023, p. 565) e Qiao et al. (2024, p. 5) confirmadas empiricamente. Q5 — A implementação das heurísticas de Galavi et al. (2024, Results, “Previously established heuristics”, para. 1) e dos critérios WCAG 2.2 de Kirkpatrick et al. (2023, SC 1.4.3) resultou numa pontuação de acessibilidade de 94/100.</w:t>
+      </w:r>
+    </w:p>
+    <w:p>
+      <w:pPr>
+        <w:spacing w:before="200" w:after="80" w:line="360" w:lineRule="auto"/>
+        <w:outlineLvl w:val="1"/>
+        <w:rPr>
+          <w:lang w:val="pt-PT"/>
+        </w:rPr>
+      </w:pPr>
+      <w:r>
+        <w:rPr>
+          <w:rFonts w:ascii="Times New Roman" w:hAnsi="Times New Roman"/>
+          <w:b/>
+          <w:sz w:val="28"/>
+          <w:lang w:val="pt-PT"/>
+        </w:rPr>
+        <w:t>4.10 Trabalho Futuro</w:t>
+      </w:r>
+    </w:p>
+    <w:p>
+      <w:pPr>
+        <w:spacing w:after="0" w:line="360" w:lineRule="auto"/>
+        <w:ind w:firstLine="680"/>
+        <w:jc w:val="both"/>
+        <w:rPr>
+          <w:lang w:val="pt-PT"/>
+        </w:rPr>
+      </w:pPr>
+      <w:r>
+        <w:rPr>
+          <w:rFonts w:ascii="Times New Roman" w:hAnsi="Times New Roman"/>
+          <w:sz w:val="24"/>
+          <w:lang w:val="pt-PT"/>
+        </w:rPr>
+        <w:t xml:space="preserve">O desenvolvimento futuro deverá prosseguir em quatro direções prioritárias: (i) conclusão das Etapas 6 e 7 para transformar o protótipo num produto plenamente funcional e acessível ao </w:t>
+      </w:r>
+      <w:r>
+        <w:rPr>
+          <w:rFonts w:ascii="Times New Roman" w:hAnsi="Times New Roman"/>
+          <w:sz w:val="24"/>
+          <w:lang w:val="pt-PT"/>
+        </w:rPr>
+        <w:lastRenderedPageBreak/>
+        <w:t>público; (ii) expansão da base de dados nutricional através da integração com a API Open Food Facts; (iii) condução de um estudo longitudinal com utilizadores reais para avaliar o impacto do sistema de gamificação na adesão e na progressão das métricas corporais; e (iv) exploração da integração de um modelo de linguagem de pequena dimensão executável no browser (como o Gemma 2B via WebGPU) para substituir o coach virtual baseado em regras.</w:t>
+      </w:r>
+    </w:p>
+    <w:p>
+      <w:pPr>
+        <w:spacing w:before="200" w:after="80" w:line="360" w:lineRule="auto"/>
+        <w:outlineLvl w:val="1"/>
+        <w:rPr>
+          <w:lang w:val="pt-PT"/>
+        </w:rPr>
+      </w:pPr>
+      <w:r>
+        <w:rPr>
+          <w:rFonts w:ascii="Times New Roman" w:hAnsi="Times New Roman"/>
+          <w:b/>
+          <w:sz w:val="28"/>
+          <w:lang w:val="pt-PT"/>
+        </w:rPr>
+        <w:t>4.11 Considerações Finais</w:t>
+      </w:r>
+    </w:p>
+    <w:p>
+      <w:pPr>
+        <w:spacing w:after="0" w:line="360" w:lineRule="auto"/>
+        <w:ind w:firstLine="680"/>
+        <w:jc w:val="both"/>
+        <w:outlineLvl w:val="0"/>
+        <w:rPr>
+          <w:rFonts w:ascii="Times New Roman" w:hAnsi="Times New Roman" w:cs="Times New Roman"/>
+          <w:sz w:val="24"/>
+          <w:lang w:val="pt-PT"/>
+        </w:rPr>
+      </w:pPr>
+      <w:r>
+        <w:rPr>
+          <w:rFonts w:ascii="Times New Roman" w:hAnsi="Times New Roman" w:cs="Times New Roman"/>
+          <w:sz w:val="24"/>
+          <w:lang w:val="pt-PT"/>
+        </w:rPr>
+        <w:t>Em síntese, o desenvolvimento do FiX-it confirmou empiricamente que a combinação de Progressive Web Apps, machine learning no browser e arquitetura REST com privacy by design permitiu construir uma solução de fitness digital gratuita, privada e multiplataforma dentro das restrições de um projeto académico individual. A significância do projeto residiu em três dimensões complementares: técnica, ao demonstrar a viabilidade da execução client-side de IA em dispositivos de gama intermédia com tempos de análise abaixo dos dois segundos; ética, ao materializar o princípio de privacy by design como alternativa concreta ao processamento cloud de dados biométricos sensíveis; e académica, ao contribuir com dados empíricos originais sobre os limiares de precisão e as condições de falha do MediaPipe Pose em contexto doméstico, num domínio ainda escasso em validações práticas. Se o projeto fosse reiniciado, a principal alteração metodológica seria a condução de um estudo de usabilidade formal com uma amostra mais representativa de utilizadores desde fases mais precoces do desenvolvimento, e a integração da componente de sincronização multi-dispositivo desde a arquitetura inicial em vez de como solução posterior — a sua ausência na fase de conceção originou o obstáculo de dessincronização documentado na secção 4.5.2 e exigiu uma reformulação significativa do fluxo de autenticação. As implicações do projeto estendem-se para além do contexto académico: a demonstração de que dados biométricos podem ser processados com qualidade aceitável inteiramente no dispositivo do utilizador contribui para a discussão sobre a viabilidade técnica do privacy by design em aplicações de saúde digital, e o padrão de sincronização multi-dispositivo por agregação paralela poderá ser reutilizado em projetos futuros que enfrentem desafios semelhantes de consistência de dados.</w:t>
+      </w:r>
+    </w:p>
+    <w:p>
+      <w:pPr>
+        <w:spacing w:after="0" w:line="360" w:lineRule="auto"/>
+        <w:ind w:firstLine="680"/>
+        <w:jc w:val="both"/>
+        <w:outlineLvl w:val="0"/>
+        <w:rPr>
+          <w:rFonts w:ascii="Times New Roman" w:hAnsi="Times New Roman" w:cs="Times New Roman"/>
+          <w:sz w:val="24"/>
+          <w:lang w:val="pt-PT"/>
+        </w:rPr>
+      </w:pPr>
     </w:p>
     <w:p>
       <w:pPr>
@@ -4806,7 +4986,18 @@
           <w:szCs w:val="24"/>
           <w:lang w:val="pt-PT"/>
         </w:rPr>
-        <w:t>Esta limitação é explicitamente comunicada ao utilizador através de disclaimers e intervalos de confiança, posicionando o FiX-it como uma ferramenta motivacional de apoio ao bem-estar e não como um dispositivo médico de diagnóstico.</w:t>
+        <w:t xml:space="preserve">Esta limitação é explicitamente comunicada ao utilizador através de disclaimers e intervalos de </w:t>
+      </w:r>
+      <w:r>
+        <w:rPr>
+          <w:rFonts w:ascii="Times New Roman" w:hAnsi="Times New Roman"/>
+          <w:bCs/>
+          <w:sz w:val="24"/>
+          <w:szCs w:val="24"/>
+          <w:lang w:val="pt-PT"/>
+        </w:rPr>
+        <w:lastRenderedPageBreak/>
+        <w:t>confiança, posicionando o FiX-it como uma ferramenta motivacional de apoio ao bem-estar e não como um dispositivo médico de diagnóstico.</w:t>
       </w:r>
     </w:p>
     <w:p>

</xml_diff>

<commit_message>
docs: update Introducao, Conclusao, Resumo, Abstract per Prof. Mourato instructions
Resumo: rewrote to 5-paragraph structure (one per chapter), removed abbreviations/citations,
follows the Regionalix template from Int.pdf slide 21.
Abstract: English translation of new Resumo, 5-paragraph structure.
Palavras-chave/Keywords: reduced to 5, properly capitalised.
Intro 1.2: added obstacle paragraph (technical/ethical challenges) between problem and hypothesis.
Intro 1.5: added expectation sentence (privacy by design + client-side AI viability).
Conclusao: prepended mirror-of-intro paradox sentence (particular to general, as required).

Co-Authored-By: Claude Sonnet 4.6 <noreply@anthropic.com>
</commit_message>
<xml_diff>
--- a/Relatório PA_FiX-it.docx
+++ b/Relatório PA_FiX-it.docx
@@ -403,16 +403,18 @@
         <w:ind w:firstLine="680"/>
         <w:jc w:val="both"/>
         <w:rPr>
-          <w:lang w:val="pt-PT"/>
-        </w:rPr>
-      </w:pPr>
-      <w:r>
-        <w:rPr>
-          <w:rFonts w:ascii="Times New Roman" w:hAnsi="Times New Roman"/>
-          <w:sz w:val="24"/>
-          <w:lang w:val="pt-PT"/>
-        </w:rPr>
-        <w:t>O presente projeto académico descreve o desenvolvimento do FiX-it, uma aplicação web progressiva (PWA) de análise de composição corporal assistida por inteligência artificial. A aplicação foi construída com o objetivo de democratizar o acesso a ferramentas de monitorização da condição física, eliminando as barreiras de custo e privacidade características das soluções comerciais existentes. A inovação central reside na execução inteiramente client-side dos modelos de machine learning — MediaPipe Pose, BodyPix e MobileNet via TensorFlow.js —, o que garante que as imagens corporais do utilizador nunca abandonam o seu dispositivo durante a análise.</w:t>
+          <w:rFonts w:ascii="Times New Roman" w:hAnsi="Times New Roman" w:cs="Times New Roman"/>
+          <w:sz w:val="24"/>
+          <w:lang w:val="pt-PT"/>
+        </w:rPr>
+      </w:pPr>
+      <w:r>
+        <w:rPr>
+          <w:rFonts w:ascii="Times New Roman" w:hAnsi="Times New Roman" w:cs="Times New Roman"/>
+          <w:sz w:val="24"/>
+          <w:lang w:val="pt-PT"/>
+        </w:rPr>
+        <w:t>O mercado de aplicações de monitorização da condição física é dominado por soluções pagas que dependem de infraestrutura em nuvem para o processamento de dados biométricos, criando barreiras de custo e de privacidade que excluem uma parcela significativa dos potenciais utilizadores. O presente projeto académico descreve o desenvolvimento do FiX-it, uma aplicação web progressiva de análise de composição corporal assistida por inteligência artificial, de acesso gratuito, multiplataforma e com privacidade por defeito. O objetivo geral foi demonstrar a viabilidade de executar modelos de aprendizagem automática diretamente no navegador do utilizador para análise de imagem corporal em tempo real, sem envio de dados biométricos para servidores externos. Os objetivos específicos compreenderam a integração de modelos de deteção de pose corporal, segmentação e reconhecimento de alimentos no navegador; o desenvolvimento de um assistente virtual com quatro personalidades distintas; a implementação de uma interface de programação com cinquenta e oito pontos de acesso em Node.js com PostgreSQL; e a validação do protótipo a três níveis.</w:t>
       </w:r>
     </w:p>
     <w:p>
@@ -421,16 +423,18 @@
         <w:ind w:firstLine="680"/>
         <w:jc w:val="both"/>
         <w:rPr>
-          <w:lang w:val="pt-PT"/>
-        </w:rPr>
-      </w:pPr>
-      <w:r>
-        <w:rPr>
-          <w:rFonts w:ascii="Times New Roman" w:hAnsi="Times New Roman"/>
-          <w:sz w:val="24"/>
-          <w:lang w:val="pt-PT"/>
-        </w:rPr>
-        <w:t>O sistema integra análise corporal com estimação de seis métricas biométricas, orientação de treino com uma biblioteca de aproximadamente sessenta exercícios, orientação nutricional com calculadora de macronutrientes, um coach virtual com quatro personalidades distintas e um sistema de gamificação com pontos, níveis, conquistas e desafios semanais. O backend, desenvolvido em Node.js com Express e PostgreSQL, expõe cinquenta e oito endpoints REST organizados por domínio funcional e implementa autenticação JWT com renovação automática de tokens.</w:t>
+          <w:rFonts w:ascii="Times New Roman" w:hAnsi="Times New Roman" w:cs="Times New Roman"/>
+          <w:sz w:val="24"/>
+          <w:lang w:val="pt-PT"/>
+        </w:rPr>
+      </w:pPr>
+      <w:r>
+        <w:rPr>
+          <w:rFonts w:ascii="Times New Roman" w:hAnsi="Times New Roman" w:cs="Times New Roman"/>
+          <w:sz w:val="24"/>
+          <w:lang w:val="pt-PT"/>
+        </w:rPr>
+        <w:t>A fundamentação teórica organizou-se em torno de cinco domínios: arquitetura de aplicações web e padrão de aplicações web progressivas; engenharia de requisitos para sistemas de inteligência artificial e conformidade com o Regulamento Geral sobre a Proteção de Dados; metodologia de desenvolvimento ágil em contexto académico individual; tecnologias de inteligência artificial executáveis no navegador para análise de composição corporal; e princípios de usabilidade e acessibilidade para aplicações de saúde. A revisão da literatura, assente em dezasseis fontes publicadas entre 2023 e 2026, confirmou a adequação das tecnologias selecionadas e evidenciou a escassez de validações práticas de pipelines de análise corporal bidimensional executados inteiramente no navegador — lacuna que o presente projeto procurou colmatar.</w:t>
       </w:r>
     </w:p>
     <w:p>
@@ -439,79 +443,27 @@
         <w:ind w:firstLine="680"/>
         <w:jc w:val="both"/>
         <w:rPr>
-          <w:lang w:val="pt-PT"/>
-        </w:rPr>
-      </w:pPr>
-      <w:r>
-        <w:rPr>
-          <w:rFonts w:ascii="Times New Roman" w:hAnsi="Times New Roman"/>
-          <w:sz w:val="24"/>
-          <w:lang w:val="pt-PT"/>
-        </w:rPr>
-        <w:t>O backend implementa ainda sincronização multi-dispositivo em tempo real, consolidando os dados de 15 tabelas em uma única chamada paralela ao servidor. A metodologia de desenvolvimento seguiu uma abordagem ágil iterativa e incremental, adaptada ao contexto de projeto académico individual.</w:t>
-      </w:r>
-      <w:r>
-        <w:rPr>
-          <w:rFonts w:ascii="Times New Roman" w:hAnsi="Times New Roman"/>
-          <w:sz w:val="24"/>
-          <w:lang w:val="pt-PT"/>
-        </w:rPr>
-        <w:t xml:space="preserve"> A fundamentação teórica assentou em quinze fontes bibliográficas publicadas entre 2023 e 2025, cobrindo os domínios de arquitetura REST, engenharia de requisitos para IA, metodologia ágil, estimação de composição corporal por câmara e acessibilidade web.</w:t>
-      </w:r>
-    </w:p>
-    <w:p>
-      <w:pPr>
-        <w:spacing w:after="0" w:line="360" w:lineRule="auto"/>
-        <w:jc w:val="both"/>
-        <w:rPr>
-          <w:lang w:val="pt-PT"/>
-        </w:rPr>
-      </w:pPr>
-    </w:p>
-    <w:p>
-      <w:pPr>
-        <w:spacing w:after="0" w:line="360" w:lineRule="auto"/>
-        <w:jc w:val="both"/>
-        <w:rPr>
-          <w:lang w:val="pt-PT"/>
-        </w:rPr>
-      </w:pPr>
-      <w:r>
-        <w:rPr>
-          <w:rFonts w:ascii="Times New Roman" w:hAnsi="Times New Roman"/>
-          <w:i/>
-          <w:sz w:val="24"/>
-          <w:lang w:val="pt-PT"/>
-        </w:rPr>
-        <w:t>Palavras-chave: aplicação web progressiva, inteligência artificial no browser, análise corporal, MediaPipe Pose, privacy by design, gamificação, Node.js, PostgreSQL.</w:t>
-      </w:r>
-    </w:p>
-    <w:p>
-      <w:pPr>
-        <w:rPr>
-          <w:lang w:val="pt-PT"/>
-        </w:rPr>
-      </w:pPr>
-      <w:r>
-        <w:rPr>
-          <w:lang w:val="pt-PT"/>
-        </w:rPr>
-        <w:br w:type="page"/>
-      </w:r>
-    </w:p>
-    <w:p>
-      <w:pPr>
-        <w:spacing w:after="120" w:line="360" w:lineRule="auto"/>
-        <w:outlineLvl w:val="0"/>
-      </w:pPr>
-      <w:r>
-        <w:rPr>
-          <w:rFonts w:ascii="Times New Roman" w:hAnsi="Times New Roman"/>
-          <w:b/>
-          <w:sz w:val="32"/>
+          <w:rFonts w:ascii="Times New Roman" w:hAnsi="Times New Roman" w:cs="Times New Roman"/>
+          <w:sz w:val="24"/>
+          <w:lang w:val="pt-PT"/>
+        </w:rPr>
+      </w:pPr>
+      <w:r>
+        <w:rPr>
+          <w:rFonts w:ascii="Times New Roman" w:hAnsi="Times New Roman" w:cs="Times New Roman"/>
+          <w:sz w:val="24"/>
+          <w:lang w:val="pt-PT"/>
+        </w:rPr>
+        <w:t xml:space="preserve">O desenvolvimento seguiu uma metodologia mista, iterativa e incremental no processo de desenvolvimento de software e descritiva na análise das opções tecnológicas. A dimensão qualitativa incluiu uma entrevista semiestruturada a um personal trainer para levantamento de requisitos de exercício e validação de categorias de segurança, e análise comparativa de aplicações concorrentes. O artefacto digital foi construído em HTML5, CSS3 e JavaScript sem dependência de frameworks no frontend, com modelos de inteligência artificial a executar no navegador, e uma interface de programação em Node.js com Express e PostgreSQL no backend. </w:t>
+      </w:r>
+      <w:r>
+        <w:rPr>
+          <w:rFonts w:ascii="Times New Roman" w:hAnsi="Times New Roman" w:cs="Times New Roman"/>
+          <w:sz w:val="24"/>
+          <w:lang w:val="pt-PT"/>
         </w:rPr>
         <w:lastRenderedPageBreak/>
-        <w:t>ABSTRACT</w:t>
+        <w:t>A validação foi conduzida a três níveis: testes unitários das funções de cálculo e validação; testes de integração dos fluxos de autenticação e operações de dados; e testes de ponta a ponta do fluxo completo do utilizador em múltiplos navegadores.</w:t>
       </w:r>
     </w:p>
     <w:p>
@@ -519,13 +471,19 @@
         <w:spacing w:after="0" w:line="360" w:lineRule="auto"/>
         <w:ind w:firstLine="680"/>
         <w:jc w:val="both"/>
-      </w:pPr>
-      <w:r>
-        <w:rPr>
-          <w:rFonts w:ascii="Times New Roman" w:hAnsi="Times New Roman"/>
-          <w:sz w:val="24"/>
-        </w:rPr>
-        <w:t>This academic project describes the development of FiX-it, a Progressive Web App (PWA) for AI-assisted body composition analysis. The application was built to democratise access to physical fitness monitoring tools by removing the cost and privacy barriers typical of existing commercial solutions. Its central innovation lies in the fully client-side execution of machine learning models — MediaPipe Pose, BodyPix, and MobileNet via TensorFlow.js —, ensuring that body images never leave the user's device during analysis.</w:t>
+        <w:rPr>
+          <w:rFonts w:ascii="Times New Roman" w:hAnsi="Times New Roman" w:cs="Times New Roman"/>
+          <w:sz w:val="24"/>
+          <w:lang w:val="pt-PT"/>
+        </w:rPr>
+      </w:pPr>
+      <w:r>
+        <w:rPr>
+          <w:rFonts w:ascii="Times New Roman" w:hAnsi="Times New Roman" w:cs="Times New Roman"/>
+          <w:sz w:val="24"/>
+          <w:lang w:val="pt-PT"/>
+        </w:rPr>
+        <w:t>O FiX-it atingiu o estado de implementação plena dos módulos de análise corporal, orientação de treino, nutrição, assistente virtual e sistema de pontuação com conquistas e desafios semanais. A validação informal confirmou a adequação do modelo em condições favoráveis e a degradação de precisão em poses de perfil e contraluz, posicionando a aplicação como ferramenta motivacional e não como dispositivo de diagnóstico clínico. A pontuação de acessibilidade de noventa e quatro em cem e o rácio de contraste de dezoito vírgula três para um confirmaram a conformidade com os critérios de acessibilidade de nível AA. Dois obstáculos técnicos foram superados durante o desenvolvimento: a substituição da integração de correio eletrónico por protocolo de transferência por uma interface de programação transacional, garantindo a entrega a endereços externos; e a reformulação do fluxo de autenticação para consultar sempre o servidor antes do estado local, resolvendo a dessincronização de dados entre dispositivos.</w:t>
       </w:r>
     </w:p>
     <w:p>
@@ -533,13 +491,19 @@
         <w:spacing w:after="0" w:line="360" w:lineRule="auto"/>
         <w:ind w:firstLine="680"/>
         <w:jc w:val="both"/>
-      </w:pPr>
-      <w:r>
-        <w:rPr>
-          <w:rFonts w:ascii="Times New Roman" w:hAnsi="Times New Roman"/>
-          <w:sz w:val="24"/>
-        </w:rPr>
-        <w:t>The system integrates body composition analysis estimating six biometric metrics, workout guidance with a library of approximately sixty exercises, nutritional guidance with a macro calculator, a virtual coach with four distinct personalities, and a gamification system with points, levels, achievements, and weekly challenges. The backend, built with Node.js, Express, and PostgreSQL, exposes fifty-eight REST endpoints organised by functional domain and implements JWT authentication with automatic token refresh.</w:t>
+        <w:rPr>
+          <w:rFonts w:ascii="Times New Roman" w:hAnsi="Times New Roman" w:cs="Times New Roman"/>
+          <w:sz w:val="24"/>
+          <w:lang w:val="pt-PT"/>
+        </w:rPr>
+      </w:pPr>
+      <w:r>
+        <w:rPr>
+          <w:rFonts w:ascii="Times New Roman" w:hAnsi="Times New Roman" w:cs="Times New Roman"/>
+          <w:sz w:val="24"/>
+          <w:lang w:val="pt-PT"/>
+        </w:rPr>
+        <w:t>O projeto confirmou empiricamente que é tecnicamente viável construir uma aplicação web de análise corporal assistida por inteligência artificial, gratuita, privada e multiplataforma, dentro das restrições de um projeto académico individual. A execução dos modelos no próprio dispositivo do utilizador materializou a privacidade por conceção sem comprometer a riqueza funcional. O trabalho contribuiu com dados empíricos sobre os limiares de precisão e as condições de falha dos modelos de análise corporal bidimensional no navegador, num domínio ainda escasso em validações práticas. O trabalho futuro deverá priorizar a expansão da base nutricional, a exploração de modelos de linguagem executáveis no navegador para o assistente virtual e a condução de um estudo longitudinal sobre o impacto do sistema de gamificação na adesão a hábitos saudáveis.</w:t>
       </w:r>
     </w:p>
     <w:p>
@@ -547,44 +511,38 @@
         <w:spacing w:after="0" w:line="360" w:lineRule="auto"/>
         <w:ind w:firstLine="680"/>
         <w:jc w:val="both"/>
-      </w:pPr>
-      <w:r>
-        <w:rPr>
-          <w:rFonts w:ascii="Times New Roman" w:hAnsi="Times New Roman"/>
-          <w:sz w:val="24"/>
-        </w:rPr>
-        <w:t>The backend additionally implements real-time cross-device synchronisation, consolidating data from 15 database tables into a single parallel server call. Development followed an iterative and incremental agile methodology adapted to an individual academic project context.</w:t>
-      </w:r>
-      <w:r>
-        <w:rPr>
-          <w:rFonts w:ascii="Times New Roman" w:hAnsi="Times New Roman"/>
-          <w:sz w:val="24"/>
-        </w:rPr>
-        <w:t xml:space="preserve"> Theoretical grounding relied on fifteen bibliographic sources published between 2023 and 2025, covering REST architecture, AI requirements engineering, agile methodology, camera-based body composition estimation, and web accessibility.</w:t>
-      </w:r>
+        <w:rPr>
+          <w:rFonts w:ascii="Times New Roman" w:hAnsi="Times New Roman" w:cs="Times New Roman"/>
+          <w:sz w:val="24"/>
+          <w:lang w:val="pt-PT"/>
+        </w:rPr>
+      </w:pPr>
     </w:p>
     <w:p>
       <w:pPr>
         <w:spacing w:after="0" w:line="360" w:lineRule="auto"/>
         <w:jc w:val="both"/>
-      </w:pPr>
-    </w:p>
-    <w:p>
-      <w:pPr>
-        <w:spacing w:after="0" w:line="360" w:lineRule="auto"/>
-        <w:jc w:val="both"/>
-      </w:pPr>
-      <w:r>
-        <w:rPr>
-          <w:rFonts w:ascii="Times New Roman" w:hAnsi="Times New Roman"/>
-          <w:i/>
-          <w:sz w:val="24"/>
-        </w:rPr>
-        <w:t>Keywords: progressive web app, browser AI, body analysis, MediaPipe Pose, privacy by design, gamification, Node.js, PostgreSQL.</w:t>
-      </w:r>
-    </w:p>
-    <w:p>
-      <w:r>
+        <w:rPr>
+          <w:lang w:val="pt-PT"/>
+        </w:rPr>
+      </w:pPr>
+      <w:r>
+        <w:rPr>
+          <w:lang w:val="pt-PT"/>
+        </w:rPr>
+        <w:t>Palavras-chave: Aplicação Web Progressiva, Inteligência Artificial, Análise Corporal, Privacy by Design, Gamificação.</w:t>
+      </w:r>
+    </w:p>
+    <w:p>
+      <w:pPr>
+        <w:rPr>
+          <w:lang w:val="pt-PT"/>
+        </w:rPr>
+      </w:pPr>
+      <w:r>
+        <w:rPr>
+          <w:lang w:val="pt-PT"/>
+        </w:rPr>
         <w:br w:type="page"/>
       </w:r>
     </w:p>
@@ -592,741 +550,15 @@
       <w:pPr>
         <w:spacing w:after="120" w:line="360" w:lineRule="auto"/>
         <w:outlineLvl w:val="0"/>
-        <w:rPr>
-          <w:lang w:val="pt-PT"/>
-        </w:rPr>
       </w:pPr>
       <w:r>
         <w:rPr>
           <w:rFonts w:ascii="Times New Roman" w:hAnsi="Times New Roman"/>
           <w:b/>
           <w:sz w:val="32"/>
-          <w:lang w:val="pt-PT"/>
         </w:rPr>
         <w:lastRenderedPageBreak/>
-        <w:t>ABREVIATURAS</w:t>
-      </w:r>
-    </w:p>
-    <w:p>
-      <w:pPr>
-        <w:spacing w:after="60" w:line="360" w:lineRule="auto"/>
-        <w:rPr>
-          <w:lang w:val="pt-PT"/>
-        </w:rPr>
-      </w:pPr>
-      <w:r>
-        <w:rPr>
-          <w:rFonts w:ascii="Times New Roman" w:hAnsi="Times New Roman"/>
-          <w:b/>
-          <w:lang w:val="pt-PT"/>
-        </w:rPr>
-        <w:t xml:space="preserve">API           </w:t>
-      </w:r>
-      <w:r>
-        <w:rPr>
-          <w:rFonts w:ascii="Times New Roman" w:hAnsi="Times New Roman"/>
-          <w:lang w:val="pt-PT"/>
-        </w:rPr>
-        <w:t>— Application Programming Interface (Interface de Programação de Aplicações)</w:t>
-      </w:r>
-    </w:p>
-    <w:p>
-      <w:pPr>
-        <w:spacing w:after="60" w:line="360" w:lineRule="auto"/>
-      </w:pPr>
-      <w:r>
-        <w:rPr>
-          <w:rFonts w:ascii="Times New Roman" w:hAnsi="Times New Roman"/>
-          <w:b/>
-        </w:rPr>
-        <w:t xml:space="preserve">CSS           </w:t>
-      </w:r>
-      <w:r>
-        <w:rPr>
-          <w:rFonts w:ascii="Times New Roman" w:hAnsi="Times New Roman"/>
-        </w:rPr>
-        <w:t>— Cascading Style Sheets</w:t>
-      </w:r>
-    </w:p>
-    <w:p>
-      <w:pPr>
-        <w:spacing w:after="60" w:line="360" w:lineRule="auto"/>
-      </w:pPr>
-      <w:r>
-        <w:rPr>
-          <w:rFonts w:ascii="Times New Roman" w:hAnsi="Times New Roman"/>
-          <w:b/>
-        </w:rPr>
-        <w:t xml:space="preserve">CRUD          </w:t>
-      </w:r>
-      <w:r>
-        <w:rPr>
-          <w:rFonts w:ascii="Times New Roman" w:hAnsi="Times New Roman"/>
-        </w:rPr>
-        <w:t>— Create, Read, Update, Delete</w:t>
-      </w:r>
-    </w:p>
-    <w:p>
-      <w:pPr>
-        <w:spacing w:after="60" w:line="360" w:lineRule="auto"/>
-        <w:rPr>
-          <w:lang w:val="pt-PT"/>
-        </w:rPr>
-      </w:pPr>
-      <w:r>
-        <w:rPr>
-          <w:rFonts w:ascii="Times New Roman" w:hAnsi="Times New Roman"/>
-          <w:b/>
-          <w:lang w:val="pt-PT"/>
-        </w:rPr>
-        <w:t xml:space="preserve">DEXA          </w:t>
-      </w:r>
-      <w:r>
-        <w:rPr>
-          <w:rFonts w:ascii="Times New Roman" w:hAnsi="Times New Roman"/>
-          <w:lang w:val="pt-PT"/>
-        </w:rPr>
-        <w:t>— Dual-Energy X-ray Absorptiometry (Absorciometria de Raios-X de Dupla Energia)</w:t>
-      </w:r>
-    </w:p>
-    <w:p>
-      <w:pPr>
-        <w:spacing w:after="60" w:line="360" w:lineRule="auto"/>
-      </w:pPr>
-      <w:r>
-        <w:rPr>
-          <w:rFonts w:ascii="Times New Roman" w:hAnsi="Times New Roman"/>
-          <w:b/>
-        </w:rPr>
-        <w:t xml:space="preserve">GDPR          </w:t>
-      </w:r>
-      <w:r>
-        <w:rPr>
-          <w:rFonts w:ascii="Times New Roman" w:hAnsi="Times New Roman"/>
-        </w:rPr>
-        <w:t>— General Data Protection Regulation — cf. RGPD</w:t>
-      </w:r>
-    </w:p>
-    <w:p>
-      <w:pPr>
-        <w:spacing w:after="60" w:line="360" w:lineRule="auto"/>
-      </w:pPr>
-      <w:r>
-        <w:rPr>
-          <w:rFonts w:ascii="Times New Roman" w:hAnsi="Times New Roman"/>
-          <w:b/>
-        </w:rPr>
-        <w:t xml:space="preserve">HTML          </w:t>
-      </w:r>
-      <w:r>
-        <w:rPr>
-          <w:rFonts w:ascii="Times New Roman" w:hAnsi="Times New Roman"/>
-        </w:rPr>
-        <w:t>— Hypertext Markup Language</w:t>
-      </w:r>
-    </w:p>
-    <w:p>
-      <w:pPr>
-        <w:spacing w:after="60" w:line="360" w:lineRule="auto"/>
-      </w:pPr>
-      <w:r>
-        <w:rPr>
-          <w:rFonts w:ascii="Times New Roman" w:hAnsi="Times New Roman"/>
-          <w:b/>
-        </w:rPr>
-        <w:t xml:space="preserve">HTTP/HTTPS    </w:t>
-      </w:r>
-      <w:r>
-        <w:rPr>
-          <w:rFonts w:ascii="Times New Roman" w:hAnsi="Times New Roman"/>
-        </w:rPr>
-        <w:t>— Hypertext Transfer Protocol / Secure</w:t>
-      </w:r>
-    </w:p>
-    <w:p>
-      <w:pPr>
-        <w:spacing w:after="60" w:line="360" w:lineRule="auto"/>
-        <w:rPr>
-          <w:lang w:val="pt-PT"/>
-        </w:rPr>
-      </w:pPr>
-      <w:r>
-        <w:rPr>
-          <w:rFonts w:ascii="Times New Roman" w:hAnsi="Times New Roman"/>
-          <w:b/>
-          <w:lang w:val="pt-PT"/>
-        </w:rPr>
-        <w:t xml:space="preserve">IA            </w:t>
-      </w:r>
-      <w:r>
-        <w:rPr>
-          <w:rFonts w:ascii="Times New Roman" w:hAnsi="Times New Roman"/>
-          <w:lang w:val="pt-PT"/>
-        </w:rPr>
-        <w:t>— Inteligência Artificial</w:t>
-      </w:r>
-    </w:p>
-    <w:p>
-      <w:pPr>
-        <w:spacing w:after="60" w:line="360" w:lineRule="auto"/>
-        <w:rPr>
-          <w:lang w:val="pt-PT"/>
-        </w:rPr>
-      </w:pPr>
-      <w:r>
-        <w:rPr>
-          <w:rFonts w:ascii="Times New Roman" w:hAnsi="Times New Roman"/>
-          <w:b/>
-          <w:lang w:val="pt-PT"/>
-        </w:rPr>
-        <w:t xml:space="preserve">JS            </w:t>
-      </w:r>
-      <w:r>
-        <w:rPr>
-          <w:rFonts w:ascii="Times New Roman" w:hAnsi="Times New Roman"/>
-          <w:lang w:val="pt-PT"/>
-        </w:rPr>
-        <w:t>— JavaScript</w:t>
-      </w:r>
-    </w:p>
-    <w:p>
-      <w:pPr>
-        <w:spacing w:after="60" w:line="360" w:lineRule="auto"/>
-        <w:rPr>
-          <w:lang w:val="pt-PT"/>
-        </w:rPr>
-      </w:pPr>
-      <w:r>
-        <w:rPr>
-          <w:rFonts w:ascii="Times New Roman" w:hAnsi="Times New Roman"/>
-          <w:b/>
-          <w:lang w:val="pt-PT"/>
-        </w:rPr>
-        <w:t xml:space="preserve">JWT           </w:t>
-      </w:r>
-      <w:r>
-        <w:rPr>
-          <w:rFonts w:ascii="Times New Roman" w:hAnsi="Times New Roman"/>
-          <w:lang w:val="pt-PT"/>
-        </w:rPr>
-        <w:t>— JSON Web Token</w:t>
-      </w:r>
-    </w:p>
-    <w:p>
-      <w:pPr>
-        <w:spacing w:after="60" w:line="360" w:lineRule="auto"/>
-        <w:rPr>
-          <w:lang w:val="pt-PT"/>
-        </w:rPr>
-      </w:pPr>
-      <w:r>
-        <w:rPr>
-          <w:rFonts w:ascii="Times New Roman" w:hAnsi="Times New Roman"/>
-          <w:b/>
-          <w:lang w:val="pt-PT"/>
-        </w:rPr>
-        <w:t xml:space="preserve">PWA           </w:t>
-      </w:r>
-      <w:r>
-        <w:rPr>
-          <w:rFonts w:ascii="Times New Roman" w:hAnsi="Times New Roman"/>
-          <w:lang w:val="pt-PT"/>
-        </w:rPr>
-        <w:t>— Progressive Web App (Aplicação Web Progressiva)</w:t>
-      </w:r>
-    </w:p>
-    <w:p>
-      <w:pPr>
-        <w:spacing w:after="60" w:line="360" w:lineRule="auto"/>
-        <w:rPr>
-          <w:lang w:val="pt-PT"/>
-        </w:rPr>
-      </w:pPr>
-      <w:r>
-        <w:rPr>
-          <w:rFonts w:ascii="Times New Roman" w:hAnsi="Times New Roman"/>
-          <w:b/>
-          <w:lang w:val="pt-PT"/>
-        </w:rPr>
-        <w:t xml:space="preserve">REST          </w:t>
-      </w:r>
-      <w:r>
-        <w:rPr>
-          <w:rFonts w:ascii="Times New Roman" w:hAnsi="Times New Roman"/>
-          <w:lang w:val="pt-PT"/>
-        </w:rPr>
-        <w:t>— Representational State Transfer</w:t>
-      </w:r>
-    </w:p>
-    <w:p>
-      <w:pPr>
-        <w:spacing w:after="60" w:line="360" w:lineRule="auto"/>
-        <w:rPr>
-          <w:lang w:val="pt-PT"/>
-        </w:rPr>
-      </w:pPr>
-      <w:r>
-        <w:rPr>
-          <w:rFonts w:ascii="Times New Roman" w:hAnsi="Times New Roman"/>
-          <w:b/>
-          <w:lang w:val="pt-PT"/>
-        </w:rPr>
-        <w:t xml:space="preserve">RGPD          </w:t>
-      </w:r>
-      <w:r>
-        <w:rPr>
-          <w:rFonts w:ascii="Times New Roman" w:hAnsi="Times New Roman"/>
-          <w:lang w:val="pt-PT"/>
-        </w:rPr>
-        <w:t>— Regulamento Geral sobre a Proteção de Dados</w:t>
-      </w:r>
-    </w:p>
-    <w:p>
-      <w:pPr>
-        <w:spacing w:after="60" w:line="360" w:lineRule="auto"/>
-        <w:rPr>
-          <w:lang w:val="pt-PT"/>
-        </w:rPr>
-      </w:pPr>
-      <w:r>
-        <w:rPr>
-          <w:rFonts w:ascii="Times New Roman" w:hAnsi="Times New Roman"/>
-          <w:b/>
-          <w:lang w:val="pt-PT"/>
-        </w:rPr>
-        <w:t xml:space="preserve">SPA           </w:t>
-      </w:r>
-      <w:r>
-        <w:rPr>
-          <w:rFonts w:ascii="Times New Roman" w:hAnsi="Times New Roman"/>
-          <w:lang w:val="pt-PT"/>
-        </w:rPr>
-        <w:t>— Single-Page Application (Aplicação de Página Única)</w:t>
-      </w:r>
-    </w:p>
-    <w:p>
-      <w:pPr>
-        <w:spacing w:after="60" w:line="360" w:lineRule="auto"/>
-        <w:rPr>
-          <w:lang w:val="pt-PT"/>
-        </w:rPr>
-      </w:pPr>
-      <w:r>
-        <w:rPr>
-          <w:rFonts w:ascii="Times New Roman" w:hAnsi="Times New Roman"/>
-          <w:b/>
-          <w:lang w:val="pt-PT"/>
-        </w:rPr>
-        <w:t xml:space="preserve">SQL           </w:t>
-      </w:r>
-      <w:r>
-        <w:rPr>
-          <w:rFonts w:ascii="Times New Roman" w:hAnsi="Times New Roman"/>
-          <w:lang w:val="pt-PT"/>
-        </w:rPr>
-        <w:t>— Structured Query Language</w:t>
-      </w:r>
-    </w:p>
-    <w:p>
-      <w:pPr>
-        <w:spacing w:after="60" w:line="360" w:lineRule="auto"/>
-        <w:rPr>
-          <w:lang w:val="pt-PT"/>
-        </w:rPr>
-      </w:pPr>
-      <w:r>
-        <w:rPr>
-          <w:rFonts w:ascii="Times New Roman" w:hAnsi="Times New Roman"/>
-          <w:b/>
-          <w:lang w:val="pt-PT"/>
-        </w:rPr>
-        <w:t xml:space="preserve">UI            </w:t>
-      </w:r>
-      <w:r>
-        <w:rPr>
-          <w:rFonts w:ascii="Times New Roman" w:hAnsi="Times New Roman"/>
-          <w:lang w:val="pt-PT"/>
-        </w:rPr>
-        <w:t>— User Interface (Interface do Utilizador)</w:t>
-      </w:r>
-    </w:p>
-    <w:p>
-      <w:pPr>
-        <w:spacing w:after="60" w:line="360" w:lineRule="auto"/>
-        <w:rPr>
-          <w:lang w:val="pt-PT"/>
-        </w:rPr>
-      </w:pPr>
-      <w:r>
-        <w:rPr>
-          <w:rFonts w:ascii="Times New Roman" w:hAnsi="Times New Roman"/>
-          <w:b/>
-          <w:lang w:val="pt-PT"/>
-        </w:rPr>
-        <w:t xml:space="preserve">UX            </w:t>
-      </w:r>
-      <w:r>
-        <w:rPr>
-          <w:rFonts w:ascii="Times New Roman" w:hAnsi="Times New Roman"/>
-          <w:lang w:val="pt-PT"/>
-        </w:rPr>
-        <w:t>— User Experience (Experiência do Utilizador)</w:t>
-      </w:r>
-    </w:p>
-    <w:p>
-      <w:pPr>
-        <w:spacing w:after="60" w:line="360" w:lineRule="auto"/>
-        <w:rPr>
-          <w:lang w:val="pt-PT"/>
-        </w:rPr>
-      </w:pPr>
-      <w:r>
-        <w:rPr>
-          <w:rFonts w:ascii="Times New Roman" w:hAnsi="Times New Roman"/>
-          <w:b/>
-          <w:lang w:val="pt-PT"/>
-        </w:rPr>
-        <w:t xml:space="preserve">WCAG          </w:t>
-      </w:r>
-      <w:r>
-        <w:rPr>
-          <w:rFonts w:ascii="Times New Roman" w:hAnsi="Times New Roman"/>
-          <w:lang w:val="pt-PT"/>
-        </w:rPr>
-        <w:t>— Web Content Accessibility Guidelines</w:t>
-      </w:r>
-    </w:p>
-    <w:p>
-      <w:pPr>
-        <w:spacing w:after="60" w:line="360" w:lineRule="auto"/>
-        <w:rPr>
-          <w:lang w:val="pt-PT"/>
-        </w:rPr>
-      </w:pPr>
-      <w:r>
-        <w:rPr>
-          <w:rFonts w:ascii="Times New Roman" w:hAnsi="Times New Roman"/>
-          <w:b/>
-          <w:lang w:val="pt-PT"/>
-        </w:rPr>
-        <w:t xml:space="preserve">XP            </w:t>
-      </w:r>
-      <w:r>
-        <w:rPr>
-          <w:rFonts w:ascii="Times New Roman" w:hAnsi="Times New Roman"/>
-          <w:lang w:val="pt-PT"/>
-        </w:rPr>
-        <w:t>— Experience Points (Pontos de Experiência)</w:t>
-      </w:r>
-    </w:p>
-    <w:p>
-      <w:pPr>
-        <w:rPr>
-          <w:lang w:val="pt-PT"/>
-        </w:rPr>
-      </w:pPr>
-      <w:r>
-        <w:rPr>
-          <w:lang w:val="pt-PT"/>
-        </w:rPr>
-        <w:br w:type="page"/>
-      </w:r>
-    </w:p>
-    <w:p>
-      <w:pPr>
-        <w:spacing w:after="160" w:line="360" w:lineRule="auto"/>
-        <w:outlineLvl w:val="0"/>
-        <w:rPr>
-          <w:lang w:val="pt-PT"/>
-        </w:rPr>
-      </w:pPr>
-      <w:r>
-        <w:rPr>
-          <w:rFonts w:ascii="Times New Roman" w:hAnsi="Times New Roman"/>
-          <w:b/>
-          <w:sz w:val="32"/>
-          <w:lang w:val="pt-PT"/>
-        </w:rPr>
-        <w:lastRenderedPageBreak/>
-        <w:t>ÍNDICE</w:t>
-      </w:r>
-    </w:p>
-    <w:p>
-      <w:pPr>
-        <w:rPr>
-          <w:lang w:val="pt-PT"/>
-        </w:rPr>
-      </w:pPr>
-      <w:r>
-        <w:fldChar w:fldCharType="begin"/>
-      </w:r>
-      <w:r>
-        <w:rPr>
-          <w:lang w:val="pt-PT"/>
-        </w:rPr>
-        <w:instrText xml:space="preserve"> TOC \h \z \u </w:instrText>
-      </w:r>
-      <w:r>
-        <w:fldChar w:fldCharType="separate"/>
-      </w:r>
-      <w:r>
-        <w:fldChar w:fldCharType="end"/>
-      </w:r>
-    </w:p>
-    <w:p>
-      <w:pPr>
-        <w:rPr>
-          <w:lang w:val="pt-PT"/>
-        </w:rPr>
-      </w:pPr>
-      <w:r>
-        <w:rPr>
-          <w:rFonts w:ascii="Times New Roman" w:hAnsi="Times New Roman"/>
-          <w:i/>
-          <w:sz w:val="20"/>
-          <w:lang w:val="pt-PT"/>
-        </w:rPr>
-        <w:t>(Clique direito → Atualizar Campo para gerar o índice completo)</w:t>
-      </w:r>
-    </w:p>
-    <w:p>
-      <w:pPr>
-        <w:rPr>
-          <w:lang w:val="pt-PT"/>
-        </w:rPr>
-      </w:pPr>
-      <w:r>
-        <w:rPr>
-          <w:lang w:val="pt-PT"/>
-        </w:rPr>
-        <w:br w:type="page"/>
-      </w:r>
-    </w:p>
-    <w:p>
-      <w:pPr>
-        <w:spacing w:after="120" w:line="360" w:lineRule="auto"/>
-        <w:outlineLvl w:val="0"/>
-        <w:rPr>
-          <w:lang w:val="pt-PT"/>
-        </w:rPr>
-      </w:pPr>
-      <w:r>
-        <w:rPr>
-          <w:rFonts w:ascii="Times New Roman" w:hAnsi="Times New Roman"/>
-          <w:b/>
-          <w:sz w:val="32"/>
-          <w:lang w:val="pt-PT"/>
-        </w:rPr>
-        <w:lastRenderedPageBreak/>
-        <w:t>ÍNDICE DE FIGURAS</w:t>
-      </w:r>
-    </w:p>
-    <w:p>
-      <w:pPr>
-        <w:spacing w:after="0" w:line="360" w:lineRule="auto"/>
-        <w:jc w:val="both"/>
-      </w:pPr>
-      <w:r>
-        <w:rPr>
-          <w:rFonts w:ascii="Times New Roman" w:hAnsi="Times New Roman"/>
-          <w:sz w:val="24"/>
-          <w:lang w:val="pt-PT"/>
-        </w:rPr>
-        <w:t xml:space="preserve">Figura 1. Diagrama de arquitetura de três camadas do FiX-it ..................... </w:t>
-      </w:r>
-      <w:r>
-        <w:rPr>
-          <w:rFonts w:ascii="Times New Roman" w:hAnsi="Times New Roman"/>
-          <w:sz w:val="24"/>
-        </w:rPr>
-        <w:t>[p.]</w:t>
-      </w:r>
-    </w:p>
-    <w:p>
-      <w:pPr>
-        <w:spacing w:after="0" w:line="360" w:lineRule="auto"/>
-        <w:jc w:val="both"/>
-        <w:rPr>
-          <w:lang w:val="pt-PT"/>
-        </w:rPr>
-      </w:pPr>
-      <w:r>
-        <w:rPr>
-          <w:rFonts w:ascii="Times New Roman" w:hAnsi="Times New Roman"/>
-          <w:sz w:val="24"/>
-          <w:lang w:val="pt-PT"/>
-        </w:rPr>
-        <w:t>Figura 2. Fluxo de análise: pré-processamento → MediaPipe Pose → cálculo de métricas  [p.]</w:t>
-      </w:r>
-    </w:p>
-    <w:p>
-      <w:pPr>
-        <w:spacing w:after="0" w:line="360" w:lineRule="auto"/>
-        <w:jc w:val="both"/>
-        <w:rPr>
-          <w:lang w:val="pt-PT"/>
-        </w:rPr>
-      </w:pPr>
-    </w:p>
-    <w:p>
-      <w:pPr>
-        <w:spacing w:after="0" w:line="360" w:lineRule="auto"/>
-        <w:jc w:val="both"/>
-        <w:rPr>
-          <w:lang w:val="pt-PT"/>
-        </w:rPr>
-      </w:pPr>
-      <w:r>
-        <w:rPr>
-          <w:rFonts w:ascii="Times New Roman" w:hAnsi="Times New Roman"/>
-          <w:i/>
-          <w:sz w:val="20"/>
-          <w:lang w:val="pt-PT"/>
-        </w:rPr>
-        <w:t>[Atualizar números de página após inserir as figuras no documento.]</w:t>
-      </w:r>
-    </w:p>
-    <w:p>
-      <w:pPr>
-        <w:rPr>
-          <w:lang w:val="pt-PT"/>
-        </w:rPr>
-      </w:pPr>
-      <w:r>
-        <w:rPr>
-          <w:lang w:val="pt-PT"/>
-        </w:rPr>
-        <w:br w:type="page"/>
-      </w:r>
-    </w:p>
-    <w:p>
-      <w:pPr>
-        <w:spacing w:after="120" w:line="360" w:lineRule="auto"/>
-        <w:outlineLvl w:val="0"/>
-        <w:rPr>
-          <w:lang w:val="pt-PT"/>
-        </w:rPr>
-      </w:pPr>
-      <w:r>
-        <w:rPr>
-          <w:rFonts w:ascii="Times New Roman" w:hAnsi="Times New Roman"/>
-          <w:b/>
-          <w:sz w:val="32"/>
-          <w:lang w:val="pt-PT"/>
-        </w:rPr>
-        <w:lastRenderedPageBreak/>
-        <w:t>ÍNDICE DE TABELAS</w:t>
-      </w:r>
-    </w:p>
-    <w:p>
-      <w:pPr>
-        <w:spacing w:after="0" w:line="360" w:lineRule="auto"/>
-        <w:jc w:val="both"/>
-        <w:rPr>
-          <w:lang w:val="pt-PT"/>
-        </w:rPr>
-      </w:pPr>
-      <w:r>
-        <w:rPr>
-          <w:rFonts w:ascii="Times New Roman" w:hAnsi="Times New Roman"/>
-          <w:sz w:val="24"/>
-          <w:lang w:val="pt-PT"/>
-        </w:rPr>
-        <w:t>Tabela 1. Distribuição das 21 tabelas pelos três grupos funcionais da base de dados  [p.]</w:t>
-      </w:r>
-    </w:p>
-    <w:p>
-      <w:pPr>
-        <w:spacing w:after="0" w:line="360" w:lineRule="auto"/>
-        <w:jc w:val="both"/>
-        <w:rPr>
-          <w:lang w:val="pt-PT"/>
-        </w:rPr>
-      </w:pPr>
-      <w:r>
-        <w:rPr>
-          <w:rFonts w:ascii="Times New Roman" w:hAnsi="Times New Roman"/>
-          <w:sz w:val="24"/>
-          <w:lang w:val="pt-PT"/>
-        </w:rPr>
-        <w:t>Tabela 2. Calendarização das sete etapas do projeto FiX-it (ano letivo 2025/2026) .. [p.]</w:t>
-      </w:r>
-    </w:p>
-    <w:p>
-      <w:pPr>
-        <w:spacing w:after="0" w:line="360" w:lineRule="auto"/>
-        <w:jc w:val="both"/>
-        <w:rPr>
-          <w:lang w:val="pt-PT"/>
-        </w:rPr>
-      </w:pPr>
-    </w:p>
-    <w:p>
-      <w:pPr>
-        <w:spacing w:after="0" w:line="360" w:lineRule="auto"/>
-        <w:jc w:val="both"/>
-        <w:rPr>
-          <w:lang w:val="pt-PT"/>
-        </w:rPr>
-      </w:pPr>
-      <w:r>
-        <w:rPr>
-          <w:rFonts w:ascii="Times New Roman" w:hAnsi="Times New Roman"/>
-          <w:i/>
-          <w:sz w:val="20"/>
-          <w:lang w:val="pt-PT"/>
-        </w:rPr>
-        <w:t>[Atualizar números de página após inserir as tabelas no documento.]</w:t>
-      </w:r>
-    </w:p>
-    <w:p>
-      <w:pPr>
-        <w:rPr>
-          <w:lang w:val="pt-PT"/>
-        </w:rPr>
-      </w:pPr>
-      <w:r>
-        <w:rPr>
-          <w:lang w:val="pt-PT"/>
-        </w:rPr>
-        <w:br w:type="page"/>
-      </w:r>
-    </w:p>
-    <w:p>
-      <w:pPr>
-        <w:spacing w:after="120" w:line="360" w:lineRule="auto"/>
-        <w:outlineLvl w:val="0"/>
-        <w:rPr>
-          <w:lang w:val="pt-PT"/>
-        </w:rPr>
-      </w:pPr>
-      <w:r>
-        <w:rPr>
-          <w:rFonts w:ascii="Times New Roman" w:hAnsi="Times New Roman"/>
-          <w:b/>
-          <w:sz w:val="32"/>
-          <w:lang w:val="pt-PT"/>
-        </w:rPr>
-        <w:lastRenderedPageBreak/>
-        <w:t>INTRODUÇÃO</w:t>
-      </w:r>
-    </w:p>
-    <w:p>
-      <w:pPr>
-        <w:spacing w:before="200" w:after="80" w:line="360" w:lineRule="auto"/>
-        <w:outlineLvl w:val="1"/>
-        <w:rPr>
-          <w:lang w:val="pt-PT"/>
-        </w:rPr>
-      </w:pPr>
-      <w:r>
-        <w:rPr>
-          <w:rFonts w:ascii="Times New Roman" w:hAnsi="Times New Roman"/>
-          <w:b/>
-          <w:sz w:val="28"/>
-          <w:lang w:val="pt-PT"/>
-        </w:rPr>
-        <w:t>1.1 Contexto e Motivação</w:t>
+        <w:t>ABSTRACT</w:t>
       </w:r>
     </w:p>
     <w:p>
@@ -1335,16 +567,16 @@
         <w:ind w:firstLine="680"/>
         <w:jc w:val="both"/>
         <w:rPr>
-          <w:lang w:val="pt-PT"/>
-        </w:rPr>
-      </w:pPr>
-      <w:r>
-        <w:rPr>
-          <w:rFonts w:ascii="Times New Roman" w:hAnsi="Times New Roman"/>
-          <w:sz w:val="24"/>
-          <w:lang w:val="pt-PT"/>
-        </w:rPr>
-        <w:t>O crescimento exponencial das aplicações de fitness digitais nos últimos anos criou um paradoxo: enquanto a oferta de ferramentas para monitorização da condição física nunca foi tão vasta, o acesso equitativo a soluções de qualidade permanece limitado por barreiras económicas, tecnológicas e de privacidade. As soluções mais avançadas do mercado — como MyFitnessPal, FitBod ou Freeletics — dependem de subscrições mensais que excluem uma parcela significativa dos potenciais utilizadores, de infraestrutura cloud para o processamento de dados biométricos sensíveis, e de equipamento especializado como balanças de bioimpedância ou scanners DEXA para análises de maior precisão.</w:t>
+          <w:rFonts w:ascii="Times New Roman" w:hAnsi="Times New Roman" w:cs="Times New Roman"/>
+          <w:sz w:val="24"/>
+        </w:rPr>
+      </w:pPr>
+      <w:r>
+        <w:rPr>
+          <w:rFonts w:ascii="Times New Roman" w:hAnsi="Times New Roman" w:cs="Times New Roman"/>
+          <w:sz w:val="24"/>
+        </w:rPr>
+        <w:t>The fitness monitoring application market is dominated by paid solutions that depend on cloud infrastructure to process biometric data, creating cost and privacy barriers that exclude a significant share of potential users. This academic project describes the development of FiX-it, a free, cross-platform, privacy-first progressive web application for AI-assisted body composition analysis. The general objective was to demonstrate the viability of executing machine learning models directly in the user's browser for real-time body image analysis, without sending biometric data to external servers. Specific objectives included integrating body pose detection, segmentation, and food recognition models in the browser; developing a virtual coach with four distinct personalities; implementing a fifty-eight-endpoint REST API in Node.js with PostgreSQL; and validating the prototype through three-level testing.</w:t>
       </w:r>
     </w:p>
     <w:p>
@@ -1353,16 +585,16 @@
         <w:ind w:firstLine="680"/>
         <w:jc w:val="both"/>
         <w:rPr>
-          <w:lang w:val="pt-PT"/>
-        </w:rPr>
-      </w:pPr>
-      <w:r>
-        <w:rPr>
-          <w:rFonts w:ascii="Times New Roman" w:hAnsi="Times New Roman"/>
-          <w:sz w:val="24"/>
-          <w:lang w:val="pt-PT"/>
-        </w:rPr>
-        <w:t>Para além do custo, a centralização do processamento de imagens corporais em servidores externos levanta preocupações legítimas ao abrigo do Regulamento Geral sobre a Proteção de Dados (Regulation EU 2016/679, 2016), que classifica os dados biométricos como categoria especial de dados pessoais sujeita a proteções acrescidas. Ayala-Rivera et al. (2024, p. 12) demonstraram que a conformidade com o RGPD pode e deve ser alcançada durante a fase de conceção da arquitetura de software — e não como correção posterior —, através da integração de controlos de privacidade e segurança nos próprios artefactos de design.</w:t>
+          <w:rFonts w:ascii="Times New Roman" w:hAnsi="Times New Roman" w:cs="Times New Roman"/>
+          <w:sz w:val="24"/>
+        </w:rPr>
+      </w:pPr>
+      <w:r>
+        <w:rPr>
+          <w:rFonts w:ascii="Times New Roman" w:hAnsi="Times New Roman" w:cs="Times New Roman"/>
+          <w:sz w:val="24"/>
+        </w:rPr>
+        <w:t>The theoretical foundation covered five research domains: web application architecture and the Progressive Web App standard; artificial intelligence requirements engineering and GDPR compliance; agile methodology in individual academic projects; browser-executable AI models for body composition estimation; and usability and accessibility principles for health applications. The literature review, drawing on sixteen sources published between 2023 and 2026, confirmed the suitability of the selected technologies and highlighted the scarcity of practical validations of two-dimensional body analysis pipelines running entirely in the browser — a gap this project aimed to address.</w:t>
       </w:r>
     </w:p>
     <w:p>
@@ -1371,34 +603,16 @@
         <w:ind w:firstLine="680"/>
         <w:jc w:val="both"/>
         <w:rPr>
-          <w:lang w:val="pt-PT"/>
-        </w:rPr>
-      </w:pPr>
-      <w:r>
-        <w:rPr>
-          <w:rFonts w:ascii="Times New Roman" w:hAnsi="Times New Roman"/>
-          <w:sz w:val="24"/>
-          <w:lang w:val="pt-PT"/>
-        </w:rPr>
-        <w:t>É neste contexto que surgiu o FiX-it: uma aplicação web progressiva de análise de composição corporal assistida por inteligência artificial, de acesso gratuito, multiplataforma e com privacidade por defeito. A sua inovação central reside na execução inteiramente client-side dos modelos de machine learning — o que garante que as imagens corporais do utilizador nunca abandonam o seu dispositivo — e na sua natureza progressiva, que permite a instalação e o uso offline sem necessidade de loja de aplicações (MDN Web Docs, 2025, para. 1).</w:t>
-      </w:r>
-    </w:p>
-    <w:p>
-      <w:pPr>
-        <w:spacing w:before="200" w:after="80" w:line="360" w:lineRule="auto"/>
-        <w:outlineLvl w:val="1"/>
-        <w:rPr>
-          <w:lang w:val="pt-PT"/>
-        </w:rPr>
-      </w:pPr>
-      <w:r>
-        <w:rPr>
-          <w:rFonts w:ascii="Times New Roman" w:hAnsi="Times New Roman"/>
-          <w:b/>
-          <w:sz w:val="28"/>
-          <w:lang w:val="pt-PT"/>
-        </w:rPr>
-        <w:t>1.2 Problema e Hipótese</w:t>
+          <w:rFonts w:ascii="Times New Roman" w:hAnsi="Times New Roman" w:cs="Times New Roman"/>
+          <w:sz w:val="24"/>
+        </w:rPr>
+      </w:pPr>
+      <w:r>
+        <w:rPr>
+          <w:rFonts w:ascii="Times New Roman" w:hAnsi="Times New Roman" w:cs="Times New Roman"/>
+          <w:sz w:val="24"/>
+        </w:rPr>
+        <w:t>Development followed a mixed methodology — iterative and incremental for software development, and descriptive for technology analysis. Qualitative data collection included a semi-structured interview with a personal trainer for exercise requirements elicitation and safety validation, and a comparative analysis of competing applications. The digital artifact was built in HTML5, CSS3, and framework-free JavaScript on the frontend, with artificial intelligence models running in the browser, and a Node.js, Express, and PostgreSQL application programming interface on the backend. Validation was conducted at three levels: unit testing, integration testing of authentication flows and data operations, and end-to-end testing of the complete user journey across multiple browsers.</w:t>
       </w:r>
     </w:p>
     <w:p>
@@ -1407,16 +621,24 @@
         <w:ind w:firstLine="680"/>
         <w:jc w:val="both"/>
         <w:rPr>
-          <w:lang w:val="pt-PT"/>
-        </w:rPr>
-      </w:pPr>
-      <w:r>
-        <w:rPr>
-          <w:rFonts w:ascii="Times New Roman" w:hAnsi="Times New Roman"/>
-          <w:sz w:val="24"/>
-          <w:lang w:val="pt-PT"/>
-        </w:rPr>
-        <w:t>O problema central que o FiX-it se propôs resolver pode ser formulado da seguinte forma: é possível desenvolver uma aplicação web de análise corporal assistida por IA que seja simultaneamente gratuita, privada, acessível em qualquer dispositivo com browser e capaz de oferecer funcionalidades comparáveis às das soluções comerciais existentes?</w:t>
+          <w:rFonts w:ascii="Times New Roman" w:hAnsi="Times New Roman" w:cs="Times New Roman"/>
+          <w:sz w:val="24"/>
+        </w:rPr>
+      </w:pPr>
+      <w:r>
+        <w:rPr>
+          <w:rFonts w:ascii="Times New Roman" w:hAnsi="Times New Roman" w:cs="Times New Roman"/>
+          <w:sz w:val="24"/>
+        </w:rPr>
+        <w:t xml:space="preserve">FiX-it reached full implementation of the body analysis, workout guidance, nutrition, virtual coach, and gamification modules. Informal validation confirmed model adequacy under favourable conditions and precision degradation in profile poses and backlighting, positioning the </w:t>
+      </w:r>
+      <w:r>
+        <w:rPr>
+          <w:rFonts w:ascii="Times New Roman" w:hAnsi="Times New Roman" w:cs="Times New Roman"/>
+          <w:sz w:val="24"/>
+        </w:rPr>
+        <w:lastRenderedPageBreak/>
+        <w:t>application as a motivational tool rather than a clinical diagnostic device. An accessibility audit score of ninety-four out of one hundred and a contrast ratio of 18.3:1 confirmed compliance with level AA web accessibility guidelines. Two significant technical obstacles were overcome: replacing email-by-protocol integration with a transactional API to guarantee delivery to external addresses; and refactoring the authentication flow to always query the server before local state, resolving cross-device data desynchronisation.</w:t>
       </w:r>
     </w:p>
     <w:p>
@@ -1425,35 +647,16 @@
         <w:ind w:firstLine="680"/>
         <w:jc w:val="both"/>
         <w:rPr>
-          <w:lang w:val="pt-PT"/>
-        </w:rPr>
-      </w:pPr>
-      <w:r>
-        <w:rPr>
-          <w:rFonts w:ascii="Times New Roman" w:hAnsi="Times New Roman"/>
-          <w:sz w:val="24"/>
-          <w:lang w:val="pt-PT"/>
-        </w:rPr>
-        <w:lastRenderedPageBreak/>
-        <w:t>A hipótese de trabalho foi que a combinação de tecnologias web modernas — em particular as Progressive Web Apps (MDN Web Docs, 2025, para. 1), os modelos de machine learning executáveis no browser via TensorFlow.js (Kim et al., 2023, p. 13; Dill et al., 2023, p. 565) e as arquiteturas REST escaláveis (Bogner et al., 2023, Sec. 4.2) — permite construir uma solução que responde afirmativamente a este problema, dentro das restrições de um projeto académico individual.</w:t>
-      </w:r>
-    </w:p>
-    <w:p>
-      <w:pPr>
-        <w:spacing w:before="200" w:after="80" w:line="360" w:lineRule="auto"/>
-        <w:outlineLvl w:val="1"/>
-        <w:rPr>
-          <w:lang w:val="pt-PT"/>
-        </w:rPr>
-      </w:pPr>
-      <w:r>
-        <w:rPr>
-          <w:rFonts w:ascii="Times New Roman" w:hAnsi="Times New Roman"/>
-          <w:b/>
-          <w:sz w:val="28"/>
-          <w:lang w:val="pt-PT"/>
-        </w:rPr>
-        <w:t>1.3 Objetivos</w:t>
+          <w:rFonts w:ascii="Times New Roman" w:hAnsi="Times New Roman" w:cs="Times New Roman"/>
+          <w:sz w:val="24"/>
+        </w:rPr>
+      </w:pPr>
+      <w:r>
+        <w:rPr>
+          <w:rFonts w:ascii="Times New Roman" w:hAnsi="Times New Roman" w:cs="Times New Roman"/>
+          <w:sz w:val="24"/>
+        </w:rPr>
+        <w:t>The project empirically confirmed that it is technically viable to build a free, private, and cross-platform AI-assisted body composition web application within the constraints of an individual academic project. Client-side model execution materialised privacy by design without compromising functional richness. The work contributes empirical data on the precision thresholds and failure conditions of two-dimensional body analysis models in the browser, in a domain still scarce in practical validations. Future work should prioritise expanding the nutritional database, exploring browser-executable language models for the virtual coach, and conducting a longitudinal study on the impact of the gamification system on healthy habit adherence.</w:t>
       </w:r>
     </w:p>
     <w:p>
@@ -1462,16 +665,764 @@
         <w:ind w:firstLine="680"/>
         <w:jc w:val="both"/>
         <w:rPr>
-          <w:lang w:val="pt-PT"/>
-        </w:rPr>
-      </w:pPr>
-      <w:r>
-        <w:rPr>
-          <w:rFonts w:ascii="Times New Roman" w:hAnsi="Times New Roman"/>
-          <w:sz w:val="24"/>
-          <w:lang w:val="pt-PT"/>
-        </w:rPr>
-        <w:t>O objetivo geral do projeto consistiu no desenvolvimento de uma aplicação web completa de análise de composição corporal assistida por inteligência artificial, com sistema de gamificação integrado, que demonstrasse a viabilidade de executar modelos de machine learning diretamente no navegador do utilizador para análise de imagem em tempo real.</w:t>
+          <w:rFonts w:ascii="Times New Roman" w:hAnsi="Times New Roman" w:cs="Times New Roman"/>
+          <w:sz w:val="24"/>
+        </w:rPr>
+      </w:pPr>
+    </w:p>
+    <w:p>
+      <w:pPr>
+        <w:spacing w:after="0" w:line="360" w:lineRule="auto"/>
+        <w:jc w:val="both"/>
+      </w:pPr>
+      <w:r>
+        <w:t>Keywords: Progressive Web App, Artificial Intelligence, Body Analysis, Privacy by Design, Gamification.</w:t>
+      </w:r>
+    </w:p>
+    <w:p>
+      <w:r>
+        <w:br w:type="page"/>
+      </w:r>
+    </w:p>
+    <w:p>
+      <w:pPr>
+        <w:spacing w:after="120" w:line="360" w:lineRule="auto"/>
+        <w:outlineLvl w:val="0"/>
+        <w:rPr>
+          <w:lang w:val="pt-PT"/>
+        </w:rPr>
+      </w:pPr>
+      <w:r>
+        <w:rPr>
+          <w:rFonts w:ascii="Times New Roman" w:hAnsi="Times New Roman"/>
+          <w:b/>
+          <w:sz w:val="32"/>
+          <w:lang w:val="pt-PT"/>
+        </w:rPr>
+        <w:lastRenderedPageBreak/>
+        <w:t>ABREVIATURAS</w:t>
+      </w:r>
+    </w:p>
+    <w:p>
+      <w:pPr>
+        <w:spacing w:after="60" w:line="360" w:lineRule="auto"/>
+        <w:rPr>
+          <w:lang w:val="pt-PT"/>
+        </w:rPr>
+      </w:pPr>
+      <w:r>
+        <w:rPr>
+          <w:rFonts w:ascii="Times New Roman" w:hAnsi="Times New Roman"/>
+          <w:b/>
+          <w:lang w:val="pt-PT"/>
+        </w:rPr>
+        <w:t xml:space="preserve">API           </w:t>
+      </w:r>
+      <w:r>
+        <w:rPr>
+          <w:rFonts w:ascii="Times New Roman" w:hAnsi="Times New Roman"/>
+          <w:lang w:val="pt-PT"/>
+        </w:rPr>
+        <w:t>— Application Programming Interface (Interface de Programação de Aplicações)</w:t>
+      </w:r>
+    </w:p>
+    <w:p>
+      <w:pPr>
+        <w:spacing w:after="60" w:line="360" w:lineRule="auto"/>
+      </w:pPr>
+      <w:r>
+        <w:rPr>
+          <w:rFonts w:ascii="Times New Roman" w:hAnsi="Times New Roman"/>
+          <w:b/>
+        </w:rPr>
+        <w:t xml:space="preserve">CSS           </w:t>
+      </w:r>
+      <w:r>
+        <w:rPr>
+          <w:rFonts w:ascii="Times New Roman" w:hAnsi="Times New Roman"/>
+        </w:rPr>
+        <w:t>— Cascading Style Sheets</w:t>
+      </w:r>
+    </w:p>
+    <w:p>
+      <w:pPr>
+        <w:spacing w:after="60" w:line="360" w:lineRule="auto"/>
+      </w:pPr>
+      <w:r>
+        <w:rPr>
+          <w:rFonts w:ascii="Times New Roman" w:hAnsi="Times New Roman"/>
+          <w:b/>
+        </w:rPr>
+        <w:t xml:space="preserve">CRUD          </w:t>
+      </w:r>
+      <w:r>
+        <w:rPr>
+          <w:rFonts w:ascii="Times New Roman" w:hAnsi="Times New Roman"/>
+        </w:rPr>
+        <w:t>— Create, Read, Update, Delete</w:t>
+      </w:r>
+    </w:p>
+    <w:p>
+      <w:pPr>
+        <w:spacing w:after="60" w:line="360" w:lineRule="auto"/>
+        <w:rPr>
+          <w:lang w:val="pt-PT"/>
+        </w:rPr>
+      </w:pPr>
+      <w:r>
+        <w:rPr>
+          <w:rFonts w:ascii="Times New Roman" w:hAnsi="Times New Roman"/>
+          <w:b/>
+          <w:lang w:val="pt-PT"/>
+        </w:rPr>
+        <w:t xml:space="preserve">DEXA          </w:t>
+      </w:r>
+      <w:r>
+        <w:rPr>
+          <w:rFonts w:ascii="Times New Roman" w:hAnsi="Times New Roman"/>
+          <w:lang w:val="pt-PT"/>
+        </w:rPr>
+        <w:t>— Dual-Energy X-ray Absorptiometry (Absorciometria de Raios-X de Dupla Energia)</w:t>
+      </w:r>
+    </w:p>
+    <w:p>
+      <w:pPr>
+        <w:spacing w:after="60" w:line="360" w:lineRule="auto"/>
+      </w:pPr>
+      <w:r>
+        <w:rPr>
+          <w:rFonts w:ascii="Times New Roman" w:hAnsi="Times New Roman"/>
+          <w:b/>
+        </w:rPr>
+        <w:t xml:space="preserve">GDPR          </w:t>
+      </w:r>
+      <w:r>
+        <w:rPr>
+          <w:rFonts w:ascii="Times New Roman" w:hAnsi="Times New Roman"/>
+        </w:rPr>
+        <w:t>— General Data Protection Regulation — cf. RGPD</w:t>
+      </w:r>
+    </w:p>
+    <w:p>
+      <w:pPr>
+        <w:spacing w:after="60" w:line="360" w:lineRule="auto"/>
+      </w:pPr>
+      <w:r>
+        <w:rPr>
+          <w:rFonts w:ascii="Times New Roman" w:hAnsi="Times New Roman"/>
+          <w:b/>
+        </w:rPr>
+        <w:t xml:space="preserve">HTML          </w:t>
+      </w:r>
+      <w:r>
+        <w:rPr>
+          <w:rFonts w:ascii="Times New Roman" w:hAnsi="Times New Roman"/>
+        </w:rPr>
+        <w:t>— Hypertext Markup Language</w:t>
+      </w:r>
+    </w:p>
+    <w:p>
+      <w:pPr>
+        <w:spacing w:after="60" w:line="360" w:lineRule="auto"/>
+      </w:pPr>
+      <w:r>
+        <w:rPr>
+          <w:rFonts w:ascii="Times New Roman" w:hAnsi="Times New Roman"/>
+          <w:b/>
+        </w:rPr>
+        <w:t xml:space="preserve">HTTP/HTTPS    </w:t>
+      </w:r>
+      <w:r>
+        <w:rPr>
+          <w:rFonts w:ascii="Times New Roman" w:hAnsi="Times New Roman"/>
+        </w:rPr>
+        <w:t>— Hypertext Transfer Protocol / Secure</w:t>
+      </w:r>
+    </w:p>
+    <w:p>
+      <w:pPr>
+        <w:spacing w:after="60" w:line="360" w:lineRule="auto"/>
+        <w:rPr>
+          <w:lang w:val="pt-PT"/>
+        </w:rPr>
+      </w:pPr>
+      <w:r>
+        <w:rPr>
+          <w:rFonts w:ascii="Times New Roman" w:hAnsi="Times New Roman"/>
+          <w:b/>
+          <w:lang w:val="pt-PT"/>
+        </w:rPr>
+        <w:t xml:space="preserve">IA            </w:t>
+      </w:r>
+      <w:r>
+        <w:rPr>
+          <w:rFonts w:ascii="Times New Roman" w:hAnsi="Times New Roman"/>
+          <w:lang w:val="pt-PT"/>
+        </w:rPr>
+        <w:t>— Inteligência Artificial</w:t>
+      </w:r>
+    </w:p>
+    <w:p>
+      <w:pPr>
+        <w:spacing w:after="60" w:line="360" w:lineRule="auto"/>
+        <w:rPr>
+          <w:lang w:val="pt-PT"/>
+        </w:rPr>
+      </w:pPr>
+      <w:r>
+        <w:rPr>
+          <w:rFonts w:ascii="Times New Roman" w:hAnsi="Times New Roman"/>
+          <w:b/>
+          <w:lang w:val="pt-PT"/>
+        </w:rPr>
+        <w:t xml:space="preserve">JS            </w:t>
+      </w:r>
+      <w:r>
+        <w:rPr>
+          <w:rFonts w:ascii="Times New Roman" w:hAnsi="Times New Roman"/>
+          <w:lang w:val="pt-PT"/>
+        </w:rPr>
+        <w:t>— JavaScript</w:t>
+      </w:r>
+    </w:p>
+    <w:p>
+      <w:pPr>
+        <w:spacing w:after="60" w:line="360" w:lineRule="auto"/>
+        <w:rPr>
+          <w:lang w:val="pt-PT"/>
+        </w:rPr>
+      </w:pPr>
+      <w:r>
+        <w:rPr>
+          <w:rFonts w:ascii="Times New Roman" w:hAnsi="Times New Roman"/>
+          <w:b/>
+          <w:lang w:val="pt-PT"/>
+        </w:rPr>
+        <w:t xml:space="preserve">JWT           </w:t>
+      </w:r>
+      <w:r>
+        <w:rPr>
+          <w:rFonts w:ascii="Times New Roman" w:hAnsi="Times New Roman"/>
+          <w:lang w:val="pt-PT"/>
+        </w:rPr>
+        <w:t>— JSON Web Token</w:t>
+      </w:r>
+    </w:p>
+    <w:p>
+      <w:pPr>
+        <w:spacing w:after="60" w:line="360" w:lineRule="auto"/>
+        <w:rPr>
+          <w:lang w:val="pt-PT"/>
+        </w:rPr>
+      </w:pPr>
+      <w:r>
+        <w:rPr>
+          <w:rFonts w:ascii="Times New Roman" w:hAnsi="Times New Roman"/>
+          <w:b/>
+          <w:lang w:val="pt-PT"/>
+        </w:rPr>
+        <w:t xml:space="preserve">PWA           </w:t>
+      </w:r>
+      <w:r>
+        <w:rPr>
+          <w:rFonts w:ascii="Times New Roman" w:hAnsi="Times New Roman"/>
+          <w:lang w:val="pt-PT"/>
+        </w:rPr>
+        <w:t>— Progressive Web App (Aplicação Web Progressiva)</w:t>
+      </w:r>
+    </w:p>
+    <w:p>
+      <w:pPr>
+        <w:spacing w:after="60" w:line="360" w:lineRule="auto"/>
+        <w:rPr>
+          <w:lang w:val="pt-PT"/>
+        </w:rPr>
+      </w:pPr>
+      <w:r>
+        <w:rPr>
+          <w:rFonts w:ascii="Times New Roman" w:hAnsi="Times New Roman"/>
+          <w:b/>
+          <w:lang w:val="pt-PT"/>
+        </w:rPr>
+        <w:t xml:space="preserve">REST          </w:t>
+      </w:r>
+      <w:r>
+        <w:rPr>
+          <w:rFonts w:ascii="Times New Roman" w:hAnsi="Times New Roman"/>
+          <w:lang w:val="pt-PT"/>
+        </w:rPr>
+        <w:t>— Representational State Transfer</w:t>
+      </w:r>
+    </w:p>
+    <w:p>
+      <w:pPr>
+        <w:spacing w:after="60" w:line="360" w:lineRule="auto"/>
+        <w:rPr>
+          <w:lang w:val="pt-PT"/>
+        </w:rPr>
+      </w:pPr>
+      <w:r>
+        <w:rPr>
+          <w:rFonts w:ascii="Times New Roman" w:hAnsi="Times New Roman"/>
+          <w:b/>
+          <w:lang w:val="pt-PT"/>
+        </w:rPr>
+        <w:t xml:space="preserve">RGPD          </w:t>
+      </w:r>
+      <w:r>
+        <w:rPr>
+          <w:rFonts w:ascii="Times New Roman" w:hAnsi="Times New Roman"/>
+          <w:lang w:val="pt-PT"/>
+        </w:rPr>
+        <w:t>— Regulamento Geral sobre a Proteção de Dados</w:t>
+      </w:r>
+    </w:p>
+    <w:p>
+      <w:pPr>
+        <w:spacing w:after="60" w:line="360" w:lineRule="auto"/>
+        <w:rPr>
+          <w:lang w:val="pt-PT"/>
+        </w:rPr>
+      </w:pPr>
+      <w:r>
+        <w:rPr>
+          <w:rFonts w:ascii="Times New Roman" w:hAnsi="Times New Roman"/>
+          <w:b/>
+          <w:lang w:val="pt-PT"/>
+        </w:rPr>
+        <w:t xml:space="preserve">SPA           </w:t>
+      </w:r>
+      <w:r>
+        <w:rPr>
+          <w:rFonts w:ascii="Times New Roman" w:hAnsi="Times New Roman"/>
+          <w:lang w:val="pt-PT"/>
+        </w:rPr>
+        <w:t>— Single-Page Application (Aplicação de Página Única)</w:t>
+      </w:r>
+    </w:p>
+    <w:p>
+      <w:pPr>
+        <w:spacing w:after="60" w:line="360" w:lineRule="auto"/>
+        <w:rPr>
+          <w:lang w:val="pt-PT"/>
+        </w:rPr>
+      </w:pPr>
+      <w:r>
+        <w:rPr>
+          <w:rFonts w:ascii="Times New Roman" w:hAnsi="Times New Roman"/>
+          <w:b/>
+          <w:lang w:val="pt-PT"/>
+        </w:rPr>
+        <w:t xml:space="preserve">SQL           </w:t>
+      </w:r>
+      <w:r>
+        <w:rPr>
+          <w:rFonts w:ascii="Times New Roman" w:hAnsi="Times New Roman"/>
+          <w:lang w:val="pt-PT"/>
+        </w:rPr>
+        <w:t>— Structured Query Language</w:t>
+      </w:r>
+    </w:p>
+    <w:p>
+      <w:pPr>
+        <w:spacing w:after="60" w:line="360" w:lineRule="auto"/>
+        <w:rPr>
+          <w:lang w:val="pt-PT"/>
+        </w:rPr>
+      </w:pPr>
+      <w:r>
+        <w:rPr>
+          <w:rFonts w:ascii="Times New Roman" w:hAnsi="Times New Roman"/>
+          <w:b/>
+          <w:lang w:val="pt-PT"/>
+        </w:rPr>
+        <w:t xml:space="preserve">UI            </w:t>
+      </w:r>
+      <w:r>
+        <w:rPr>
+          <w:rFonts w:ascii="Times New Roman" w:hAnsi="Times New Roman"/>
+          <w:lang w:val="pt-PT"/>
+        </w:rPr>
+        <w:t>— User Interface (Interface do Utilizador)</w:t>
+      </w:r>
+    </w:p>
+    <w:p>
+      <w:pPr>
+        <w:spacing w:after="60" w:line="360" w:lineRule="auto"/>
+        <w:rPr>
+          <w:lang w:val="pt-PT"/>
+        </w:rPr>
+      </w:pPr>
+      <w:r>
+        <w:rPr>
+          <w:rFonts w:ascii="Times New Roman" w:hAnsi="Times New Roman"/>
+          <w:b/>
+          <w:lang w:val="pt-PT"/>
+        </w:rPr>
+        <w:t xml:space="preserve">UX            </w:t>
+      </w:r>
+      <w:r>
+        <w:rPr>
+          <w:rFonts w:ascii="Times New Roman" w:hAnsi="Times New Roman"/>
+          <w:lang w:val="pt-PT"/>
+        </w:rPr>
+        <w:t>— User Experience (Experiência do Utilizador)</w:t>
+      </w:r>
+    </w:p>
+    <w:p>
+      <w:pPr>
+        <w:spacing w:after="60" w:line="360" w:lineRule="auto"/>
+        <w:rPr>
+          <w:lang w:val="pt-PT"/>
+        </w:rPr>
+      </w:pPr>
+      <w:r>
+        <w:rPr>
+          <w:rFonts w:ascii="Times New Roman" w:hAnsi="Times New Roman"/>
+          <w:b/>
+          <w:lang w:val="pt-PT"/>
+        </w:rPr>
+        <w:t xml:space="preserve">WCAG          </w:t>
+      </w:r>
+      <w:r>
+        <w:rPr>
+          <w:rFonts w:ascii="Times New Roman" w:hAnsi="Times New Roman"/>
+          <w:lang w:val="pt-PT"/>
+        </w:rPr>
+        <w:t>— Web Content Accessibility Guidelines</w:t>
+      </w:r>
+    </w:p>
+    <w:p>
+      <w:pPr>
+        <w:spacing w:after="60" w:line="360" w:lineRule="auto"/>
+        <w:rPr>
+          <w:lang w:val="pt-PT"/>
+        </w:rPr>
+      </w:pPr>
+      <w:r>
+        <w:rPr>
+          <w:rFonts w:ascii="Times New Roman" w:hAnsi="Times New Roman"/>
+          <w:b/>
+          <w:lang w:val="pt-PT"/>
+        </w:rPr>
+        <w:t xml:space="preserve">XP            </w:t>
+      </w:r>
+      <w:r>
+        <w:rPr>
+          <w:rFonts w:ascii="Times New Roman" w:hAnsi="Times New Roman"/>
+          <w:lang w:val="pt-PT"/>
+        </w:rPr>
+        <w:t>— Experience Points (Pontos de Experiência)</w:t>
+      </w:r>
+    </w:p>
+    <w:p>
+      <w:pPr>
+        <w:rPr>
+          <w:lang w:val="pt-PT"/>
+        </w:rPr>
+      </w:pPr>
+      <w:r>
+        <w:rPr>
+          <w:lang w:val="pt-PT"/>
+        </w:rPr>
+        <w:br w:type="page"/>
+      </w:r>
+    </w:p>
+    <w:p>
+      <w:pPr>
+        <w:spacing w:after="160" w:line="360" w:lineRule="auto"/>
+        <w:outlineLvl w:val="0"/>
+        <w:rPr>
+          <w:lang w:val="pt-PT"/>
+        </w:rPr>
+      </w:pPr>
+      <w:r>
+        <w:rPr>
+          <w:rFonts w:ascii="Times New Roman" w:hAnsi="Times New Roman"/>
+          <w:b/>
+          <w:sz w:val="32"/>
+          <w:lang w:val="pt-PT"/>
+        </w:rPr>
+        <w:lastRenderedPageBreak/>
+        <w:t>ÍNDICE</w:t>
+      </w:r>
+    </w:p>
+    <w:p>
+      <w:pPr>
+        <w:rPr>
+          <w:lang w:val="pt-PT"/>
+        </w:rPr>
+      </w:pPr>
+      <w:r>
+        <w:fldChar w:fldCharType="begin"/>
+      </w:r>
+      <w:r>
+        <w:rPr>
+          <w:lang w:val="pt-PT"/>
+        </w:rPr>
+        <w:instrText xml:space="preserve"> TOC \h \z \u </w:instrText>
+      </w:r>
+      <w:r>
+        <w:fldChar w:fldCharType="separate"/>
+      </w:r>
+      <w:r>
+        <w:fldChar w:fldCharType="end"/>
+      </w:r>
+    </w:p>
+    <w:p>
+      <w:pPr>
+        <w:rPr>
+          <w:lang w:val="pt-PT"/>
+        </w:rPr>
+      </w:pPr>
+      <w:r>
+        <w:rPr>
+          <w:rFonts w:ascii="Times New Roman" w:hAnsi="Times New Roman"/>
+          <w:i/>
+          <w:sz w:val="20"/>
+          <w:lang w:val="pt-PT"/>
+        </w:rPr>
+        <w:t>(Clique direito → Atualizar Campo para gerar o índice completo)</w:t>
+      </w:r>
+    </w:p>
+    <w:p>
+      <w:pPr>
+        <w:rPr>
+          <w:lang w:val="pt-PT"/>
+        </w:rPr>
+      </w:pPr>
+      <w:r>
+        <w:rPr>
+          <w:lang w:val="pt-PT"/>
+        </w:rPr>
+        <w:br w:type="page"/>
+      </w:r>
+    </w:p>
+    <w:p>
+      <w:pPr>
+        <w:spacing w:after="120" w:line="360" w:lineRule="auto"/>
+        <w:outlineLvl w:val="0"/>
+        <w:rPr>
+          <w:lang w:val="pt-PT"/>
+        </w:rPr>
+      </w:pPr>
+      <w:r>
+        <w:rPr>
+          <w:rFonts w:ascii="Times New Roman" w:hAnsi="Times New Roman"/>
+          <w:b/>
+          <w:sz w:val="32"/>
+          <w:lang w:val="pt-PT"/>
+        </w:rPr>
+        <w:lastRenderedPageBreak/>
+        <w:t>ÍNDICE DE FIGURAS</w:t>
+      </w:r>
+    </w:p>
+    <w:p>
+      <w:pPr>
+        <w:spacing w:after="0" w:line="360" w:lineRule="auto"/>
+        <w:jc w:val="both"/>
+      </w:pPr>
+      <w:r>
+        <w:rPr>
+          <w:rFonts w:ascii="Times New Roman" w:hAnsi="Times New Roman"/>
+          <w:sz w:val="24"/>
+          <w:lang w:val="pt-PT"/>
+        </w:rPr>
+        <w:t xml:space="preserve">Figura 1. Diagrama de arquitetura de três camadas do FiX-it ..................... </w:t>
+      </w:r>
+      <w:r>
+        <w:rPr>
+          <w:rFonts w:ascii="Times New Roman" w:hAnsi="Times New Roman"/>
+          <w:sz w:val="24"/>
+        </w:rPr>
+        <w:t>[p.]</w:t>
+      </w:r>
+    </w:p>
+    <w:p>
+      <w:pPr>
+        <w:spacing w:after="0" w:line="360" w:lineRule="auto"/>
+        <w:jc w:val="both"/>
+        <w:rPr>
+          <w:lang w:val="pt-PT"/>
+        </w:rPr>
+      </w:pPr>
+      <w:r>
+        <w:rPr>
+          <w:rFonts w:ascii="Times New Roman" w:hAnsi="Times New Roman"/>
+          <w:sz w:val="24"/>
+          <w:lang w:val="pt-PT"/>
+        </w:rPr>
+        <w:t>Figura 2. Fluxo de análise: pré-processamento → MediaPipe Pose → cálculo de métricas  [p.]</w:t>
+      </w:r>
+    </w:p>
+    <w:p>
+      <w:pPr>
+        <w:spacing w:after="0" w:line="360" w:lineRule="auto"/>
+        <w:jc w:val="both"/>
+        <w:rPr>
+          <w:lang w:val="pt-PT"/>
+        </w:rPr>
+      </w:pPr>
+    </w:p>
+    <w:p>
+      <w:pPr>
+        <w:spacing w:after="0" w:line="360" w:lineRule="auto"/>
+        <w:jc w:val="both"/>
+        <w:rPr>
+          <w:lang w:val="pt-PT"/>
+        </w:rPr>
+      </w:pPr>
+      <w:r>
+        <w:rPr>
+          <w:rFonts w:ascii="Times New Roman" w:hAnsi="Times New Roman"/>
+          <w:i/>
+          <w:sz w:val="20"/>
+          <w:lang w:val="pt-PT"/>
+        </w:rPr>
+        <w:t>[Atualizar números de página após inserir as figuras no documento.]</w:t>
+      </w:r>
+    </w:p>
+    <w:p>
+      <w:pPr>
+        <w:rPr>
+          <w:lang w:val="pt-PT"/>
+        </w:rPr>
+      </w:pPr>
+      <w:r>
+        <w:rPr>
+          <w:lang w:val="pt-PT"/>
+        </w:rPr>
+        <w:br w:type="page"/>
+      </w:r>
+    </w:p>
+    <w:p>
+      <w:pPr>
+        <w:spacing w:after="120" w:line="360" w:lineRule="auto"/>
+        <w:outlineLvl w:val="0"/>
+        <w:rPr>
+          <w:lang w:val="pt-PT"/>
+        </w:rPr>
+      </w:pPr>
+      <w:r>
+        <w:rPr>
+          <w:rFonts w:ascii="Times New Roman" w:hAnsi="Times New Roman"/>
+          <w:b/>
+          <w:sz w:val="32"/>
+          <w:lang w:val="pt-PT"/>
+        </w:rPr>
+        <w:lastRenderedPageBreak/>
+        <w:t>ÍNDICE DE TABELAS</w:t>
+      </w:r>
+    </w:p>
+    <w:p>
+      <w:pPr>
+        <w:spacing w:after="0" w:line="360" w:lineRule="auto"/>
+        <w:jc w:val="both"/>
+        <w:rPr>
+          <w:lang w:val="pt-PT"/>
+        </w:rPr>
+      </w:pPr>
+      <w:r>
+        <w:rPr>
+          <w:rFonts w:ascii="Times New Roman" w:hAnsi="Times New Roman"/>
+          <w:sz w:val="24"/>
+          <w:lang w:val="pt-PT"/>
+        </w:rPr>
+        <w:t>Tabela 1. Distribuição das 21 tabelas pelos três grupos funcionais da base de dados  [p.]</w:t>
+      </w:r>
+    </w:p>
+    <w:p>
+      <w:pPr>
+        <w:spacing w:after="0" w:line="360" w:lineRule="auto"/>
+        <w:jc w:val="both"/>
+        <w:rPr>
+          <w:lang w:val="pt-PT"/>
+        </w:rPr>
+      </w:pPr>
+      <w:r>
+        <w:rPr>
+          <w:rFonts w:ascii="Times New Roman" w:hAnsi="Times New Roman"/>
+          <w:sz w:val="24"/>
+          <w:lang w:val="pt-PT"/>
+        </w:rPr>
+        <w:t>Tabela 2. Calendarização das sete etapas do projeto FiX-it (ano letivo 2025/2026) .. [p.]</w:t>
+      </w:r>
+    </w:p>
+    <w:p>
+      <w:pPr>
+        <w:spacing w:after="0" w:line="360" w:lineRule="auto"/>
+        <w:jc w:val="both"/>
+        <w:rPr>
+          <w:lang w:val="pt-PT"/>
+        </w:rPr>
+      </w:pPr>
+    </w:p>
+    <w:p>
+      <w:pPr>
+        <w:spacing w:after="0" w:line="360" w:lineRule="auto"/>
+        <w:jc w:val="both"/>
+        <w:rPr>
+          <w:lang w:val="pt-PT"/>
+        </w:rPr>
+      </w:pPr>
+      <w:r>
+        <w:rPr>
+          <w:rFonts w:ascii="Times New Roman" w:hAnsi="Times New Roman"/>
+          <w:i/>
+          <w:sz w:val="20"/>
+          <w:lang w:val="pt-PT"/>
+        </w:rPr>
+        <w:t>[Atualizar números de página após inserir as tabelas no documento.]</w:t>
+      </w:r>
+    </w:p>
+    <w:p>
+      <w:pPr>
+        <w:rPr>
+          <w:lang w:val="pt-PT"/>
+        </w:rPr>
+      </w:pPr>
+      <w:r>
+        <w:rPr>
+          <w:lang w:val="pt-PT"/>
+        </w:rPr>
+        <w:br w:type="page"/>
+      </w:r>
+    </w:p>
+    <w:p>
+      <w:pPr>
+        <w:spacing w:after="120" w:line="360" w:lineRule="auto"/>
+        <w:outlineLvl w:val="0"/>
+        <w:rPr>
+          <w:lang w:val="pt-PT"/>
+        </w:rPr>
+      </w:pPr>
+      <w:r>
+        <w:rPr>
+          <w:rFonts w:ascii="Times New Roman" w:hAnsi="Times New Roman"/>
+          <w:b/>
+          <w:sz w:val="32"/>
+          <w:lang w:val="pt-PT"/>
+        </w:rPr>
+        <w:lastRenderedPageBreak/>
+        <w:t>INTRODUÇÃO</w:t>
+      </w:r>
+    </w:p>
+    <w:p>
+      <w:pPr>
+        <w:spacing w:before="200" w:after="80" w:line="360" w:lineRule="auto"/>
+        <w:outlineLvl w:val="1"/>
+        <w:rPr>
+          <w:lang w:val="pt-PT"/>
+        </w:rPr>
+      </w:pPr>
+      <w:r>
+        <w:rPr>
+          <w:rFonts w:ascii="Times New Roman" w:hAnsi="Times New Roman"/>
+          <w:b/>
+          <w:sz w:val="28"/>
+          <w:lang w:val="pt-PT"/>
+        </w:rPr>
+        <w:t>1.1 Contexto e Motivação</w:t>
       </w:r>
     </w:p>
     <w:p>
@@ -1489,25 +1440,7 @@
           <w:sz w:val="24"/>
           <w:lang w:val="pt-PT"/>
         </w:rPr>
-        <w:t>Os objetivos específicos compreenderam: (i) identificar e integrar os modelos de IA mais adequados para análise corporal em ambiente browser, avaliando desempenho, precisão e limitações; (ii) conceber uma arquitetura de backend modular e escalável com persistência de dados segura; (iii) implementar um sistema de gamificação motivacional baseado em evidência comportamental; (iv) desenvolver um coach virtual baseado em regras com múltiplas personalidades; (v) aplicar princípios de usabilidade e acessibilidade WCAG 2.2 (Kirkpatrick et al., 2023) na conceção da interface; e (vi) validar o protótipo através de testes a três níveis.</w:t>
-      </w:r>
-    </w:p>
-    <w:p>
-      <w:pPr>
-        <w:spacing w:before="200" w:after="80" w:line="360" w:lineRule="auto"/>
-        <w:outlineLvl w:val="1"/>
-        <w:rPr>
-          <w:lang w:val="pt-PT"/>
-        </w:rPr>
-      </w:pPr>
-      <w:r>
-        <w:rPr>
-          <w:rFonts w:ascii="Times New Roman" w:hAnsi="Times New Roman"/>
-          <w:b/>
-          <w:sz w:val="28"/>
-          <w:lang w:val="pt-PT"/>
-        </w:rPr>
-        <w:t>1.4 Objeto de Estudo</w:t>
+        <w:t>O crescimento exponencial das aplicações de fitness digitais nos últimos anos criou um paradoxo: enquanto a oferta de ferramentas para monitorização da condição física nunca foi tão vasta, o acesso equitativo a soluções de qualidade permanece limitado por barreiras económicas, tecnológicas e de privacidade. As soluções mais avançadas do mercado — como MyFitnessPal, FitBod ou Freeletics — dependem de subscrições mensais que excluem uma parcela significativa dos potenciais utilizadores, de infraestrutura cloud para o processamento de dados biométricos sensíveis, e de equipamento especializado como balanças de bioimpedância ou scanners DEXA para análises de maior precisão.</w:t>
       </w:r>
     </w:p>
     <w:p>
@@ -1525,7 +1458,7 @@
           <w:sz w:val="24"/>
           <w:lang w:val="pt-PT"/>
         </w:rPr>
-        <w:t>O FiX-it enquadra-se no domínio das tecnologias web aplicadas à saúde e bem-estar. O objeto de estudo é a viabilidade de uma aplicação web progressiva de análise de composição corporal assistida por inteligência artificial que execute inteiramente no navegador do utilizador, sem envio de dados biométricos para servidores externos, de acesso gratuito e multiplataforma.</w:t>
+        <w:t>Para além do custo, a centralização do processamento de imagens corporais em servidores externos levanta preocupações legítimas ao abrigo do Regulamento Geral sobre a Proteção de Dados (Regulation EU 2016/679, 2016), que classifica os dados biométricos como categoria especial de dados pessoais sujeita a proteções acrescidas. Ayala-Rivera et al. (2024, p. 12) demonstraram que a conformidade com o RGPD pode e deve ser alcançada durante a fase de conceção da arquitetura de software — e não como correção posterior —, através da integração de controlos de privacidade e segurança nos próprios artefactos de design.</w:t>
       </w:r>
     </w:p>
     <w:p>
@@ -1543,7 +1476,7 @@
           <w:sz w:val="24"/>
           <w:lang w:val="pt-PT"/>
         </w:rPr>
-        <w:t>A delimitação do objeto obedece ao modelo SMMARTT: o projeto é Específico (focado na democratização do acesso a ferramentas de análise corporal), Mensurável (58 endpoints, 21 tabelas, 6 métricas biométricas, 14 conquistas, 20 níveis), Significativo (dimensão social, técnica e ética), Alcançável (tecnologias gratuitas e de código aberto), Realista (protótipo funcional com limitações claramente definidas), Limitado no Tempo (7 etapas com prazos no ano letivo 2025/2026) e com Calendarização (cronograma detalhado com dependências sequenciais entre etapas).</w:t>
+        <w:t>É neste contexto que surgiu o FiX-it: uma aplicação web progressiva de análise de composição corporal assistida por inteligência artificial, de acesso gratuito, multiplataforma e com privacidade por defeito. A sua inovação central reside na execução inteiramente client-side dos modelos de machine learning — o que garante que as imagens corporais do utilizador nunca abandonam o seu dispositivo — e na sua natureza progressiva, que permite a instalação e o uso offline sem necessidade de loja de aplicações (MDN Web Docs, 2025, para. 1).</w:t>
       </w:r>
     </w:p>
     <w:p>
@@ -1561,8 +1494,7 @@
           <w:sz w:val="28"/>
           <w:lang w:val="pt-PT"/>
         </w:rPr>
-        <w:lastRenderedPageBreak/>
-        <w:t>1.5 Estrutura do Relatório</w:t>
+        <w:t>1.2 Problema e Hipótese</w:t>
       </w:r>
     </w:p>
     <w:p>
@@ -1580,6 +1512,190 @@
           <w:sz w:val="24"/>
           <w:lang w:val="pt-PT"/>
         </w:rPr>
+        <w:t>O problema central que o FiX-it se propôs resolver pode ser formulado da seguinte forma: é possível desenvolver uma aplicação web de análise corporal assistida por IA que seja simultaneamente gratuita, privada, acessível em qualquer dispositivo com browser e capaz de oferecer funcionalidades comparáveis às das soluções comerciais existentes?</w:t>
+      </w:r>
+    </w:p>
+    <w:p>
+      <w:pPr>
+        <w:spacing w:after="0" w:line="360" w:lineRule="auto"/>
+        <w:ind w:firstLine="680"/>
+        <w:jc w:val="both"/>
+        <w:rPr>
+          <w:rFonts w:ascii="Times New Roman" w:hAnsi="Times New Roman" w:cs="Times New Roman"/>
+          <w:sz w:val="24"/>
+          <w:lang w:val="pt-PT"/>
+        </w:rPr>
+      </w:pPr>
+      <w:r>
+        <w:rPr>
+          <w:rFonts w:ascii="Times New Roman" w:hAnsi="Times New Roman" w:cs="Times New Roman"/>
+          <w:sz w:val="24"/>
+          <w:lang w:val="pt-PT"/>
+        </w:rPr>
+        <w:t>O problema encerra obstáculos técnicos e éticos significativos que delimitaram o âmbito e as escolhas do projeto. A estimação de composição corporal a partir de imagens bidimensionais domésticas é tecnicamente inferior aos métodos clínicos de referência — como a absorciometria de raios-X de dupla energia e a bioimpedância —, limitação inerente à deteção baseada em marcos esqueléticos que não é superável sem sensores de profundidade ou reconstrução tridimensional. A execução de modelos de aprendizagem automática no navegador impõe restrições de desempenho dependentes da capacidade de processamento do dispositivo do utilizador. A natureza biométrica dos dados processados — imagens corporais e métricas de composição física — impõe obrigações legais ao abrigo do Regulamento Geral sobre a Proteção de Dados, que classifica estes dados como categoria especial sujeita a proteções acrescidas. Estes obstáculos delimitaram as escolhas de arquitetura e os compromissos técnicos do FiX-it.</w:t>
+      </w:r>
+    </w:p>
+    <w:p>
+      <w:pPr>
+        <w:spacing w:after="0" w:line="360" w:lineRule="auto"/>
+        <w:ind w:firstLine="680"/>
+        <w:jc w:val="both"/>
+        <w:rPr>
+          <w:lang w:val="pt-PT"/>
+        </w:rPr>
+      </w:pPr>
+      <w:r>
+        <w:rPr>
+          <w:rFonts w:ascii="Times New Roman" w:hAnsi="Times New Roman"/>
+          <w:sz w:val="24"/>
+          <w:lang w:val="pt-PT"/>
+        </w:rPr>
+        <w:lastRenderedPageBreak/>
+        <w:t>A hipótese de trabalho foi que a combinação de tecnologias web modernas — em particular as Progressive Web Apps (MDN Web Docs, 2025, para. 1), os modelos de machine learning executáveis no browser via TensorFlow.js (Kim et al., 2023, p. 13; Dill et al., 2023, p. 565) e as arquiteturas REST escaláveis (Bogner et al., 2023, Sec. 4.2) — permite construir uma solução que responde afirmativamente a este problema, dentro das restrições de um projeto académico individual.</w:t>
+      </w:r>
+    </w:p>
+    <w:p>
+      <w:pPr>
+        <w:spacing w:before="200" w:after="80" w:line="360" w:lineRule="auto"/>
+        <w:outlineLvl w:val="1"/>
+        <w:rPr>
+          <w:lang w:val="pt-PT"/>
+        </w:rPr>
+      </w:pPr>
+      <w:r>
+        <w:rPr>
+          <w:rFonts w:ascii="Times New Roman" w:hAnsi="Times New Roman"/>
+          <w:b/>
+          <w:sz w:val="28"/>
+          <w:lang w:val="pt-PT"/>
+        </w:rPr>
+        <w:t>1.3 Objetivos</w:t>
+      </w:r>
+    </w:p>
+    <w:p>
+      <w:pPr>
+        <w:spacing w:after="0" w:line="360" w:lineRule="auto"/>
+        <w:ind w:firstLine="680"/>
+        <w:jc w:val="both"/>
+        <w:rPr>
+          <w:lang w:val="pt-PT"/>
+        </w:rPr>
+      </w:pPr>
+      <w:r>
+        <w:rPr>
+          <w:rFonts w:ascii="Times New Roman" w:hAnsi="Times New Roman"/>
+          <w:sz w:val="24"/>
+          <w:lang w:val="pt-PT"/>
+        </w:rPr>
+        <w:t>O objetivo geral do projeto consistiu no desenvolvimento de uma aplicação web completa de análise de composição corporal assistida por inteligência artificial, com sistema de gamificação integrado, que demonstrasse a viabilidade de executar modelos de machine learning diretamente no navegador do utilizador para análise de imagem em tempo real.</w:t>
+      </w:r>
+    </w:p>
+    <w:p>
+      <w:pPr>
+        <w:spacing w:after="0" w:line="360" w:lineRule="auto"/>
+        <w:ind w:firstLine="680"/>
+        <w:jc w:val="both"/>
+        <w:rPr>
+          <w:lang w:val="pt-PT"/>
+        </w:rPr>
+      </w:pPr>
+      <w:r>
+        <w:rPr>
+          <w:rFonts w:ascii="Times New Roman" w:hAnsi="Times New Roman"/>
+          <w:sz w:val="24"/>
+          <w:lang w:val="pt-PT"/>
+        </w:rPr>
+        <w:t>Os objetivos específicos compreenderam: (i) identificar e integrar os modelos de IA mais adequados para análise corporal em ambiente browser, avaliando desempenho, precisão e limitações; (ii) conceber uma arquitetura de backend modular e escalável com persistência de dados segura; (iii) implementar um sistema de gamificação motivacional baseado em evidência comportamental; (iv) desenvolver um coach virtual baseado em regras com múltiplas personalidades; (v) aplicar princípios de usabilidade e acessibilidade WCAG 2.2 (Kirkpatrick et al., 2023) na conceção da interface; e (vi) validar o protótipo através de testes a três níveis.</w:t>
+      </w:r>
+    </w:p>
+    <w:p>
+      <w:pPr>
+        <w:spacing w:before="200" w:after="80" w:line="360" w:lineRule="auto"/>
+        <w:outlineLvl w:val="1"/>
+        <w:rPr>
+          <w:lang w:val="pt-PT"/>
+        </w:rPr>
+      </w:pPr>
+      <w:r>
+        <w:rPr>
+          <w:rFonts w:ascii="Times New Roman" w:hAnsi="Times New Roman"/>
+          <w:b/>
+          <w:sz w:val="28"/>
+          <w:lang w:val="pt-PT"/>
+        </w:rPr>
+        <w:t>1.4 Objeto de Estudo</w:t>
+      </w:r>
+    </w:p>
+    <w:p>
+      <w:pPr>
+        <w:spacing w:after="0" w:line="360" w:lineRule="auto"/>
+        <w:ind w:firstLine="680"/>
+        <w:jc w:val="both"/>
+        <w:rPr>
+          <w:lang w:val="pt-PT"/>
+        </w:rPr>
+      </w:pPr>
+      <w:r>
+        <w:rPr>
+          <w:rFonts w:ascii="Times New Roman" w:hAnsi="Times New Roman"/>
+          <w:sz w:val="24"/>
+          <w:lang w:val="pt-PT"/>
+        </w:rPr>
+        <w:t>O FiX-it enquadra-se no domínio das tecnologias web aplicadas à saúde e bem-estar. O objeto de estudo é a viabilidade de uma aplicação web progressiva de análise de composição corporal assistida por inteligência artificial que execute inteiramente no navegador do utilizador, sem envio de dados biométricos para servidores externos, de acesso gratuito e multiplataforma.</w:t>
+      </w:r>
+    </w:p>
+    <w:p>
+      <w:pPr>
+        <w:spacing w:after="0" w:line="360" w:lineRule="auto"/>
+        <w:ind w:firstLine="680"/>
+        <w:jc w:val="both"/>
+        <w:rPr>
+          <w:lang w:val="pt-PT"/>
+        </w:rPr>
+      </w:pPr>
+      <w:r>
+        <w:rPr>
+          <w:rFonts w:ascii="Times New Roman" w:hAnsi="Times New Roman"/>
+          <w:sz w:val="24"/>
+          <w:lang w:val="pt-PT"/>
+        </w:rPr>
+        <w:t>A delimitação do objeto obedece ao modelo SMMARTT: o projeto é Específico (focado na democratização do acesso a ferramentas de análise corporal), Mensurável (58 endpoints, 21 tabelas, 6 métricas biométricas, 14 conquistas, 20 níveis), Significativo (dimensão social, técnica e ética), Alcançável (tecnologias gratuitas e de código aberto), Realista (protótipo funcional com limitações claramente definidas), Limitado no Tempo (7 etapas com prazos no ano letivo 2025/2026) e com Calendarização (cronograma detalhado com dependências sequenciais entre etapas).</w:t>
+      </w:r>
+    </w:p>
+    <w:p>
+      <w:pPr>
+        <w:spacing w:before="200" w:after="80" w:line="360" w:lineRule="auto"/>
+        <w:outlineLvl w:val="1"/>
+        <w:rPr>
+          <w:lang w:val="pt-PT"/>
+        </w:rPr>
+      </w:pPr>
+      <w:r>
+        <w:rPr>
+          <w:rFonts w:ascii="Times New Roman" w:hAnsi="Times New Roman"/>
+          <w:b/>
+          <w:sz w:val="28"/>
+          <w:lang w:val="pt-PT"/>
+        </w:rPr>
+        <w:lastRenderedPageBreak/>
+        <w:t>1.5 Estrutura do Relatório</w:t>
+      </w:r>
+    </w:p>
+    <w:p>
+      <w:pPr>
+        <w:spacing w:after="0" w:line="360" w:lineRule="auto"/>
+        <w:ind w:firstLine="680"/>
+        <w:jc w:val="both"/>
+        <w:rPr>
+          <w:lang w:val="pt-PT"/>
+        </w:rPr>
+      </w:pPr>
+      <w:r>
+        <w:rPr>
+          <w:rFonts w:ascii="Times New Roman" w:hAnsi="Times New Roman"/>
+          <w:sz w:val="24"/>
+          <w:lang w:val="pt-PT"/>
+        </w:rPr>
         <w:t>O presente relatório está organizado em quatro capítulos principais. Após esta Introdução — que inclui a contextualização, o problema, os objetivos e o objeto de estudo —, segue-se a Revisão da Literatura, que apresenta o estado da arte nas áreas relevantes. O capítulo de Materiais e Métodos de Desenvolvimento descreve a metodologia adotada, os materiais utilizados e o processo de desenvolvimento técnico do FiX-it. O capítulo de Resultados e Discussão de Resultados apresenta e discute os resultados obtidos, as limitações identificadas, a validação do sistema e as conclusões do projeto.</w:t>
       </w:r>
     </w:p>
@@ -1594,25 +1710,6 @@
           <w:lang w:val="pt-PT"/>
         </w:rPr>
         <w:br w:type="page"/>
-      </w:r>
-    </w:p>
-    <w:p>
-      <w:pPr>
-        <w:spacing w:after="120" w:line="360" w:lineRule="auto"/>
-        <w:outlineLvl w:val="0"/>
-        <w:rPr>
-          <w:lang w:val="pt-PT"/>
-        </w:rPr>
-      </w:pPr>
-      <w:r>
-        <w:rPr>
-          <w:rFonts w:ascii="Times New Roman" w:hAnsi="Times New Roman"/>
-          <w:b/>
-          <w:sz w:val="32"/>
-          <w:lang w:val="pt-PT"/>
-        </w:rPr>
-        <w:lastRenderedPageBreak/>
-        <w:t>REVISÃO DA LITERATURA</w:t>
       </w:r>
     </w:p>
     <w:p>
@@ -1633,28 +1730,26 @@
           <w:sz w:val="24"/>
           <w:lang w:val="pt-PT"/>
         </w:rPr>
-        <w:t>A crescente adoção de tecnologias digitais no domínio da saúde e do bem-estar impulsionou um ecossistema de investigação que abordou, sob perspetivas complementares, os desafios técnicos, metodológicos e de usabilidade do desenvolvimento de aplicações de fitness assistidas por inteligência artificial. A presente revisão sintetizou a literatura mais recente — publicada entre 2023 e 2025 — organizada em torno das cinco questões de investigação do projeto FiX-it: arquitetura de software REST, requisitos e privacidade, metodologia de desenvolvimento ágil, tecnologias de IA no browser e acessibilidade e usabilidade. A revisão seguiu uma lógica progressiva do geral para o específico, partindo dos fundamentos arquiteturais e metodológicos para chegar às tecnologias concretas e aos princípios de design que moldaram as decisões de implementação do FiX-it.</w:t>
-      </w:r>
-    </w:p>
-    <w:p>
-      <w:pPr>
-        <w:spacing w:before="200" w:after="80" w:line="360" w:lineRule="auto"/>
+        <w:lastRenderedPageBreak/>
+        <w:t>A expectativa central do projeto foi demonstrar que a execução client-side de modelos de inteligência artificial constitui uma abordagem tecnicamente viável e eticamente diferenciada para aplicações de análise corporal, confirmando que a privacidade por design pode coexistir com uma experiência funcional completa e acessível a qualquer utilizador com um navegador web moderno.</w:t>
+      </w:r>
+    </w:p>
+    <w:p>
+      <w:pPr>
+        <w:spacing w:after="120" w:line="360" w:lineRule="auto"/>
         <w:outlineLvl w:val="0"/>
         <w:rPr>
-          <w:rFonts w:ascii="Times New Roman" w:hAnsi="Times New Roman" w:cs="Times New Roman"/>
+          <w:lang w:val="pt-PT"/>
+        </w:rPr>
+      </w:pPr>
+      <w:r>
+        <w:rPr>
+          <w:rFonts w:ascii="Times New Roman" w:hAnsi="Times New Roman"/>
           <w:b/>
-          <w:sz w:val="28"/>
-          <w:lang w:val="pt-PT"/>
-        </w:rPr>
-      </w:pPr>
-      <w:r>
-        <w:rPr>
-          <w:rFonts w:ascii="Times New Roman" w:hAnsi="Times New Roman" w:cs="Times New Roman"/>
-          <w:b/>
-          <w:sz w:val="28"/>
-          <w:lang w:val="pt-PT"/>
-        </w:rPr>
-        <w:t>2.1 Aplicações de Fitness Digitais: Estado da Arte e Lacunas</w:t>
+          <w:sz w:val="32"/>
+          <w:lang w:val="pt-PT"/>
+        </w:rPr>
+        <w:t>REVISÃO DA LITERATURA</w:t>
       </w:r>
     </w:p>
     <w:p>
@@ -1675,7 +1770,28 @@
           <w:sz w:val="24"/>
           <w:lang w:val="pt-PT"/>
         </w:rPr>
-        <w:t>O mercado de aplicações de fitness digitais foi dominado por três paradigmas distintos: aplicações de registo de treino e nutrição (MyFitnessPal, Cronometer), plataformas de coaching personalizado com IA servidor (Freeletics, Future) e aplicações de análise biométrica avançada (Styku, BodyViz). Embora cada paradigma respondesse a necessidades específicas, todos partilharam limitações comuns que o FiX-it procurou superar. Em primeiro lugar, a dependência de infraestrutura cloud para processamento de IA implicou custos operacionais que as aplicações transferiram para o utilizador sob a forma de subscrições mensais, tipicamente entre €8 e €40 por mês. Em segundo lugar, o envio de fotografias corporais para servidores externos criou riscos de privacidade que contrariaram os princípios do RGPD de minimização de dados e limitação da finalidade (Regulation EU 2016/679, 2016). Em terceiro lugar, a maioria das soluções existiu exclusivamente como aplicação nativa iOS/Android, excluindo utilizadores de plataformas menos comuns ou com dispositivos sem capacidade de instalação.</w:t>
+        <w:t>A crescente adoção de tecnologias digitais no domínio da saúde e do bem-estar impulsionou um ecossistema de investigação que abordou, sob perspetivas complementares, os desafios técnicos, metodológicos e de usabilidade do desenvolvimento de aplicações de fitness assistidas por inteligência artificial. A presente revisão sintetizou a literatura mais recente — publicada entre 2023 e 2025 — organizada em torno das cinco questões de investigação do projeto FiX-it: arquitetura de software REST, requisitos e privacidade, metodologia de desenvolvimento ágil, tecnologias de IA no browser e acessibilidade e usabilidade. A revisão seguiu uma lógica progressiva do geral para o específico, partindo dos fundamentos arquiteturais e metodológicos para chegar às tecnologias concretas e aos princípios de design que moldaram as decisões de implementação do FiX-it.</w:t>
+      </w:r>
+    </w:p>
+    <w:p>
+      <w:pPr>
+        <w:spacing w:before="200" w:after="80" w:line="360" w:lineRule="auto"/>
+        <w:outlineLvl w:val="0"/>
+        <w:rPr>
+          <w:rFonts w:ascii="Times New Roman" w:hAnsi="Times New Roman" w:cs="Times New Roman"/>
+          <w:b/>
+          <w:sz w:val="28"/>
+          <w:lang w:val="pt-PT"/>
+        </w:rPr>
+      </w:pPr>
+      <w:r>
+        <w:rPr>
+          <w:rFonts w:ascii="Times New Roman" w:hAnsi="Times New Roman" w:cs="Times New Roman"/>
+          <w:b/>
+          <w:sz w:val="28"/>
+          <w:lang w:val="pt-PT"/>
+        </w:rPr>
+        <w:t>2.1 Aplicações de Fitness Digitais: Estado da Arte e Lacunas</w:t>
       </w:r>
     </w:p>
     <w:p>
@@ -1696,37 +1812,7 @@
           <w:sz w:val="24"/>
           <w:lang w:val="pt-PT"/>
         </w:rPr>
-        <w:t xml:space="preserve">A literatura científica documentou progressos significativos na estimação de composição corporal por câmara. Qiao et al. (2024, p. 5) demonstraram que a reconstrução 3D da forma corporal a partir de fotografias de smartphone permitiu estimar massa gorda e massa isenta de gordura com correlações superiores a r = 0,84 relativamente a medições DEXA de referência, numa coorte validada de 12 435 adultos. Contudo, esta abordagem exigiu processamento </w:t>
-      </w:r>
-      <w:r>
-        <w:rPr>
-          <w:rFonts w:ascii="Times New Roman" w:hAnsi="Times New Roman" w:cs="Times New Roman"/>
-          <w:sz w:val="24"/>
-          <w:lang w:val="pt-PT"/>
-        </w:rPr>
-        <w:lastRenderedPageBreak/>
-        <w:t>computacional intensivo incompatível com execução no browser, o que situou o FiX-it numa posição de compromisso consciente entre precisão e privacidade.</w:t>
-      </w:r>
-    </w:p>
-    <w:p>
-      <w:pPr>
-        <w:spacing w:before="200" w:after="80" w:line="360" w:lineRule="auto"/>
-        <w:outlineLvl w:val="0"/>
-        <w:rPr>
-          <w:rFonts w:ascii="Times New Roman" w:hAnsi="Times New Roman" w:cs="Times New Roman"/>
-          <w:b/>
-          <w:sz w:val="28"/>
-          <w:lang w:val="pt-PT"/>
-        </w:rPr>
-      </w:pPr>
-      <w:r>
-        <w:rPr>
-          <w:rFonts w:ascii="Times New Roman" w:hAnsi="Times New Roman" w:cs="Times New Roman"/>
-          <w:b/>
-          <w:sz w:val="28"/>
-          <w:lang w:val="pt-PT"/>
-        </w:rPr>
-        <w:t>2.2 Arquitetura de Aplicações Web REST e Progressive Web Apps (Q1)</w:t>
+        <w:t>O mercado de aplicações de fitness digitais foi dominado por três paradigmas distintos: aplicações de registo de treino e nutrição (MyFitnessPal, Cronometer), plataformas de coaching personalizado com IA servidor (Freeletics, Future) e aplicações de análise biométrica avançada (Styku, BodyViz). Embora cada paradigma respondesse a necessidades específicas, todos partilharam limitações comuns que o FiX-it procurou superar. Em primeiro lugar, a dependência de infraestrutura cloud para processamento de IA implicou custos operacionais que as aplicações transferiram para o utilizador sob a forma de subscrições mensais, tipicamente entre €8 e €40 por mês. Em segundo lugar, o envio de fotografias corporais para servidores externos criou riscos de privacidade que contrariaram os princípios do RGPD de minimização de dados e limitação da finalidade (Regulation EU 2016/679, 2016). Em terceiro lugar, a maioria das soluções existiu exclusivamente como aplicação nativa iOS/Android, excluindo utilizadores de plataformas menos comuns ou com dispositivos sem capacidade de instalação.</w:t>
       </w:r>
     </w:p>
     <w:p>
@@ -1747,7 +1833,37 @@
           <w:sz w:val="24"/>
           <w:lang w:val="pt-PT"/>
         </w:rPr>
-        <w:t>A arquitetura REST tornou-se o padrão dominante para APIs web que suportaram múltiplos clientes, mas a sua adoção em produção revelou variações significativas na aderência às suas regras de design. Bogner et al. (2023, Sec. 4.2) investigaram empiricamente se o cumprimento dessas regras teve impacto mensurável na compreensibilidade das APIs, concluindo que determinadas convenções — como o uso consistente de verbos HTTP e a estruturação hierárquica dos recursos — reduziram significativamente o tempo de integração por parte de programadores externos. Esta evidência justificou a adoção de um estilo REST rigoroso no backend do FiX-it, com 58 endpoints organizados por domínio funcional. Do lado do cliente, Vepsäläinen et al. (2023, p. 325) contextualizaram historicamente a evolução dos frameworks JavaScript, identificando a tendência para frameworks que minimizaram ou eliminaram o overhead de runtime e descrevendo o paradigma de single-page application como uma abordagem matura com custos de complexidade crescente à medida que as dependências se acumularam. Esta perspetiva sustentou a decisão de desenvolver o frontend do FiX-it em JavaScript vanilla, mantendo controlo total sobre o ciclo de vida da aplicação num projeto com prazo e recursos académicos limitados.</w:t>
+        <w:t xml:space="preserve">A literatura científica documentou progressos significativos na estimação de composição corporal por câmara. Qiao et al. (2024, p. 5) demonstraram que a reconstrução 3D da forma corporal a partir de fotografias de smartphone permitiu estimar massa gorda e massa isenta de gordura com correlações superiores a r = 0,84 relativamente a medições DEXA de referência, </w:t>
+      </w:r>
+      <w:r>
+        <w:rPr>
+          <w:rFonts w:ascii="Times New Roman" w:hAnsi="Times New Roman" w:cs="Times New Roman"/>
+          <w:sz w:val="24"/>
+          <w:lang w:val="pt-PT"/>
+        </w:rPr>
+        <w:lastRenderedPageBreak/>
+        <w:t>numa coorte validada de 12 435 adultos. Contudo, esta abordagem exigiu processamento computacional intensivo incompatível com execução no browser, o que situou o FiX-it numa posição de compromisso consciente entre precisão e privacidade.</w:t>
+      </w:r>
+    </w:p>
+    <w:p>
+      <w:pPr>
+        <w:spacing w:before="200" w:after="80" w:line="360" w:lineRule="auto"/>
+        <w:outlineLvl w:val="0"/>
+        <w:rPr>
+          <w:rFonts w:ascii="Times New Roman" w:hAnsi="Times New Roman" w:cs="Times New Roman"/>
+          <w:b/>
+          <w:sz w:val="28"/>
+          <w:lang w:val="pt-PT"/>
+        </w:rPr>
+      </w:pPr>
+      <w:r>
+        <w:rPr>
+          <w:rFonts w:ascii="Times New Roman" w:hAnsi="Times New Roman" w:cs="Times New Roman"/>
+          <w:b/>
+          <w:sz w:val="28"/>
+          <w:lang w:val="pt-PT"/>
+        </w:rPr>
+        <w:t>2.2 Arquitetura de Aplicações Web REST e Progressive Web Apps (Q1)</w:t>
       </w:r>
     </w:p>
     <w:p>
@@ -1768,28 +1884,7 @@
           <w:sz w:val="24"/>
           <w:lang w:val="pt-PT"/>
         </w:rPr>
-        <w:t>A natureza progressiva da aplicação foi enquadrada pela documentação técnica da Mozilla (MDN Web Docs, 2025, para. 1), que definiu os requisitos mínimos de uma PWA — Service Worker registado, Web App Manifest válido e disponibilização via HTTPS — e detalhou as estratégias de caching e os mecanismos de sincronização em background. Ahmad et al. (2023, Sec. 4.4) complementaram este enquadramento com o mapeamento das dimensões específicas da engenharia de requisitos para sistemas de IA que diferiram dos sistemas tradicionais, nomeadamente a necessidade de especificar requisitos de qualidade dos dados de entrada, margens de erro aceitáveis e mecanismos de explicabilidade.</w:t>
-      </w:r>
-    </w:p>
-    <w:p>
-      <w:pPr>
-        <w:spacing w:before="200" w:after="80" w:line="360" w:lineRule="auto"/>
-        <w:outlineLvl w:val="0"/>
-        <w:rPr>
-          <w:rFonts w:ascii="Times New Roman" w:hAnsi="Times New Roman" w:cs="Times New Roman"/>
-          <w:b/>
-          <w:sz w:val="28"/>
-          <w:lang w:val="pt-PT"/>
-        </w:rPr>
-      </w:pPr>
-      <w:r>
-        <w:rPr>
-          <w:rFonts w:ascii="Times New Roman" w:hAnsi="Times New Roman" w:cs="Times New Roman"/>
-          <w:b/>
-          <w:sz w:val="28"/>
-          <w:lang w:val="pt-PT"/>
-        </w:rPr>
-        <w:t>2.3 Requisitos Funcionais, Não Funcionais e Privacidade (Q2)</w:t>
+        <w:t>A arquitetura REST tornou-se o padrão dominante para APIs web que suportaram múltiplos clientes, mas a sua adoção em produção revelou variações significativas na aderência às suas regras de design. Bogner et al. (2023, Sec. 4.2) investigaram empiricamente se o cumprimento dessas regras teve impacto mensurável na compreensibilidade das APIs, concluindo que determinadas convenções — como o uso consistente de verbos HTTP e a estruturação hierárquica dos recursos — reduziram significativamente o tempo de integração por parte de programadores externos. Esta evidência justificou a adoção de um estilo REST rigoroso no backend do FiX-it, com 58 endpoints organizados por domínio funcional. Do lado do cliente, Vepsäläinen et al. (2023, p. 325) contextualizaram historicamente a evolução dos frameworks JavaScript, identificando a tendência para frameworks que minimizaram ou eliminaram o overhead de runtime e descrevendo o paradigma de single-page application como uma abordagem matura com custos de complexidade crescente à medida que as dependências se acumularam. Esta perspetiva sustentou a decisão de desenvolver o frontend do FiX-it em JavaScript vanilla, mantendo controlo total sobre o ciclo de vida da aplicação num projeto com prazo e recursos académicos limitados.</w:t>
       </w:r>
     </w:p>
     <w:p>
@@ -1810,16 +1905,28 @@
           <w:sz w:val="24"/>
           <w:lang w:val="pt-PT"/>
         </w:rPr>
-        <w:t xml:space="preserve">A definição dos requisitos do FiX-it exigiu uma abordagem que combinou as técnicas de engenharia de requisitos ágil com os imperativos regulatórios da proteção de dados. Hoy e Xu (2023, p. 8) identificaram os principais desafios da elicitação de requisitos em contexto ágil — </w:t>
-      </w:r>
-      <w:r>
+        <w:t>A natureza progressiva da aplicação foi enquadrada pela documentação técnica da Mozilla (MDN Web Docs, 2025, para. 1), que definiu os requisitos mínimos de uma PWA — Service Worker registado, Web App Manifest válido e disponibilização via HTTPS — e detalhou as estratégias de caching e os mecanismos de sincronização em background. Ahmad et al. (2023, Sec. 4.4) complementaram este enquadramento com o mapeamento das dimensões específicas da engenharia de requisitos para sistemas de IA que diferiram dos sistemas tradicionais, nomeadamente a necessidade de especificar requisitos de qualidade dos dados de entrada, margens de erro aceitáveis e mecanismos de explicabilidade.</w:t>
+      </w:r>
+    </w:p>
+    <w:p>
+      <w:pPr>
+        <w:spacing w:before="200" w:after="80" w:line="360" w:lineRule="auto"/>
+        <w:outlineLvl w:val="0"/>
         <w:rPr>
           <w:rFonts w:ascii="Times New Roman" w:hAnsi="Times New Roman" w:cs="Times New Roman"/>
-          <w:sz w:val="24"/>
-          <w:lang w:val="pt-PT"/>
-        </w:rPr>
-        <w:lastRenderedPageBreak/>
-        <w:t>volatilidade dos requisitos, lacunas de comunicação e rastreabilidade insuficiente — e propuseram um quadro conceptual de soluções adaptadas a cada categoria, que foi incorporado no processo iterativo de especificação do FiX-it. Ahmad et al. (2023, Sec. 4.4) complementaram esta perspetiva com o mapeamento dos requisitos não funcionais específicos de sistemas de IA: precisão e robustez dos modelos, privacidade dos dados processados na inferência, explicabilidade das predições e conformidade ética. No FiX-it, estes requisitos traduziram-se na execução local dos modelos sem envio de imagens para servidores externos, na camada de explicabilidade nos resultados e nos disclaimers de natureza não clínica.</w:t>
+          <w:b/>
+          <w:sz w:val="28"/>
+          <w:lang w:val="pt-PT"/>
+        </w:rPr>
+      </w:pPr>
+      <w:r>
+        <w:rPr>
+          <w:rFonts w:ascii="Times New Roman" w:hAnsi="Times New Roman" w:cs="Times New Roman"/>
+          <w:b/>
+          <w:sz w:val="28"/>
+          <w:lang w:val="pt-PT"/>
+        </w:rPr>
+        <w:t>2.3 Requisitos Funcionais, Não Funcionais e Privacidade (Q2)</w:t>
       </w:r>
     </w:p>
     <w:p>
@@ -1840,28 +1947,16 @@
           <w:sz w:val="24"/>
           <w:lang w:val="pt-PT"/>
         </w:rPr>
-        <w:t>A dimensão regulatória foi abordada por Ayala-Rivera et al. (2024, p. 12), que propuseram a metodologia SoCo para incorporar controlos de privacidade e segurança diretamente nos artefactos de design de software, alcançando conformidade com o RGPD durante o desenvolvimento. A sua demonstração de que o privacy by design foi tecnicamente viável sem comprometer o ritmo ágil moldou as decisões de segurança do FiX-it: JWT com tokens de curta duração, bcrypt com 12 salt rounds, isolamento de dados por utilizador e ausência de partilha de dados biométricos com terceiros.</w:t>
-      </w:r>
-    </w:p>
-    <w:p>
-      <w:pPr>
-        <w:spacing w:before="200" w:after="80" w:line="360" w:lineRule="auto"/>
-        <w:outlineLvl w:val="0"/>
+        <w:t xml:space="preserve">A definição dos requisitos do FiX-it exigiu uma abordagem que combinou as técnicas de engenharia de requisitos ágil com os imperativos regulatórios da proteção de dados. Hoy e Xu </w:t>
+      </w:r>
+      <w:r>
         <w:rPr>
           <w:rFonts w:ascii="Times New Roman" w:hAnsi="Times New Roman" w:cs="Times New Roman"/>
-          <w:b/>
-          <w:sz w:val="28"/>
-          <w:lang w:val="pt-PT"/>
-        </w:rPr>
-      </w:pPr>
-      <w:r>
-        <w:rPr>
-          <w:rFonts w:ascii="Times New Roman" w:hAnsi="Times New Roman" w:cs="Times New Roman"/>
-          <w:b/>
-          <w:sz w:val="28"/>
-          <w:lang w:val="pt-PT"/>
-        </w:rPr>
-        <w:t>2.4 Metodologia de Desenvolvimento Ágil em Contexto Académico (Q3)</w:t>
+          <w:sz w:val="24"/>
+          <w:lang w:val="pt-PT"/>
+        </w:rPr>
+        <w:lastRenderedPageBreak/>
+        <w:t>(2023, p. 8) identificaram os principais desafios da elicitação de requisitos em contexto ágil — volatilidade dos requisitos, lacunas de comunicação e rastreabilidade insuficiente — e propuseram um quadro conceptual de soluções adaptadas a cada categoria, que foi incorporado no processo iterativo de especificação do FiX-it. Ahmad et al. (2023, Sec. 4.4) complementaram esta perspetiva com o mapeamento dos requisitos não funcionais específicos de sistemas de IA: precisão e robustez dos modelos, privacidade dos dados processados na inferência, explicabilidade das predições e conformidade ética. No FiX-it, estes requisitos traduziram-se na execução local dos modelos sem envio de imagens para servidores externos, na camada de explicabilidade nos resultados e nos disclaimers de natureza não clínica.</w:t>
       </w:r>
     </w:p>
     <w:p>
@@ -1882,7 +1977,28 @@
           <w:sz w:val="24"/>
           <w:lang w:val="pt-PT"/>
         </w:rPr>
-        <w:t>A escolha de uma metodologia adequada ao contexto académico do FiX-it — projeto individual com prazo fixo, orientador externo e entregas intercalares — assentou numa base empírica fornecida por investigação recente. Sassa et al. (2023, Sec. IV.B, p. 177) realizaram uma revisão sistemática sobre Scrum que confirmou que as metodologias ágeis, mesmo em equipas reduzidas, aumentaram a cadência de entrega de valor e melhoraram a capacidade de resposta a mudanças de requisitos — característica particularmente valiosa num projeto de IA com algoritmos que evoluíram com a implementação. Mishra e Alzoubi (2023, p. 1515) estabeleceram que projetos com requisitos parcialmente indefinidos à partida e componentes exploratórias beneficiaram da flexibilidade ágil, enquanto projetos com requisitos estáveis e elevadas exigências de documentação formal beneficiaram de abordagens mais estruturadas. O FiX-it enquadrou-se claramente no primeiro perfil.</w:t>
+        <w:t>A dimensão regulatória foi abordada por Ayala-Rivera et al. (2024, p. 12), que propuseram a metodologia SoCo para incorporar controlos de privacidade e segurança diretamente nos artefactos de design de software, alcançando conformidade com o RGPD durante o desenvolvimento. A sua demonstração de que o privacy by design foi tecnicamente viável sem comprometer o ritmo ágil moldou as decisões de segurança do FiX-it: JWT com tokens de curta duração, bcrypt com 12 salt rounds, isolamento de dados por utilizador e ausência de partilha de dados biométricos com terceiros.</w:t>
+      </w:r>
+    </w:p>
+    <w:p>
+      <w:pPr>
+        <w:spacing w:before="200" w:after="80" w:line="360" w:lineRule="auto"/>
+        <w:outlineLvl w:val="0"/>
+        <w:rPr>
+          <w:rFonts w:ascii="Times New Roman" w:hAnsi="Times New Roman" w:cs="Times New Roman"/>
+          <w:b/>
+          <w:sz w:val="28"/>
+          <w:lang w:val="pt-PT"/>
+        </w:rPr>
+      </w:pPr>
+      <w:r>
+        <w:rPr>
+          <w:rFonts w:ascii="Times New Roman" w:hAnsi="Times New Roman" w:cs="Times New Roman"/>
+          <w:b/>
+          <w:sz w:val="28"/>
+          <w:lang w:val="pt-PT"/>
+        </w:rPr>
+        <w:t>2.4 Metodologia de Desenvolvimento Ágil em Contexto Académico (Q3)</w:t>
       </w:r>
     </w:p>
     <w:p>
@@ -1903,37 +2019,7 @@
           <w:sz w:val="24"/>
           <w:lang w:val="pt-PT"/>
         </w:rPr>
-        <w:t xml:space="preserve">Hoy e Xu (2023, p. 8) acrescentaram que a integração de sprint reviews com demonstração funcional ao stakeholder reduziu a divergência entre requisitos especificados e produto implementado — prática incorporada nas revisões periódicas com o orientador. O quadro </w:t>
-      </w:r>
-      <w:r>
-        <w:rPr>
-          <w:rFonts w:ascii="Times New Roman" w:hAnsi="Times New Roman" w:cs="Times New Roman"/>
-          <w:sz w:val="24"/>
-          <w:lang w:val="pt-PT"/>
-        </w:rPr>
-        <w:lastRenderedPageBreak/>
-        <w:t>Scrum foi adaptado ao contexto de projeto individual: o aluno assumiu simultaneamente os papéis de Product Owner e Developer, com sprints de duas semanas e revisões periódicas com o orientador no papel de stakeholder. O backlog foi priorizado por valor e atualizado iterativamente em resposta ao feedback das revisões, incorporando as práticas de integração de ciclos de revisão de requisitos documentadas por Hoy e Xu (2023).</w:t>
-      </w:r>
-    </w:p>
-    <w:p>
-      <w:pPr>
-        <w:spacing w:before="200" w:after="80" w:line="360" w:lineRule="auto"/>
-        <w:outlineLvl w:val="0"/>
-        <w:rPr>
-          <w:rFonts w:ascii="Times New Roman" w:hAnsi="Times New Roman" w:cs="Times New Roman"/>
-          <w:b/>
-          <w:sz w:val="28"/>
-          <w:lang w:val="pt-PT"/>
-        </w:rPr>
-      </w:pPr>
-      <w:r>
-        <w:rPr>
-          <w:rFonts w:ascii="Times New Roman" w:hAnsi="Times New Roman" w:cs="Times New Roman"/>
-          <w:b/>
-          <w:sz w:val="28"/>
-          <w:lang w:val="pt-PT"/>
-        </w:rPr>
-        <w:t>2.5 Tecnologias de Inteligência Artificial no Browser (Q4)</w:t>
+        <w:t>A escolha de uma metodologia adequada ao contexto académico do FiX-it — projeto individual com prazo fixo, orientador externo e entregas intercalares — assentou numa base empírica fornecida por investigação recente. Sassa et al. (2023, Sec. IV.B, p. 177) realizaram uma revisão sistemática sobre Scrum que confirmou que as metodologias ágeis, mesmo em equipas reduzidas, aumentaram a cadência de entrega de valor e melhoraram a capacidade de resposta a mudanças de requisitos — característica particularmente valiosa num projeto de IA com algoritmos que evoluíram com a implementação. Mishra e Alzoubi (2023, p. 1515) estabeleceram que projetos com requisitos parcialmente indefinidos à partida e componentes exploratórias beneficiaram da flexibilidade ágil, enquanto projetos com requisitos estáveis e elevadas exigências de documentação formal beneficiaram de abordagens mais estruturadas. O FiX-it enquadrou-se claramente no primeiro perfil.</w:t>
       </w:r>
     </w:p>
     <w:p>
@@ -1954,7 +2040,28 @@
           <w:sz w:val="24"/>
           <w:lang w:val="pt-PT"/>
         </w:rPr>
-        <w:t>A execução de modelos de IA diretamente no browser, sem recurso a servidores de inferência, foi a decisão tecnológica mais distintiva do FiX-it. Kim et al. (2023, p. 13) investigaram o MediaPipe Pose em contexto de exercício físico e propuseram um método de otimização baseado em modelo humanoide que elevou a precisão dos 33 marcos anatómicos detetados a taxas superiores a 90% em condições frontais controladas — confirmando a adequação do modelo a aplicações de fitness. Dill et al. (2023, p. 565) aprofundaram esta avaliação quantificando o erro de estimação em diferentes condições, alertando para a degradação de precisão em poses de perfil e com oclusão parcial — condições frequentes em fotografias corporais domésticas. Esta evidência informou a inclusão no FiX-it de indicadores de qualidade de imagem e orientações para o utilizador sobre pose e iluminação ideais.</w:t>
+        <w:t>Hoy e Xu (2023, p. 8) acrescentaram que a integração de sprint reviews com demonstração funcional ao stakeholder reduziu a divergência entre requisitos especificados e produto implementado — prática incorporada nas revisões periódicas com o orientador. O quadro Scrum foi adaptado ao contexto de projeto individual: o aluno assumiu simultaneamente os papéis de Product Owner e Developer, com sprints de duas semanas e revisões periódicas com o orientador no papel de stakeholder. O backlog foi priorizado por valor e atualizado iterativamente em resposta ao feedback das revisões, incorporando as práticas de integração de ciclos de revisão de requisitos documentadas por Hoy e Xu (2023).</w:t>
+      </w:r>
+    </w:p>
+    <w:p>
+      <w:pPr>
+        <w:spacing w:before="200" w:after="80" w:line="360" w:lineRule="auto"/>
+        <w:outlineLvl w:val="0"/>
+        <w:rPr>
+          <w:rFonts w:ascii="Times New Roman" w:hAnsi="Times New Roman" w:cs="Times New Roman"/>
+          <w:b/>
+          <w:sz w:val="28"/>
+          <w:lang w:val="pt-PT"/>
+        </w:rPr>
+      </w:pPr>
+      <w:r>
+        <w:rPr>
+          <w:rFonts w:ascii="Times New Roman" w:hAnsi="Times New Roman" w:cs="Times New Roman"/>
+          <w:b/>
+          <w:sz w:val="28"/>
+          <w:lang w:val="pt-PT"/>
+        </w:rPr>
+        <w:t>2.5 Tecnologias de Inteligência Artificial no Browser (Q4)</w:t>
       </w:r>
     </w:p>
     <w:p>
@@ -1975,28 +2082,7 @@
           <w:sz w:val="24"/>
           <w:lang w:val="pt-PT"/>
         </w:rPr>
-        <w:t>Qiao et al. (2024, p. 5) estabeleceram o estado da arte em estimação de composição corporal por câmara, demonstrando correlações superiores a r = 0,84 com medições DEXA numa coorte de 12 435 adultos. A comparação com esta referência situou a abordagem 2D do FiX-it num patamar técnico inferior, justificando a apresentação explícita das limitações ao utilizador. A camada de persistência foi sustentada por PostgreSQL Global Development Group (2026), que documentou as capacidades do PostgreSQL 18 para séries temporais de métricas fisiológicas com restrições de integridade por utilizador/data.</w:t>
-      </w:r>
-    </w:p>
-    <w:p>
-      <w:pPr>
-        <w:spacing w:before="200" w:after="80" w:line="360" w:lineRule="auto"/>
-        <w:outlineLvl w:val="0"/>
-        <w:rPr>
-          <w:rFonts w:ascii="Times New Roman" w:hAnsi="Times New Roman" w:cs="Times New Roman"/>
-          <w:b/>
-          <w:sz w:val="28"/>
-          <w:lang w:val="pt-PT"/>
-        </w:rPr>
-      </w:pPr>
-      <w:r>
-        <w:rPr>
-          <w:rFonts w:ascii="Times New Roman" w:hAnsi="Times New Roman" w:cs="Times New Roman"/>
-          <w:b/>
-          <w:sz w:val="28"/>
-          <w:lang w:val="pt-PT"/>
-        </w:rPr>
-        <w:t>2.6 Acessibilidade, Usabilidade e Design Centrado no Utilizador (Q5)</w:t>
+        <w:t>A execução de modelos de IA diretamente no browser, sem recurso a servidores de inferência, foi a decisão tecnológica mais distintiva do FiX-it. Kim et al. (2023, p. 13) investigaram o MediaPipe Pose em contexto de exercício físico e propuseram um método de otimização baseado em modelo humanoide que elevou a precisão dos 33 marcos anatómicos detetados a taxas superiores a 90% em condições frontais controladas — confirmando a adequação do modelo a aplicações de fitness. Dill et al. (2023, p. 565) aprofundaram esta avaliação quantificando o erro de estimação em diferentes condições, alertando para a degradação de precisão em poses de perfil e com oclusão parcial — condições frequentes em fotografias corporais domésticas. Esta evidência informou a inclusão no FiX-it de indicadores de qualidade de imagem e orientações para o utilizador sobre pose e iluminação ideais.</w:t>
       </w:r>
     </w:p>
     <w:p>
@@ -2017,16 +2103,49 @@
           <w:sz w:val="24"/>
           <w:lang w:val="pt-PT"/>
         </w:rPr>
-        <w:t xml:space="preserve">A dimensão humana do FiX-it foi enquadrada por três referências complementares. Galavi et al. (2024, Results, para. 1) identificaram, numa revisão sistemática de avaliações de aplicações móveis de saúde, que a visibilidade do estado do sistema, o controlo do utilizador e a prevenção de erros figuraram entre as heurísticas de usabilidade mais frequentemente aplicadas — orientando decisões como o indicador de progresso durante a análise de IA, o botão de cancelamento em operações longas e a validação em tempo real nos formulários. Kirkpatrick et </w:t>
-      </w:r>
-      <w:r>
+        <w:t>Qiao et al. (2024, p. 5) estabeleceram o estado da arte em estimação de composição corporal por câmara, demonstrando correlações superiores a r = 0,84 com medições DEXA numa coorte de 12 435 adultos. A comparação com esta referência situou a abordagem 2D do FiX-it num patamar técnico inferior, justificando a apresentação explícita das limitações ao utilizador. A camada de persistência foi sustentada por PostgreSQL Global Development Group (2026), que documentou as capacidades do PostgreSQL 18 para séries temporais de métricas fisiológicas com restrições de integridade por utilizador/data.</w:t>
+      </w:r>
+    </w:p>
+    <w:p>
+      <w:pPr>
+        <w:spacing w:before="200" w:after="80" w:line="360" w:lineRule="auto"/>
+        <w:outlineLvl w:val="0"/>
         <w:rPr>
           <w:rFonts w:ascii="Times New Roman" w:hAnsi="Times New Roman" w:cs="Times New Roman"/>
-          <w:sz w:val="24"/>
-          <w:lang w:val="pt-PT"/>
-        </w:rPr>
-        <w:lastRenderedPageBreak/>
-        <w:t>al. (2023) editaram as WCAG 2.2, introduzindo novos critérios para autenticação acessível, foco visível e interações por arrastamento, constituindo o referencial normativo atual para conformidade AA. A auditoria do FiX-it verificou contraste mínimo 4,5:1, navegabilidade por teclado, atributos ARIA em regiões dinâmicas e ausência de CAPTCHA no fluxo de autenticação.</w:t>
+          <w:b/>
+          <w:sz w:val="28"/>
+          <w:lang w:val="pt-PT"/>
+        </w:rPr>
+      </w:pPr>
+      <w:r>
+        <w:rPr>
+          <w:rFonts w:ascii="Times New Roman" w:hAnsi="Times New Roman" w:cs="Times New Roman"/>
+          <w:b/>
+          <w:sz w:val="28"/>
+          <w:lang w:val="pt-PT"/>
+        </w:rPr>
+        <w:t>2.6 Acessibilidade, Usabilidade e Design Centrado no Utilizador (Q5)</w:t>
+      </w:r>
+    </w:p>
+    <w:p>
+      <w:pPr>
+        <w:spacing w:after="0" w:line="360" w:lineRule="auto"/>
+        <w:ind w:firstLine="680"/>
+        <w:jc w:val="both"/>
+        <w:outlineLvl w:val="0"/>
+        <w:rPr>
+          <w:rFonts w:ascii="Times New Roman" w:hAnsi="Times New Roman" w:cs="Times New Roman"/>
+          <w:sz w:val="24"/>
+          <w:lang w:val="pt-PT"/>
+        </w:rPr>
+      </w:pPr>
+      <w:r>
+        <w:rPr>
+          <w:rFonts w:ascii="Times New Roman" w:hAnsi="Times New Roman" w:cs="Times New Roman"/>
+          <w:sz w:val="24"/>
+          <w:lang w:val="pt-PT"/>
+        </w:rPr>
+        <w:t>A dimensão humana do FiX-it foi enquadrada por três referências complementares. Galavi et al. (2024, Results, para. 1) identificaram, numa revisão sistemática de avaliações de aplicações móveis de saúde, que a visibilidade do estado do sistema, o controlo do utilizador e a prevenção de erros figuraram entre as heurísticas de usabilidade mais frequentemente aplicadas — orientando decisões como o indicador de progresso durante a análise de IA, o botão de cancelamento em operações longas e a validação em tempo real nos formulários. Kirkpatrick et al. (2023) editaram as WCAG 2.2, introduzindo novos critérios para autenticação acessível, foco visível e interações por arrastamento, constituindo o referencial normativo atual para conformidade AA. A auditoria do FiX-it verificou contraste mínimo 4,5:1, navegabilidade por teclado, atributos ARIA em regiões dinâmicas e ausência de CAPTCHA no fluxo de autenticação.</w:t>
       </w:r>
     </w:p>
     <w:p>
@@ -3708,6 +3827,7 @@
           <w:sz w:val="24"/>
           <w:lang w:val="pt-PT"/>
         </w:rPr>
+        <w:lastRenderedPageBreak/>
         <w:t xml:space="preserve">Do total de 58 endpoints planeados, estavam implementados e testados: autenticação (8/8), utilizador (6/6), análise (8/8), treino (11/11) e nutrição (10/10), perfazendo </w:t>
       </w:r>
       <w:r>
@@ -3786,7 +3906,6 @@
           <w:sz w:val="24"/>
           <w:lang w:val="pt-PT"/>
         </w:rPr>
-        <w:lastRenderedPageBreak/>
         <w:t>As seis métricas biométricas mostraram-se consistentes em condições favoráveis (iluminação frontal homogénea, vestuário ajustado de cor clara, câmara a dois metros), mas apresentaram variabilidade significativa em condições subótimas. A comparação com Qiao et al. (2024, p. 5) — r &gt; 0,84 com medições DEXA via reconstrução 3D — situa a abordagem 2D do FiX-it como um compromisso consciente entre precisão clínica e privacidade absoluta dos dados biométricos.</w:t>
       </w:r>
     </w:p>
@@ -3859,6 +3978,7 @@
           <w:sz w:val="28"/>
           <w:lang w:val="pt-PT"/>
         </w:rPr>
+        <w:lastRenderedPageBreak/>
         <w:t>4.4 Avaliação de Usabilidade e Acessibilidade</w:t>
       </w:r>
     </w:p>
@@ -3939,7 +4059,6 @@
           <w:sz w:val="24"/>
           <w:lang w:val="pt-PT"/>
         </w:rPr>
-        <w:lastRenderedPageBreak/>
         <w:t>No decorrer do desenvolvimento do FiX-it, dois obstáculos técnicos condicionaram decisões de arquitetura e exigiram investigação e reformulação da solução: a configuração do serviço de email e a sincronização de dados entre dispositivos. Esta secção descreve o problema identificado, o processo de diagnóstico e a solução adotada em cada caso, ilustrados com excertos de código.</w:t>
       </w:r>
     </w:p>
@@ -4008,6 +4127,7 @@
           <w:sz w:val="24"/>
           <w:lang w:val="pt-PT"/>
         </w:rPr>
+        <w:lastRenderedPageBreak/>
         <w:t>A configuração inicial usava a conta de email da escola (carlos.dju@my.istec.pt) com uma App Password do Gmail como servidor SMTP, através da biblioteca Nodemailer. Em ambiente de desenvolvimento local o envio não gerava qualquer erro — o Nodemailer confirmava a entrega com sucesso e não era lançada nenhuma exceção. O problema era silencioso: os emails apenas chegavam à própria conta da escola utilizada no campo SMTP_USER. Qualquer utilizador que se registasse com um endereço de email diferente nunca recebia o código de verificação, sem que qualquer mensagem de erro aparecesse nos logs do servidor.</w:t>
       </w:r>
     </w:p>
@@ -4053,7 +4173,6 @@
         <w:rPr>
           <w:noProof/>
         </w:rPr>
-        <w:lastRenderedPageBreak/>
         <w:drawing>
           <wp:inline distT="0" distB="0" distL="0" distR="0" wp14:anchorId="04B64DB9" wp14:editId="2FB1F4E2">
             <wp:extent cx="5972810" cy="3760470"/>
@@ -4141,6 +4260,7 @@
           <w:sz w:val="28"/>
           <w:lang w:val="pt-PT"/>
         </w:rPr>
+        <w:lastRenderedPageBreak/>
         <w:t>A solução foi abandonar o SMTP completamente e adotar a API REST da Brevo, um serviço de email transacional que entrega mensagens a qualquer endereço sem restrições de domínio. A integração é feita através de um pedido HTTPS direto à API da Brevo com uma api-key como credencial, eliminando a dependência de servidores SMTP e a variabilidade de configuração entre ambientes de desenvolvimento e produção. As figuras seguintes mostram o código original com Nodemailer SMTP e o código corrigido com a API Brevo.</w:t>
       </w:r>
     </w:p>
@@ -4537,7 +4657,16 @@
           <w:sz w:val="24"/>
           <w:lang w:val="pt-PT"/>
         </w:rPr>
-        <w:t>A arquitetura privacy-first confirmou a tese de Ayala-Rivera et al. (2024, p. 12) de que o privacy by design não implicou compromisso na funcionalidade: toda a inferência de IA processou-se localmente no browser do utilizador, sem qualquer envio de imagens corporais para servidores externos, cumprindo os princípios de minimização de dados e limitação da finalidade do RGPD (Regulation EU 2016/679, 2016). Esta abordagem distinguiu o FiX-it das soluções comerciais dominantes — MyFitnessPal, Freeletics e Future — que dependem de infraestrutura cloud para processamento de dados biométricos, e confirmou empiricamente a sua viabilidade técnica sem sacrifício da riqueza funcional. A arquitetura REST de 58 endpoints confirmou as conclusões de Bogner et al. (2023, Sec. 4.2) sobre a importância da consistência dos verbos HTTP e da estruturação hierárquica dos recursos para a compreensibilidade das APIs. A decisão de desenvolver o frontend em JavaScript vanilla alinhou-se com a análise de Vepsäläinen et al. (2023, p. 325) sobre o custo-benefício das abordagens sem overhead de runtime em projetos com prazo definido.</w:t>
+        <w:t xml:space="preserve">A arquitetura privacy-first confirmou a tese de Ayala-Rivera et al. (2024, p. 12) de que o privacy by design não implicou compromisso na funcionalidade: toda a inferência de IA processou-se localmente no browser do utilizador, sem qualquer envio de imagens corporais para servidores externos, cumprindo os princípios de minimização de dados e limitação da finalidade do RGPD (Regulation EU 2016/679, 2016). Esta abordagem distinguiu o FiX-it das soluções comerciais dominantes — MyFitnessPal, Freeletics e Future — que dependem de infraestrutura cloud para processamento de dados biométricos, e confirmou empiricamente a sua viabilidade técnica sem sacrifício da riqueza funcional. A arquitetura REST de 58 endpoints confirmou as conclusões de Bogner et al. (2023, Sec. 4.2) sobre a importância da consistência dos verbos </w:t>
+      </w:r>
+      <w:r>
+        <w:rPr>
+          <w:rFonts w:ascii="Times New Roman" w:hAnsi="Times New Roman" w:cs="Times New Roman"/>
+          <w:sz w:val="24"/>
+          <w:lang w:val="pt-PT"/>
+        </w:rPr>
+        <w:lastRenderedPageBreak/>
+        <w:t>HTTP e da estruturação hierárquica dos recursos para a compreensibilidade das APIs. A decisão de desenvolver o frontend em JavaScript vanilla alinhou-se com a análise de Vepsäläinen et al. (2023, p. 325) sobre o custo-benefício das abordagens sem overhead de runtime em projetos com prazo definido.</w:t>
       </w:r>
     </w:p>
     <w:p>
@@ -4628,6 +4757,7 @@
           <w:sz w:val="24"/>
           <w:lang w:val="pt-PT"/>
         </w:rPr>
+        <w:lastRenderedPageBreak/>
         <w:t xml:space="preserve">As principais contribuições técnicas do projeto são cinco: (i) pipeline de análise corporal client-side que combina MediaPipe Pose com análise de pixéis para cálculo de seis métricas biométricas; (ii) arquitetura REST de 58 endpoints com autenticação JWT de dois tokens e conformidade RGPD por design; (iii) sistema de gamificação com 14 conquistas, 20 níveis e multiplicadores de streak; (iv) coach virtual com quatro personalidades baseado em classificação de intenção por padrões; e </w:t>
       </w:r>
       <w:r>
@@ -4723,16 +4853,7 @@
           <w:sz w:val="24"/>
           <w:lang w:val="pt-PT"/>
         </w:rPr>
-        <w:t xml:space="preserve">O desenvolvimento futuro deverá prosseguir em quatro direções prioritárias: (i) conclusão das Etapas 6 e 7 para transformar o protótipo num produto plenamente funcional e acessível ao </w:t>
-      </w:r>
-      <w:r>
-        <w:rPr>
-          <w:rFonts w:ascii="Times New Roman" w:hAnsi="Times New Roman"/>
-          <w:sz w:val="24"/>
-          <w:lang w:val="pt-PT"/>
-        </w:rPr>
-        <w:lastRenderedPageBreak/>
-        <w:t>público; (ii) expansão da base de dados nutricional através da integração com a API Open Food Facts; (iii) condução de um estudo longitudinal com utilizadores reais para avaliar o impacto do sistema de gamificação na adesão e na progressão das métricas corporais; e (iv) exploração da integração de um modelo de linguagem de pequena dimensão executável no browser (como o Gemma 2B via WebGPU) para substituir o coach virtual baseado em regras.</w:t>
+        <w:t>O desenvolvimento futuro deverá prosseguir em quatro direções prioritárias: (i) conclusão das Etapas 6 e 7 para transformar o protótipo num produto plenamente funcional e acessível ao público; (ii) expansão da base de dados nutricional através da integração com a API Open Food Facts; (iii) condução de um estudo longitudinal com utilizadores reais para avaliar o impacto do sistema de gamificação na adesão e na progressão das métricas corporais; e (iv) exploração da integração de um modelo de linguagem de pequena dimensão executável no browser (como o Gemma 2B via WebGPU) para substituir o coach virtual baseado em regras.</w:t>
       </w:r>
     </w:p>
     <w:p>
@@ -4750,6 +4871,7 @@
           <w:sz w:val="28"/>
           <w:lang w:val="pt-PT"/>
         </w:rPr>
+        <w:lastRenderedPageBreak/>
         <w:t>4.11 Considerações Finais</w:t>
       </w:r>
     </w:p>
@@ -4822,6 +4944,31 @@
     </w:p>
     <w:p>
       <w:pPr>
+        <w:spacing w:after="0" w:line="360" w:lineRule="auto"/>
+        <w:ind w:firstLine="680"/>
+        <w:jc w:val="both"/>
+        <w:outlineLvl w:val="0"/>
+        <w:rPr>
+          <w:rFonts w:ascii="Times New Roman" w:hAnsi="Times New Roman" w:cs="Times New Roman"/>
+          <w:bCs/>
+          <w:sz w:val="24"/>
+          <w:szCs w:val="24"/>
+          <w:lang w:val="pt-PT"/>
+        </w:rPr>
+      </w:pPr>
+      <w:r>
+        <w:rPr>
+          <w:rFonts w:ascii="Times New Roman" w:hAnsi="Times New Roman" w:cs="Times New Roman"/>
+          <w:bCs/>
+          <w:sz w:val="24"/>
+          <w:szCs w:val="24"/>
+          <w:lang w:val="pt-PT"/>
+        </w:rPr>
+        <w:t>O paradoxo que motivou este projeto — a abundância de ferramentas digitais de monitorização da condição física a par das barreiras de custo e de privacidade que excluem uma parte significativa dos potenciais utilizadores — encontrou resposta afirmativa: os resultados obtidos demonstraram que foi possível desenvolver uma aplicação web progressiva de análise de composição corporal assistida por inteligência artificial, gratuita, privada, multiplataforma e funcionalmente comparável às soluções comerciais existentes, dentro das restrições de tempo e recursos de um projeto académico individual.</w:t>
+      </w:r>
+    </w:p>
+    <w:p>
+      <w:pPr>
         <w:spacing w:after="160" w:line="360" w:lineRule="auto"/>
         <w:outlineLvl w:val="0"/>
         <w:rPr>
@@ -4840,7 +4987,18 @@
           <w:szCs w:val="24"/>
           <w:lang w:val="pt-PT"/>
         </w:rPr>
-        <w:t xml:space="preserve">O FiX-it demonstrou que é possível desenvolver uma aplicação web progressiva de análise de composição corporal assistida por inteligência artificial que seja simultaneamente gratuita, privada, multiplataforma e funcionalmente comparável às soluções comerciais existentes. A execução client-side dos modelos de machine learning — MediaPipe Pose, BodyPix e MobileNet via TensorFlow.js — eliminou a necessidade de envio de dados biométricos para servidores externos, materializando o princípio de privacy by design preconizado por Ayala-Rivera et al. </w:t>
+        <w:t xml:space="preserve">O FiX-it demonstrou que é possível desenvolver uma aplicação web progressiva de análise de composição corporal assistida por inteligência artificial que seja simultaneamente gratuita, privada, multiplataforma e funcionalmente comparável às soluções comerciais existentes. A </w:t>
+      </w:r>
+      <w:r>
+        <w:rPr>
+          <w:rFonts w:ascii="Times New Roman" w:hAnsi="Times New Roman"/>
+          <w:bCs/>
+          <w:sz w:val="24"/>
+          <w:szCs w:val="24"/>
+          <w:lang w:val="pt-PT"/>
+        </w:rPr>
+        <w:lastRenderedPageBreak/>
+        <w:t xml:space="preserve">execução client-side dos modelos de machine learning — MediaPipe Pose, BodyPix e MobileNet via TensorFlow.js — eliminou a necessidade de envio de dados biométricos para servidores externos, materializando o princípio de privacy by design preconizado por Ayala-Rivera et al. </w:t>
       </w:r>
       <w:r>
         <w:rPr>
@@ -4967,6 +5125,7 @@
           <w:szCs w:val="24"/>
           <w:lang w:val="pt-PT"/>
         </w:rPr>
+        <w:lastRenderedPageBreak/>
         <w:t xml:space="preserve">A principal limitação da análise 2D baseada em marcos esqueléticos — a incapacidade de estimar massa corporal com a precisão dos métodos clínicos de referência (DEXA, bioimpedância) — é inerente à abordagem e não superável sem a adição de sensores de profundidade ou modelos de reconstrução 3D, como o demonstrado por Qiao et al. </w:t>
       </w:r>
       <w:r>
@@ -4986,18 +5145,7 @@
           <w:szCs w:val="24"/>
           <w:lang w:val="pt-PT"/>
         </w:rPr>
-        <w:t xml:space="preserve">Esta limitação é explicitamente comunicada ao utilizador através de disclaimers e intervalos de </w:t>
-      </w:r>
-      <w:r>
-        <w:rPr>
-          <w:rFonts w:ascii="Times New Roman" w:hAnsi="Times New Roman"/>
-          <w:bCs/>
-          <w:sz w:val="24"/>
-          <w:szCs w:val="24"/>
-          <w:lang w:val="pt-PT"/>
-        </w:rPr>
-        <w:lastRenderedPageBreak/>
-        <w:t>confiança, posicionando o FiX-it como uma ferramenta motivacional de apoio ao bem-estar e não como um dispositivo médico de diagnóstico.</w:t>
+        <w:t>Esta limitação é explicitamente comunicada ao utilizador através de disclaimers e intervalos de confiança, posicionando o FiX-it como uma ferramenta motivacional de apoio ao bem-estar e não como um dispositivo médico de diagnóstico.</w:t>
       </w:r>
     </w:p>
     <w:p>
@@ -5110,6 +5258,7 @@
           <w:rFonts w:ascii="Times New Roman" w:hAnsi="Times New Roman"/>
           <w:lang w:val="pt-PT"/>
         </w:rPr>
+        <w:lastRenderedPageBreak/>
         <w:t xml:space="preserve">Ayala-Rivera, V., Portillo-Dominguez, A. O., &amp; Pasquale, L. (2024). </w:t>
       </w:r>
       <w:r>

</xml_diff>

<commit_message>
Trim Resumo and Abstract to ~420 words each (1 page per section)
Both sections now have 5 matched paragraphs: intro/context, literature
review, methods, results, and conclusion — mirroring each other.

Co-Authored-By: Claude Sonnet 4.6 <noreply@anthropic.com>
</commit_message>
<xml_diff>
--- a/Relatório PA_FiX-it.docx
+++ b/Relatório PA_FiX-it.docx
@@ -414,7 +414,7 @@
           <w:sz w:val="24"/>
           <w:lang w:val="pt-PT"/>
         </w:rPr>
-        <w:t>O mercado de aplicações de monitorização da condição física é dominado por soluções pagas que dependem de infraestrutura em nuvem para o processamento de dados biométricos, criando barreiras de custo e de privacidade que excluem uma parcela significativa dos potenciais utilizadores. O presente projeto académico descreve o desenvolvimento do FiX-it, uma aplicação web progressiva de análise de composição corporal assistida por inteligência artificial, de acesso gratuito, multiplataforma e com privacidade por defeito. O objetivo geral foi demonstrar a viabilidade de executar modelos de aprendizagem automática diretamente no navegador do utilizador para análise de imagem corporal em tempo real, sem envio de dados biométricos para servidores externos. Os objetivos específicos compreenderam a integração de modelos de deteção de pose corporal, segmentação e reconhecimento de alimentos no navegador; o desenvolvimento de um assistente virtual com quatro personalidades distintas; a implementação de uma interface de programação com cinquenta e oito pontos de acesso em Node.js com PostgreSQL; e a validação do protótipo a três níveis.</w:t>
+        <w:t>O mercado de aplicações de monitorização da condição física é dominado por soluções pagas com dependência de infraestrutura em nuvem, criando barreiras de custo e de privacidade que excluem uma parcela significativa dos potenciais utilizadores. O presente projeto descreve o FiX-it, uma aplicação web progressiva de análise de composição corporal assistida por inteligência artificial, gratuita, multiplataforma e com privacidade por defeito. O objetivo geral foi demonstrar a viabilidade de executar modelos de aprendizagem automática no navegador para análise de imagem corporal em tempo real, sem envio de dados biométricos para servidores externos. Os objetivos específicos incluíram a integração de modelos de inteligência artificial no navegador, o desenvolvimento de um assistente virtual com quatro personalidades, a implementação de uma interface de programação com cinquenta e oito pontos de acesso e a validação do protótipo a três níveis.</w:t>
       </w:r>
     </w:p>
     <w:p>
@@ -434,7 +434,7 @@
           <w:sz w:val="24"/>
           <w:lang w:val="pt-PT"/>
         </w:rPr>
-        <w:t>A fundamentação teórica organizou-se em torno de cinco domínios: arquitetura de aplicações web e padrão de aplicações web progressivas; engenharia de requisitos para sistemas de inteligência artificial e conformidade com o Regulamento Geral sobre a Proteção de Dados; metodologia de desenvolvimento ágil em contexto académico individual; tecnologias de inteligência artificial executáveis no navegador para análise de composição corporal; e princípios de usabilidade e acessibilidade para aplicações de saúde. A revisão da literatura, assente em dezasseis fontes publicadas entre 2023 e 2026, confirmou a adequação das tecnologias selecionadas e evidenciou a escassez de validações práticas de pipelines de análise corporal bidimensional executados inteiramente no navegador — lacuna que o presente projeto procurou colmatar.</w:t>
+        <w:t>A fundamentação teórica assentou em cinco domínios: arquitetura de aplicações web progressivas; engenharia de requisitos e conformidade com o Regulamento Geral sobre a Proteção de Dados; metodologia ágil em contexto académico individual; inteligência artificial executável no navegador para análise corporal; e princípios de usabilidade e acessibilidade. A revisão da literatura, assente em dezasseis fontes publicadas entre 2023 e 2026, confirmou a adequação das tecnologias selecionadas e evidenciou a escassez de validações práticas de pipelines de análise corporal bidimensional executados inteiramente no navegador, lacuna que o projeto procurou colmatar.</w:t>
       </w:r>
     </w:p>
     <w:p>
@@ -454,16 +454,7 @@
           <w:sz w:val="24"/>
           <w:lang w:val="pt-PT"/>
         </w:rPr>
-        <w:t xml:space="preserve">O desenvolvimento seguiu uma metodologia mista, iterativa e incremental no processo de desenvolvimento de software e descritiva na análise das opções tecnológicas. A dimensão qualitativa incluiu uma entrevista semiestruturada a um personal trainer para levantamento de requisitos de exercício e validação de categorias de segurança, e análise comparativa de aplicações concorrentes. O artefacto digital foi construído em HTML5, CSS3 e JavaScript sem dependência de frameworks no frontend, com modelos de inteligência artificial a executar no navegador, e uma interface de programação em Node.js com Express e PostgreSQL no backend. </w:t>
-      </w:r>
-      <w:r>
-        <w:rPr>
-          <w:rFonts w:ascii="Times New Roman" w:hAnsi="Times New Roman" w:cs="Times New Roman"/>
-          <w:sz w:val="24"/>
-          <w:lang w:val="pt-PT"/>
-        </w:rPr>
-        <w:lastRenderedPageBreak/>
-        <w:t>A validação foi conduzida a três níveis: testes unitários das funções de cálculo e validação; testes de integração dos fluxos de autenticação e operações de dados; e testes de ponta a ponta do fluxo completo do utilizador em múltiplos navegadores.</w:t>
+        <w:t>O desenvolvimento seguiu uma metodologia mista, iterativa e incremental. A dimensão qualitativa incluiu uma entrevista semiestruturada a um personal trainer e análise comparativa de aplicações concorrentes. O artefacto digital foi construído em HTML5, CSS3 e JavaScript sem dependência de frameworks no frontend, com modelos de inteligência artificial a executar no navegador e uma interface de programação em Node.js com Express e PostgreSQL no backend. A validação decorreu a três níveis: unitário, de integração e de ponta a ponta em múltiplos navegadores.</w:t>
       </w:r>
     </w:p>
     <w:p>
@@ -483,7 +474,16 @@
           <w:sz w:val="24"/>
           <w:lang w:val="pt-PT"/>
         </w:rPr>
-        <w:t>O FiX-it atingiu o estado de implementação plena dos módulos de análise corporal, orientação de treino, nutrição, assistente virtual e sistema de pontuação com conquistas e desafios semanais. A validação informal confirmou a adequação do modelo em condições favoráveis e a degradação de precisão em poses de perfil e contraluz, posicionando a aplicação como ferramenta motivacional e não como dispositivo de diagnóstico clínico. A pontuação de acessibilidade de noventa e quatro em cem e o rácio de contraste de dezoito vírgula três para um confirmaram a conformidade com os critérios de acessibilidade de nível AA. Dois obstáculos técnicos foram superados durante o desenvolvimento: a substituição da integração de correio eletrónico por protocolo de transferência por uma interface de programação transacional, garantindo a entrega a endereços externos; e a reformulação do fluxo de autenticação para consultar sempre o servidor antes do estado local, resolvendo a dessincronização de dados entre dispositivos.</w:t>
+        <w:t xml:space="preserve">O FiX-it atingiu implementação plena dos módulos de análise corporal, treino, nutrição, assistente virtual e gamificação. A validação confirmou a adequação do modelo em condições favoráveis e a degradação de precisão em poses de perfil e contraluz, posicionando a aplicação como ferramenta motivacional e não como dispositivo de diagnóstico. A pontuação de </w:t>
+      </w:r>
+      <w:r>
+        <w:rPr>
+          <w:rFonts w:ascii="Times New Roman" w:hAnsi="Times New Roman" w:cs="Times New Roman"/>
+          <w:sz w:val="24"/>
+          <w:lang w:val="pt-PT"/>
+        </w:rPr>
+        <w:lastRenderedPageBreak/>
+        <w:t>acessibilidade de noventa e quatro em cem confirmou a conformidade com os critérios de nível AA. Dois obstáculos técnicos foram superados: a substituição da integração de correio eletrónico por uma interface de programação transacional; e a reformulação do fluxo de autenticação para eliminar a dessincronização de dados entre dispositivos.</w:t>
       </w:r>
     </w:p>
     <w:p>
@@ -503,7 +503,7 @@
           <w:sz w:val="24"/>
           <w:lang w:val="pt-PT"/>
         </w:rPr>
-        <w:t>O projeto confirmou empiricamente que é tecnicamente viável construir uma aplicação web de análise corporal assistida por inteligência artificial, gratuita, privada e multiplataforma, dentro das restrições de um projeto académico individual. A execução dos modelos no próprio dispositivo do utilizador materializou a privacidade por conceção sem comprometer a riqueza funcional. O trabalho contribuiu com dados empíricos sobre os limiares de precisão e as condições de falha dos modelos de análise corporal bidimensional no navegador, num domínio ainda escasso em validações práticas. O trabalho futuro deverá priorizar a expansão da base nutricional, a exploração de modelos de linguagem executáveis no navegador para o assistente virtual e a condução de um estudo longitudinal sobre o impacto do sistema de gamificação na adesão a hábitos saudáveis.</w:t>
+        <w:t>O projeto confirmou empiricamente a viabilidade técnica de construir uma aplicação web de análise corporal assistida por inteligência artificial, gratuita, privada e multiplataforma, dentro das restrições de um projeto académico individual. A execução dos modelos no dispositivo do utilizador materializou a privacidade por conceção sem comprometer a riqueza funcional. O trabalho contribuiu com dados empíricos sobre os limiares de precisão e as condições de falha dos modelos de análise corporal bidimensional no navegador, num domínio ainda escasso em validações práticas. O trabalho futuro deverá centrar-se na expansão da base nutricional, na exploração de modelos de linguagem no navegador e num estudo longitudinal sobre o impacto do sistema de gamificação.</w:t>
       </w:r>
     </w:p>
     <w:p>
@@ -576,7 +576,7 @@
           <w:rFonts w:ascii="Times New Roman" w:hAnsi="Times New Roman" w:cs="Times New Roman"/>
           <w:sz w:val="24"/>
         </w:rPr>
-        <w:t>The fitness monitoring application market is dominated by paid solutions that depend on cloud infrastructure to process biometric data, creating cost and privacy barriers that exclude a significant share of potential users. This academic project describes the development of FiX-it, a free, cross-platform, privacy-first progressive web application for AI-assisted body composition analysis. The general objective was to demonstrate the viability of executing machine learning models directly in the user's browser for real-time body image analysis, without sending biometric data to external servers. Specific objectives included integrating body pose detection, segmentation, and food recognition models in the browser; developing a virtual coach with four distinct personalities; implementing a fifty-eight-endpoint REST API in Node.js with PostgreSQL; and validating the prototype through three-level testing.</w:t>
+        <w:t>The fitness monitoring application market is dominated by paid solutions that rely on cloud infrastructure, creating cost and privacy barriers that exclude a significant share of potential users. This academic project describes FiX-it, a free, cross-platform, privacy-first progressive web application for artificial intelligence-assisted body composition analysis. The general objective was to demonstrate the viability of running machine learning models directly in the browser for real-time body image analysis without sending biometric data to external servers. Specific objectives included integrating artificial intelligence models in the browser, developing a virtual coach with four distinct personalities, implementing a fifty-eight-endpoint application programming interface, and validating the prototype through three-level testing.</w:t>
       </w:r>
     </w:p>
     <w:p>
@@ -594,7 +594,7 @@
           <w:rFonts w:ascii="Times New Roman" w:hAnsi="Times New Roman" w:cs="Times New Roman"/>
           <w:sz w:val="24"/>
         </w:rPr>
-        <w:t>The theoretical foundation covered five research domains: web application architecture and the Progressive Web App standard; artificial intelligence requirements engineering and GDPR compliance; agile methodology in individual academic projects; browser-executable AI models for body composition estimation; and usability and accessibility principles for health applications. The literature review, drawing on sixteen sources published between 2023 and 2026, confirmed the suitability of the selected technologies and highlighted the scarcity of practical validations of two-dimensional body analysis pipelines running entirely in the browser — a gap this project aimed to address.</w:t>
+        <w:t>The theoretical foundation covered five research domains: progressive web application architecture; artificial intelligence requirements engineering and compliance with the General Data Protection Regulation; agile methodology in individual academic projects; browser-executable artificial intelligence for body composition estimation; and usability and accessibility principles. The literature review, drawing on sixteen sources published between 2023 and 2026, confirmed the suitability of the selected technologies and highlighted the scarcity of practical validations of two-dimensional body analysis pipelines running entirely in the browser — a gap this project aimed to address.</w:t>
       </w:r>
     </w:p>
     <w:p>
@@ -612,7 +612,7 @@
           <w:rFonts w:ascii="Times New Roman" w:hAnsi="Times New Roman" w:cs="Times New Roman"/>
           <w:sz w:val="24"/>
         </w:rPr>
-        <w:t>Development followed a mixed methodology — iterative and incremental for software development, and descriptive for technology analysis. Qualitative data collection included a semi-structured interview with a personal trainer for exercise requirements elicitation and safety validation, and a comparative analysis of competing applications. The digital artifact was built in HTML5, CSS3, and framework-free JavaScript on the frontend, with artificial intelligence models running in the browser, and a Node.js, Express, and PostgreSQL application programming interface on the backend. Validation was conducted at three levels: unit testing, integration testing of authentication flows and data operations, and end-to-end testing of the complete user journey across multiple browsers.</w:t>
+        <w:t>Development followed a mixed, iterative, and incremental methodology. Qualitative data collection included a semi-structured interview with a personal trainer and a comparative analysis of competing applications. The digital artifact was built in HTML5, CSS3, and framework-free JavaScript on the frontend, with artificial intelligence models running in the browser and a Node.js, Express, and PostgreSQL application programming interface on the backend. Validation was conducted at three levels: unit, integration, and end-to-end testing across multiple browsers.</w:t>
       </w:r>
     </w:p>
     <w:p>
@@ -630,7 +630,7 @@
           <w:rFonts w:ascii="Times New Roman" w:hAnsi="Times New Roman" w:cs="Times New Roman"/>
           <w:sz w:val="24"/>
         </w:rPr>
-        <w:t xml:space="preserve">FiX-it reached full implementation of the body analysis, workout guidance, nutrition, virtual coach, and gamification modules. Informal validation confirmed model adequacy under favourable conditions and precision degradation in profile poses and backlighting, positioning the </w:t>
+        <w:t xml:space="preserve">FiX-it reached full implementation of the body analysis, workout guidance, nutrition, virtual coach, and gamification modules. Informal validation confirmed model adequacy under favourable conditions and precision degradation in profile poses and backlighting, positioning the application as a motivational tool rather than a clinical diagnostic device. An accessibility audit score of ninety-four out of one hundred confirmed compliance with level AA guidelines. Two significant technical obstacles were overcome: replacing email-by-protocol integration with a </w:t>
       </w:r>
       <w:r>
         <w:rPr>
@@ -638,7 +638,7 @@
           <w:sz w:val="24"/>
         </w:rPr>
         <w:lastRenderedPageBreak/>
-        <w:t>application as a motivational tool rather than a clinical diagnostic device. An accessibility audit score of ninety-four out of one hundred and a contrast ratio of 18.3:1 confirmed compliance with level AA web accessibility guidelines. Two significant technical obstacles were overcome: replacing email-by-protocol integration with a transactional API to guarantee delivery to external addresses; and refactoring the authentication flow to always query the server before local state, resolving cross-device data desynchronisation.</w:t>
+        <w:t>transactional application programming interface; and refactoring the authentication flow to eliminate cross-device data desynchronisation.</w:t>
       </w:r>
     </w:p>
     <w:p>
@@ -656,7 +656,7 @@
           <w:rFonts w:ascii="Times New Roman" w:hAnsi="Times New Roman" w:cs="Times New Roman"/>
           <w:sz w:val="24"/>
         </w:rPr>
-        <w:t>The project empirically confirmed that it is technically viable to build a free, private, and cross-platform AI-assisted body composition web application within the constraints of an individual academic project. Client-side model execution materialised privacy by design without compromising functional richness. The work contributes empirical data on the precision thresholds and failure conditions of two-dimensional body analysis models in the browser, in a domain still scarce in practical validations. Future work should prioritise expanding the nutritional database, exploring browser-executable language models for the virtual coach, and conducting a longitudinal study on the impact of the gamification system on healthy habit adherence.</w:t>
+        <w:t>The project empirically confirmed the technical viability of building a free, private, and cross-platform artificial intelligence-assisted body composition web application within the constraints of an individual academic project. Client-side model execution materialised privacy by design without compromising functional richness. The work contributes empirical data on the precision thresholds and failure conditions of two-dimensional body analysis models running in the browser, in a domain still scarce in practical validations. Future work should focus on expanding the nutritional database, exploring browser-executable language models for the virtual coach, and conducting a longitudinal study on the impact of the gamification system.</w:t>
       </w:r>
     </w:p>
     <w:p>
@@ -1532,6 +1532,7 @@
           <w:sz w:val="24"/>
           <w:lang w:val="pt-PT"/>
         </w:rPr>
+        <w:lastRenderedPageBreak/>
         <w:t>O problema encerra obstáculos técnicos e éticos significativos que delimitaram o âmbito e as escolhas do projeto. A estimação de composição corporal a partir de imagens bidimensionais domésticas é tecnicamente inferior aos métodos clínicos de referência — como a absorciometria de raios-X de dupla energia e a bioimpedância —, limitação inerente à deteção baseada em marcos esqueléticos que não é superável sem sensores de profundidade ou reconstrução tridimensional. A execução de modelos de aprendizagem automática no navegador impõe restrições de desempenho dependentes da capacidade de processamento do dispositivo do utilizador. A natureza biométrica dos dados processados — imagens corporais e métricas de composição física — impõe obrigações legais ao abrigo do Regulamento Geral sobre a Proteção de Dados, que classifica estes dados como categoria especial sujeita a proteções acrescidas. Estes obstáculos delimitaram as escolhas de arquitetura e os compromissos técnicos do FiX-it.</w:t>
       </w:r>
     </w:p>
@@ -1550,7 +1551,6 @@
           <w:sz w:val="24"/>
           <w:lang w:val="pt-PT"/>
         </w:rPr>
-        <w:lastRenderedPageBreak/>
         <w:t>A hipótese de trabalho foi que a combinação de tecnologias web modernas — em particular as Progressive Web Apps (MDN Web Docs, 2025, para. 1), os modelos de machine learning executáveis no browser via TensorFlow.js (Kim et al., 2023, p. 13; Dill et al., 2023, p. 565) e as arquiteturas REST escaláveis (Bogner et al., 2023, Sec. 4.2) — permite construir uma solução que responde afirmativamente a este problema, dentro das restrições de um projeto académico individual.</w:t>
       </w:r>
     </w:p>
@@ -1641,6 +1641,7 @@
           <w:sz w:val="24"/>
           <w:lang w:val="pt-PT"/>
         </w:rPr>
+        <w:lastRenderedPageBreak/>
         <w:t>O FiX-it enquadra-se no domínio das tecnologias web aplicadas à saúde e bem-estar. O objeto de estudo é a viabilidade de uma aplicação web progressiva de análise de composição corporal assistida por inteligência artificial que execute inteiramente no navegador do utilizador, sem envio de dados biométricos para servidores externos, de acesso gratuito e multiplataforma.</w:t>
       </w:r>
     </w:p>
@@ -1677,7 +1678,6 @@
           <w:sz w:val="28"/>
           <w:lang w:val="pt-PT"/>
         </w:rPr>
-        <w:lastRenderedPageBreak/>
         <w:t>1.5 Estrutura do Relatório</w:t>
       </w:r>
     </w:p>
@@ -1833,16 +1833,8 @@
           <w:sz w:val="24"/>
           <w:lang w:val="pt-PT"/>
         </w:rPr>
-        <w:t xml:space="preserve">A literatura científica documentou progressos significativos na estimação de composição corporal por câmara. Qiao et al. (2024, p. 5) demonstraram que a reconstrução 3D da forma corporal a partir de fotografias de smartphone permitiu estimar massa gorda e massa isenta de gordura com correlações superiores a r = 0,84 relativamente a medições DEXA de referência, </w:t>
-      </w:r>
-      <w:r>
-        <w:rPr>
-          <w:rFonts w:ascii="Times New Roman" w:hAnsi="Times New Roman" w:cs="Times New Roman"/>
-          <w:sz w:val="24"/>
-          <w:lang w:val="pt-PT"/>
-        </w:rPr>
         <w:lastRenderedPageBreak/>
-        <w:t>numa coorte validada de 12 435 adultos. Contudo, esta abordagem exigiu processamento computacional intensivo incompatível com execução no browser, o que situou o FiX-it numa posição de compromisso consciente entre precisão e privacidade.</w:t>
+        <w:t>A literatura científica documentou progressos significativos na estimação de composição corporal por câmara. Qiao et al. (2024, p. 5) demonstraram que a reconstrução 3D da forma corporal a partir de fotografias de smartphone permitiu estimar massa gorda e massa isenta de gordura com correlações superiores a r = 0,84 relativamente a medições DEXA de referência, numa coorte validada de 12 435 adultos. Contudo, esta abordagem exigiu processamento computacional intensivo incompatível com execução no browser, o que situou o FiX-it numa posição de compromisso consciente entre precisão e privacidade.</w:t>
       </w:r>
     </w:p>
     <w:p>
@@ -1905,7 +1897,16 @@
           <w:sz w:val="24"/>
           <w:lang w:val="pt-PT"/>
         </w:rPr>
-        <w:t>A natureza progressiva da aplicação foi enquadrada pela documentação técnica da Mozilla (MDN Web Docs, 2025, para. 1), que definiu os requisitos mínimos de uma PWA — Service Worker registado, Web App Manifest válido e disponibilização via HTTPS — e detalhou as estratégias de caching e os mecanismos de sincronização em background. Ahmad et al. (2023, Sec. 4.4) complementaram este enquadramento com o mapeamento das dimensões específicas da engenharia de requisitos para sistemas de IA que diferiram dos sistemas tradicionais, nomeadamente a necessidade de especificar requisitos de qualidade dos dados de entrada, margens de erro aceitáveis e mecanismos de explicabilidade.</w:t>
+        <w:t xml:space="preserve">A natureza progressiva da aplicação foi enquadrada pela documentação técnica da Mozilla (MDN Web Docs, 2025, para. 1), que definiu os requisitos mínimos de uma PWA — Service Worker registado, Web App Manifest válido e disponibilização via HTTPS — e detalhou as estratégias de caching e os mecanismos de sincronização em background. Ahmad et al. (2023, Sec. 4.4) complementaram este enquadramento com o mapeamento das dimensões específicas da engenharia de requisitos para sistemas de IA que diferiram dos sistemas tradicionais, </w:t>
+      </w:r>
+      <w:r>
+        <w:rPr>
+          <w:rFonts w:ascii="Times New Roman" w:hAnsi="Times New Roman" w:cs="Times New Roman"/>
+          <w:sz w:val="24"/>
+          <w:lang w:val="pt-PT"/>
+        </w:rPr>
+        <w:lastRenderedPageBreak/>
+        <w:t>nomeadamente a necessidade de especificar requisitos de qualidade dos dados de entrada, margens de erro aceitáveis e mecanismos de explicabilidade.</w:t>
       </w:r>
     </w:p>
     <w:p>
@@ -1947,16 +1948,7 @@
           <w:sz w:val="24"/>
           <w:lang w:val="pt-PT"/>
         </w:rPr>
-        <w:t xml:space="preserve">A definição dos requisitos do FiX-it exigiu uma abordagem que combinou as técnicas de engenharia de requisitos ágil com os imperativos regulatórios da proteção de dados. Hoy e Xu </w:t>
-      </w:r>
-      <w:r>
-        <w:rPr>
-          <w:rFonts w:ascii="Times New Roman" w:hAnsi="Times New Roman" w:cs="Times New Roman"/>
-          <w:sz w:val="24"/>
-          <w:lang w:val="pt-PT"/>
-        </w:rPr>
-        <w:lastRenderedPageBreak/>
-        <w:t>(2023, p. 8) identificaram os principais desafios da elicitação de requisitos em contexto ágil — volatilidade dos requisitos, lacunas de comunicação e rastreabilidade insuficiente — e propuseram um quadro conceptual de soluções adaptadas a cada categoria, que foi incorporado no processo iterativo de especificação do FiX-it. Ahmad et al. (2023, Sec. 4.4) complementaram esta perspetiva com o mapeamento dos requisitos não funcionais específicos de sistemas de IA: precisão e robustez dos modelos, privacidade dos dados processados na inferência, explicabilidade das predições e conformidade ética. No FiX-it, estes requisitos traduziram-se na execução local dos modelos sem envio de imagens para servidores externos, na camada de explicabilidade nos resultados e nos disclaimers de natureza não clínica.</w:t>
+        <w:t>A definição dos requisitos do FiX-it exigiu uma abordagem que combinou as técnicas de engenharia de requisitos ágil com os imperativos regulatórios da proteção de dados. Hoy e Xu (2023, p. 8) identificaram os principais desafios da elicitação de requisitos em contexto ágil — volatilidade dos requisitos, lacunas de comunicação e rastreabilidade insuficiente — e propuseram um quadro conceptual de soluções adaptadas a cada categoria, que foi incorporado no processo iterativo de especificação do FiX-it. Ahmad et al. (2023, Sec. 4.4) complementaram esta perspetiva com o mapeamento dos requisitos não funcionais específicos de sistemas de IA: precisão e robustez dos modelos, privacidade dos dados processados na inferência, explicabilidade das predições e conformidade ética. No FiX-it, estes requisitos traduziram-se na execução local dos modelos sem envio de imagens para servidores externos, na camada de explicabilidade nos resultados e nos disclaimers de natureza não clínica.</w:t>
       </w:r>
     </w:p>
     <w:p>
@@ -2019,7 +2011,16 @@
           <w:sz w:val="24"/>
           <w:lang w:val="pt-PT"/>
         </w:rPr>
-        <w:t>A escolha de uma metodologia adequada ao contexto académico do FiX-it — projeto individual com prazo fixo, orientador externo e entregas intercalares — assentou numa base empírica fornecida por investigação recente. Sassa et al. (2023, Sec. IV.B, p. 177) realizaram uma revisão sistemática sobre Scrum que confirmou que as metodologias ágeis, mesmo em equipas reduzidas, aumentaram a cadência de entrega de valor e melhoraram a capacidade de resposta a mudanças de requisitos — característica particularmente valiosa num projeto de IA com algoritmos que evoluíram com a implementação. Mishra e Alzoubi (2023, p. 1515) estabeleceram que projetos com requisitos parcialmente indefinidos à partida e componentes exploratórias beneficiaram da flexibilidade ágil, enquanto projetos com requisitos estáveis e elevadas exigências de documentação formal beneficiaram de abordagens mais estruturadas. O FiX-it enquadrou-se claramente no primeiro perfil.</w:t>
+        <w:t xml:space="preserve">A escolha de uma metodologia adequada ao contexto académico do FiX-it — projeto individual com prazo fixo, orientador externo e entregas intercalares — assentou numa base empírica fornecida por investigação recente. Sassa et al. (2023, Sec. IV.B, p. 177) realizaram uma revisão sistemática sobre Scrum que confirmou que as metodologias ágeis, mesmo em equipas reduzidas, aumentaram a cadência de entrega de valor e melhoraram a capacidade de resposta a mudanças de requisitos — característica particularmente valiosa num projeto de IA com algoritmos que evoluíram com a implementação. Mishra e Alzoubi (2023, p. 1515) estabeleceram que projetos com requisitos parcialmente indefinidos à partida e componentes exploratórias </w:t>
+      </w:r>
+      <w:r>
+        <w:rPr>
+          <w:rFonts w:ascii="Times New Roman" w:hAnsi="Times New Roman" w:cs="Times New Roman"/>
+          <w:sz w:val="24"/>
+          <w:lang w:val="pt-PT"/>
+        </w:rPr>
+        <w:lastRenderedPageBreak/>
+        <w:t>beneficiaram da flexibilidade ágil, enquanto projetos com requisitos estáveis e elevadas exigências de documentação formal beneficiaram de abordagens mais estruturadas. O FiX-it enquadrou-se claramente no primeiro perfil.</w:t>
       </w:r>
     </w:p>
     <w:p>
@@ -2145,6 +2146,7 @@
           <w:sz w:val="24"/>
           <w:lang w:val="pt-PT"/>
         </w:rPr>
+        <w:lastRenderedPageBreak/>
         <w:t>A dimensão humana do FiX-it foi enquadrada por três referências complementares. Galavi et al. (2024, Results, para. 1) identificaram, numa revisão sistemática de avaliações de aplicações móveis de saúde, que a visibilidade do estado do sistema, o controlo do utilizador e a prevenção de erros figuraram entre as heurísticas de usabilidade mais frequentemente aplicadas — orientando decisões como o indicador de progresso durante a análise de IA, o botão de cancelamento em operações longas e a validação em tempo real nos formulários. Kirkpatrick et al. (2023) editaram as WCAG 2.2, introduzindo novos critérios para autenticação acessível, foco visível e interações por arrastamento, constituindo o referencial normativo atual para conformidade AA. A auditoria do FiX-it verificou contraste mínimo 4,5:1, navegabilidade por teclado, atributos ARIA em regiões dinâmicas e ausência de CAPTCHA no fluxo de autenticação.</w:t>
       </w:r>
     </w:p>
@@ -2223,6 +2225,7 @@
           <w:sz w:val="28"/>
           <w:lang w:val="pt-PT"/>
         </w:rPr>
+        <w:lastRenderedPageBreak/>
         <w:t>3.1 Paradigma de Investigação</w:t>
       </w:r>
     </w:p>
@@ -2241,16 +2244,7 @@
           <w:sz w:val="24"/>
           <w:lang w:val="pt-PT"/>
         </w:rPr>
-        <w:t xml:space="preserve">O projeto FiX-it enquadra-se no paradigma da investigação orientada ao design (design-based research), no qual o artefacto digital constitui simultaneamente o objeto de estudo e o instrumento de validação das hipóteses de investigação. Este paradigma é particularmente adequado ao contexto de projetos académicos em tecnologias de informação e comunicação, </w:t>
-      </w:r>
-      <w:r>
-        <w:rPr>
-          <w:rFonts w:ascii="Times New Roman" w:hAnsi="Times New Roman"/>
-          <w:sz w:val="24"/>
-          <w:lang w:val="pt-PT"/>
-        </w:rPr>
-        <w:lastRenderedPageBreak/>
-        <w:t>onde o desenvolvimento do protótipo e a investigação teórica se alimentam mutuamente ao longo de ciclos iterativos de conceção, implementação e avaliação.</w:t>
+        <w:t>O projeto FiX-it enquadra-se no paradigma da investigação orientada ao design (design-based research), no qual o artefacto digital constitui simultaneamente o objeto de estudo e o instrumento de validação das hipóteses de investigação. Este paradigma é particularmente adequado ao contexto de projetos académicos em tecnologias de informação e comunicação, onde o desenvolvimento do protótipo e a investigação teórica se alimentam mutuamente ao longo de ciclos iterativos de conceção, implementação e avaliação.</w:t>
       </w:r>
     </w:p>
     <w:p>
@@ -2358,6 +2352,7 @@
           <w:sz w:val="24"/>
           <w:lang w:val="pt-PT"/>
         </w:rPr>
+        <w:lastRenderedPageBreak/>
         <w:t>A seleção das tecnologias obedeceu a três critérios: disponibilidade gratuita e de código aberto, adequação ao contexto académico com restrições de infraestrutura, e alinhamento com as conclusões da investigação bibliográfica. As linguagens de programação utilizadas foram JavaScript ES6+, HTML5, CSS3 e SQL. O frontend foi desenvolvido em Vanilla JavaScript sem frameworks, conforme a análise de Vepsäläinen et al. (2023, p. 325) sobre a relação custo-benefício das abordagens sem runtime overhead em projetos com prazo definido.</w:t>
       </w:r>
     </w:p>
@@ -2376,7 +2371,6 @@
           <w:sz w:val="24"/>
           <w:lang w:val="pt-PT"/>
         </w:rPr>
-        <w:lastRenderedPageBreak/>
         <w:t>A camada de inteligência artificial client-side recorreu a quatro bibliotecas: MediaPipe Pose v0.5 para deteção de 33 marcos esqueléticos (Kim et al., 2023, p. 13; Dill et al., 2023, p. 565), BodyPix v2.2 para segmentação corporal, MobileNet v2.1 para reconhecimento de alimentos, e TensorFlow.js v3.21 como runtime de execução no browser. O backend foi construído com Node.js v20 LTS e o framework Express.js. A persistência de dados foi assegurada por PostgreSQL 18 (PostgreSQL Global Development Group, 2026, Cap. 5) com 21 tabelas e 16 índices, complementada por cache Redis e armazenamento cloud Cloudinary.</w:t>
       </w:r>
     </w:p>
@@ -2710,7 +2704,16 @@
                 <w:sz w:val="20"/>
                 <w:lang w:val="pt-PT"/>
               </w:rPr>
-              <w:t>Protótipo frontend: 8 ecrãs funcionais e integração IA client-side (MediaPipe, BodyPix, MobileNet)</w:t>
+              <w:t>Protótipo frontend: 8 ecrãs funcionais e integração IA client-</w:t>
+            </w:r>
+            <w:r>
+              <w:rPr>
+                <w:rFonts w:ascii="Times New Roman" w:hAnsi="Times New Roman"/>
+                <w:sz w:val="20"/>
+                <w:lang w:val="pt-PT"/>
+              </w:rPr>
+              <w:lastRenderedPageBreak/>
+              <w:t>side (MediaPipe, BodyPix, MobileNet)</w:t>
             </w:r>
           </w:p>
         </w:tc>
@@ -2728,6 +2731,7 @@
                 <w:rFonts w:ascii="Times New Roman" w:hAnsi="Times New Roman"/>
                 <w:sz w:val="20"/>
               </w:rPr>
+              <w:lastRenderedPageBreak/>
               <w:t>Out.–Dez. 2025</w:t>
             </w:r>
           </w:p>
@@ -3022,16 +3026,7 @@
                 <w:sz w:val="20"/>
                 <w:lang w:val="pt-PT"/>
               </w:rPr>
-              <w:t xml:space="preserve">Integração frontend-backend, painel de admin, restauro de </w:t>
-            </w:r>
-            <w:r>
-              <w:rPr>
-                <w:rFonts w:ascii="Times New Roman" w:hAnsi="Times New Roman"/>
-                <w:sz w:val="20"/>
-                <w:lang w:val="pt-PT"/>
-              </w:rPr>
-              <w:lastRenderedPageBreak/>
-              <w:t>sessão e upload Cloudinary</w:t>
+              <w:t>Integração frontend-backend, painel de admin, restauro de sessão e upload Cloudinary</w:t>
             </w:r>
           </w:p>
         </w:tc>
@@ -3049,7 +3044,6 @@
                 <w:rFonts w:ascii="Times New Roman" w:hAnsi="Times New Roman"/>
                 <w:sz w:val="20"/>
               </w:rPr>
-              <w:lastRenderedPageBreak/>
               <w:t>Mar.–Abr. 2026</w:t>
             </w:r>
           </w:p>
@@ -3297,6 +3291,7 @@
           <w:sz w:val="28"/>
           <w:lang w:val="pt-PT"/>
         </w:rPr>
+        <w:lastRenderedPageBreak/>
         <w:t>3.7 Interface e Experiência do Utilizador</w:t>
       </w:r>
     </w:p>
@@ -3315,16 +3310,7 @@
           <w:sz w:val="24"/>
           <w:lang w:val="pt-PT"/>
         </w:rPr>
-        <w:t xml:space="preserve">O sistema de design do FiX-it foi construído em torno de um tema escuro com estética de estúdio fitness premium, definido através de CSS custom properties. A paleta de cores estabelece quatro variáveis semânticas: --bg-primary (#141211) para o fundo, --accent-primary (#c9a962) para o dourado champanhe, --accent-warm (#b87351) para o terracotta e --accent-success </w:t>
-      </w:r>
-      <w:r>
-        <w:rPr>
-          <w:rFonts w:ascii="Times New Roman" w:hAnsi="Times New Roman"/>
-          <w:sz w:val="24"/>
-          <w:lang w:val="pt-PT"/>
-        </w:rPr>
-        <w:lastRenderedPageBreak/>
-        <w:t>(#7d9a78) para o verde salva. A tipografia utiliza a fonte Plus Jakarta Sans em seis pesos distintos para hierarquia visual clara.</w:t>
+        <w:t>O sistema de design do FiX-it foi construído em torno de um tema escuro com estética de estúdio fitness premium, definido através de CSS custom properties. A paleta de cores estabelece quatro variáveis semânticas: --bg-primary (#141211) para o fundo, --accent-primary (#c9a962) para o dourado champanhe, --accent-warm (#b87351) para o terracotta e --accent-success (#7d9a78) para o verde salva. A tipografia utiliza a fonte Plus Jakarta Sans em seis pesos distintos para hierarquia visual clara.</w:t>
       </w:r>
     </w:p>
     <w:p>
@@ -3446,6 +3432,7 @@
           <w:sz w:val="20"/>
           <w:lang w:val="pt-PT"/>
         </w:rPr>
+        <w:lastRenderedPageBreak/>
         <w:t>Figura 2. Fluxo de análise: pré-processamento → MediaPipe Pose → cálculo de métricas [inserir diagrama].</w:t>
       </w:r>
     </w:p>
@@ -3482,16 +3469,7 @@
           <w:sz w:val="24"/>
           <w:lang w:val="pt-PT"/>
         </w:rPr>
-        <w:t xml:space="preserve">O servidor Node.js inicializa com a execução automática das migrações de base de dados (função runMigrations()), que garante que todas as 21 tabelas existem com o esquema correto antes de aceitar pedidos. O sistema de autenticação implementa JWT com dois tokens: um access </w:t>
-      </w:r>
-      <w:r>
-        <w:rPr>
-          <w:rFonts w:ascii="Times New Roman" w:hAnsi="Times New Roman"/>
-          <w:sz w:val="24"/>
-          <w:lang w:val="pt-PT"/>
-        </w:rPr>
-        <w:lastRenderedPageBreak/>
-        <w:t>token de quinze minutos e um refresh token de sete dias. As passwords são processadas com bcrypt e 12 salt rounds. Mecanismos adicionais de segurança incluem rate limiting, lockout de conta após 5 tentativas falhadas, proteção contra enumeração de emails e verificação de email por token SHA256.</w:t>
+        <w:t>O servidor Node.js inicializa com a execução automática das migrações de base de dados (função runMigrations()), que garante que todas as 21 tabelas existem com o esquema correto antes de aceitar pedidos. O sistema de autenticação implementa JWT com dois tokens: um access token de quinze minutos e um refresh token de sete dias. As passwords são processadas com bcrypt e 12 salt rounds. Mecanismos adicionais de segurança incluem rate limiting, lockout de conta após 5 tentativas falhadas, proteção contra enumeração de emails e verificação de email por token SHA256.</w:t>
       </w:r>
     </w:p>
     <w:p>
@@ -3634,7 +3612,6 @@
           <w:sz w:val="28"/>
           <w:lang w:val="pt-PT"/>
         </w:rPr>
-        <w:lastRenderedPageBreak/>
         <w:t>3.12 Sistema de Gamificação</w:t>
       </w:r>
     </w:p>
@@ -3735,7 +3712,6 @@
           <w:sz w:val="32"/>
           <w:lang w:val="pt-PT"/>
         </w:rPr>
-        <w:lastRenderedPageBreak/>
         <w:t>RESULTADOS E DISCUSSÃO DE RESULTADOS</w:t>
       </w:r>
     </w:p>
@@ -3827,7 +3803,6 @@
           <w:sz w:val="24"/>
           <w:lang w:val="pt-PT"/>
         </w:rPr>
-        <w:lastRenderedPageBreak/>
         <w:t xml:space="preserve">Do total de 58 endpoints planeados, estavam implementados e testados: autenticação (8/8), utilizador (6/6), análise (8/8), treino (11/11) e nutrição (10/10), perfazendo </w:t>
       </w:r>
       <w:r>
@@ -3978,7 +3953,6 @@
           <w:sz w:val="28"/>
           <w:lang w:val="pt-PT"/>
         </w:rPr>
-        <w:lastRenderedPageBreak/>
         <w:t>4.4 Avaliação de Usabilidade e Acessibilidade</w:t>
       </w:r>
     </w:p>
@@ -4127,7 +4101,6 @@
           <w:sz w:val="24"/>
           <w:lang w:val="pt-PT"/>
         </w:rPr>
-        <w:lastRenderedPageBreak/>
         <w:t>A configuração inicial usava a conta de email da escola (carlos.dju@my.istec.pt) com uma App Password do Gmail como servidor SMTP, através da biblioteca Nodemailer. Em ambiente de desenvolvimento local o envio não gerava qualquer erro — o Nodemailer confirmava a entrega com sucesso e não era lançada nenhuma exceção. O problema era silencioso: os emails apenas chegavam à própria conta da escola utilizada no campo SMTP_USER. Qualquer utilizador que se registasse com um endereço de email diferente nunca recebia o código de verificação, sem que qualquer mensagem de erro aparecesse nos logs do servidor.</w:t>
       </w:r>
     </w:p>
@@ -4260,7 +4233,6 @@
           <w:sz w:val="28"/>
           <w:lang w:val="pt-PT"/>
         </w:rPr>
-        <w:lastRenderedPageBreak/>
         <w:t>A solução foi abandonar o SMTP completamente e adotar a API REST da Brevo, um serviço de email transacional que entrega mensagens a qualquer endereço sem restrições de domínio. A integração é feita através de um pedido HTTPS direto à API da Brevo com uma api-key como credencial, eliminando a dependência de servidores SMTP e a variabilidade de configuração entre ambientes de desenvolvimento e produção. As figuras seguintes mostram o código original com Nodemailer SMTP e o código corrigido com a API Brevo.</w:t>
       </w:r>
     </w:p>
@@ -4293,7 +4265,6 @@
           <w:noProof/>
           <w:sz w:val="28"/>
         </w:rPr>
-        <w:lastRenderedPageBreak/>
         <w:drawing>
           <wp:inline distT="0" distB="0" distL="0" distR="0" wp14:anchorId="50965CAD" wp14:editId="65A3A123">
             <wp:extent cx="5972810" cy="6136005"/>
@@ -4367,7 +4338,6 @@
         <w:rPr>
           <w:lang w:val="pt-PT"/>
         </w:rPr>
-        <w:lastRenderedPageBreak/>
         <w:t>4.5.2 Dessincronização de Dados entre Dispositivos</w:t>
       </w:r>
     </w:p>
@@ -4488,7 +4458,6 @@
         <w:rPr>
           <w:noProof/>
         </w:rPr>
-        <w:lastRenderedPageBreak/>
         <w:drawing>
           <wp:inline distT="0" distB="0" distL="0" distR="0" wp14:anchorId="2B6A14F7" wp14:editId="15BA558A">
             <wp:extent cx="5972810" cy="5920740"/>
@@ -4593,7 +4562,6 @@
           <w:sz w:val="28"/>
           <w:lang w:val="pt-PT"/>
         </w:rPr>
-        <w:lastRenderedPageBreak/>
         <w:t>4.7 Discussão de Resultados</w:t>
       </w:r>
     </w:p>
@@ -4657,16 +4625,7 @@
           <w:sz w:val="24"/>
           <w:lang w:val="pt-PT"/>
         </w:rPr>
-        <w:t xml:space="preserve">A arquitetura privacy-first confirmou a tese de Ayala-Rivera et al. (2024, p. 12) de que o privacy by design não implicou compromisso na funcionalidade: toda a inferência de IA processou-se localmente no browser do utilizador, sem qualquer envio de imagens corporais para servidores externos, cumprindo os princípios de minimização de dados e limitação da finalidade do RGPD (Regulation EU 2016/679, 2016). Esta abordagem distinguiu o FiX-it das soluções comerciais dominantes — MyFitnessPal, Freeletics e Future — que dependem de infraestrutura cloud para processamento de dados biométricos, e confirmou empiricamente a sua viabilidade técnica sem sacrifício da riqueza funcional. A arquitetura REST de 58 endpoints confirmou as conclusões de Bogner et al. (2023, Sec. 4.2) sobre a importância da consistência dos verbos </w:t>
-      </w:r>
-      <w:r>
-        <w:rPr>
-          <w:rFonts w:ascii="Times New Roman" w:hAnsi="Times New Roman" w:cs="Times New Roman"/>
-          <w:sz w:val="24"/>
-          <w:lang w:val="pt-PT"/>
-        </w:rPr>
-        <w:lastRenderedPageBreak/>
-        <w:t>HTTP e da estruturação hierárquica dos recursos para a compreensibilidade das APIs. A decisão de desenvolver o frontend em JavaScript vanilla alinhou-se com a análise de Vepsäläinen et al. (2023, p. 325) sobre o custo-benefício das abordagens sem overhead de runtime em projetos com prazo definido.</w:t>
+        <w:t>A arquitetura privacy-first confirmou a tese de Ayala-Rivera et al. (2024, p. 12) de que o privacy by design não implicou compromisso na funcionalidade: toda a inferência de IA processou-se localmente no browser do utilizador, sem qualquer envio de imagens corporais para servidores externos, cumprindo os princípios de minimização de dados e limitação da finalidade do RGPD (Regulation EU 2016/679, 2016). Esta abordagem distinguiu o FiX-it das soluções comerciais dominantes — MyFitnessPal, Freeletics e Future — que dependem de infraestrutura cloud para processamento de dados biométricos, e confirmou empiricamente a sua viabilidade técnica sem sacrifício da riqueza funcional. A arquitetura REST de 58 endpoints confirmou as conclusões de Bogner et al. (2023, Sec. 4.2) sobre a importância da consistência dos verbos HTTP e da estruturação hierárquica dos recursos para a compreensibilidade das APIs. A decisão de desenvolver o frontend em JavaScript vanilla alinhou-se com a análise de Vepsäläinen et al. (2023, p. 325) sobre o custo-benefício das abordagens sem overhead de runtime em projetos com prazo definido.</w:t>
       </w:r>
     </w:p>
     <w:p>
@@ -4757,7 +4716,6 @@
           <w:sz w:val="24"/>
           <w:lang w:val="pt-PT"/>
         </w:rPr>
-        <w:lastRenderedPageBreak/>
         <w:t xml:space="preserve">As principais contribuições técnicas do projeto são cinco: (i) pipeline de análise corporal client-side que combina MediaPipe Pose com análise de pixéis para cálculo de seis métricas biométricas; (ii) arquitetura REST de 58 endpoints com autenticação JWT de dois tokens e conformidade RGPD por design; (iii) sistema de gamificação com 14 conquistas, 20 níveis e multiplicadores de streak; (iv) coach virtual com quatro personalidades baseado em classificação de intenção por padrões; e </w:t>
       </w:r>
       <w:r>
@@ -4871,7 +4829,6 @@
           <w:sz w:val="28"/>
           <w:lang w:val="pt-PT"/>
         </w:rPr>
-        <w:lastRenderedPageBreak/>
         <w:t>4.11 Considerações Finais</w:t>
       </w:r>
     </w:p>
@@ -4987,18 +4944,7 @@
           <w:szCs w:val="24"/>
           <w:lang w:val="pt-PT"/>
         </w:rPr>
-        <w:t xml:space="preserve">O FiX-it demonstrou que é possível desenvolver uma aplicação web progressiva de análise de composição corporal assistida por inteligência artificial que seja simultaneamente gratuita, privada, multiplataforma e funcionalmente comparável às soluções comerciais existentes. A </w:t>
-      </w:r>
-      <w:r>
-        <w:rPr>
-          <w:rFonts w:ascii="Times New Roman" w:hAnsi="Times New Roman"/>
-          <w:bCs/>
-          <w:sz w:val="24"/>
-          <w:szCs w:val="24"/>
-          <w:lang w:val="pt-PT"/>
-        </w:rPr>
-        <w:lastRenderedPageBreak/>
-        <w:t xml:space="preserve">execução client-side dos modelos de machine learning — MediaPipe Pose, BodyPix e MobileNet via TensorFlow.js — eliminou a necessidade de envio de dados biométricos para servidores externos, materializando o princípio de privacy by design preconizado por Ayala-Rivera et al. </w:t>
+        <w:t xml:space="preserve">O FiX-it demonstrou que é possível desenvolver uma aplicação web progressiva de análise de composição corporal assistida por inteligência artificial que seja simultaneamente gratuita, privada, multiplataforma e funcionalmente comparável às soluções comerciais existentes. A execução client-side dos modelos de machine learning — MediaPipe Pose, BodyPix e MobileNet via TensorFlow.js — eliminou a necessidade de envio de dados biométricos para servidores externos, materializando o princípio de privacy by design preconizado por Ayala-Rivera et al. </w:t>
       </w:r>
       <w:r>
         <w:rPr>
@@ -5125,7 +5071,6 @@
           <w:szCs w:val="24"/>
           <w:lang w:val="pt-PT"/>
         </w:rPr>
-        <w:lastRenderedPageBreak/>
         <w:t xml:space="preserve">A principal limitação da análise 2D baseada em marcos esqueléticos — a incapacidade de estimar massa corporal com a precisão dos métodos clínicos de referência (DEXA, bioimpedância) — é inerente à abordagem e não superável sem a adição de sensores de profundidade ou modelos de reconstrução 3D, como o demonstrado por Qiao et al. </w:t>
       </w:r>
       <w:r>
@@ -5258,7 +5203,6 @@
           <w:rFonts w:ascii="Times New Roman" w:hAnsi="Times New Roman"/>
           <w:lang w:val="pt-PT"/>
         </w:rPr>
-        <w:lastRenderedPageBreak/>
         <w:t xml:space="preserve">Ayala-Rivera, V., Portillo-Dominguez, A. O., &amp; Pasquale, L. (2024). </w:t>
       </w:r>
       <w:r>

</xml_diff>